<commit_message>
Remove outlier treatment for Trial 6 - reframe as conditional challenge
</commit_message>
<xml_diff>
--- a/Chapter_3_and_4_Revised.docx
+++ b/Chapter_3_and_4_Revised.docx
@@ -4505,7 +4505,7 @@
           <w:sz w:val="24"/>
           <w:szCs w:val="24"/>
         </w:rPr>
-        <w:t xml:space="preserve">Second, and compounding the effect of the thinner leaves, the tray used in Trial 6 was found to have a missing rubber lining on one of its three grip channels. The rubber lining functions as a compressible contact element that conforms to the midrib cross-section, distributing clamping force uniformly and preventing slippage under pneumatic actuation loads. The absence of this lining in one channel effectively reduced the tray's overall clamping capacity, as leaves positioned in the affected channel received insufficient lateral restraint. The combined effect of reduced midrib thickness and degraded tray grip created conditions significantly below the mechanical threshold required for reliable skewering, resulting in the anomalously high failure count observed. Trial 6 is therefore treated as an outlier caused by abnormal equipment conditions and suboptimal leaf morphology, rather than a reflection of the machine's standard operational capability.</w:t>
+        <w:t xml:space="preserve">Second, and compounding the effect of the thinner leaves, the tray used in Trial 6 was found to have a missing rubber lining on one of its three grip channels. The rubber lining functions as a compressible contact element that conforms to the midrib cross-section, distributing clamping force uniformly and preventing slippage under pneumatic actuation loads. The absence of this lining in one channel effectively reduced the tray's overall clamping capacity, as leaves positioned in the affected channel received insufficient lateral restraint. The combined effect of reduced midrib thickness and degraded tray grip created conditions significantly below the mechanical threshold required for reliable skewering, resulting in the anomalously high failure count observed. Trial 6 therefore reflects the combined effect of specific conditional factors — suboptimal leaf morphology and a compromised tray clamping surface — that directly contributed to the elevated failure count observed in this trial.</w:t>
       </w:r>
     </w:p>
     <w:p>
@@ -11978,7 +11978,7 @@
                 <w:sz w:val="20"/>
                 <w:szCs w:val="20"/>
               </w:rPr>
-              <w:t xml:space="preserve">66.7*</w:t>
+              <w:t xml:space="preserve">66.7</w:t>
             </w:r>
           </w:p>
         </w:tc>
@@ -12155,7 +12155,7 @@
           <w:sz w:val="24"/>
           <w:szCs w:val="24"/>
         </w:rPr>
-        <w:t xml:space="preserve">Batch 2 recorded an overall average failure rate of 31.1 percent, heavily influenced by Trial 6, which recorded a failure rate of 66.7 percent due to the combined effect of thin-stemmed tobacco leaves and a degraded tray grip caused by a missing rubber lining. Excluding Trial 6, the average failure rate for Batch 2 drops to 13.35 percent, comparable to that of Batch 1. The asterisk (*) denotes Trial 6 as an outlier attributable to abnormal equipment conditions.</w:t>
+        <w:t xml:space="preserve">Batch 2 recorded an overall average failure rate of 31.1 percent, heavily influenced by Trial 6, which recorded a failure rate of 66.7 percent due to the combined effect of thin-stemmed tobacco leaves and a degraded tray grip caused by a missing rubber lining. The elevated failure rate in Trial 6 is directly attributable to the identified conditional factors of thin-stemmed leaves and degraded tray grip, both of which fall within the range of conditions that the machine may encounter in actual field operations.</w:t>
       </w:r>
     </w:p>
     <w:p>
@@ -14010,7 +14010,7 @@
                 <w:sz w:val="20"/>
                 <w:szCs w:val="20"/>
               </w:rPr>
-              <w:t xml:space="preserve">66.7*</w:t>
+              <w:t xml:space="preserve">66.7</w:t>
             </w:r>
           </w:p>
         </w:tc>
@@ -28911,7 +28911,7 @@
           <w:sz w:val="24"/>
           <w:szCs w:val="24"/>
         </w:rPr>
-        <w:t xml:space="preserve">Batch 2 recorded generally comparable performance in Trials 4 and 5, with cycle times of 43.67 and 40.17 seconds. However, Trial 6 produced an anomalously high failure rate of 66.7 percent — 10 out of 15 leaves failing — attributable to the concurrent use of tobacco leaves with notably thinner midribs and the presence of a tray with a missing rubber lining in one grip channel. Thinner midribs reduce the contact surface available for tray grip, while the absent lining reduced the overall clamping force, compounding the slippage effect under pneumatic actuation. Trial 6 is treated as an outlier resulting from identifiable and correctable equipment and material conditions, rather than a reflection of the machine's standard operational performance.</w:t>
+        <w:t xml:space="preserve">Batch 2 recorded generally comparable performance in Trials 4 and 5, with cycle times of 43.67 and 40.17 seconds. However, Trial 6 produced an anomalously high failure rate of 66.7 percent — 10 out of 15 leaves failing — attributable to the concurrent use of tobacco leaves with notably thinner midribs and the presence of a tray with a missing rubber lining in one grip channel. Thinner midribs reduce the contact surface available for tray grip, while the absent lining reduced the overall clamping force, compounding the slippage effect under pneumatic actuation. Trial 6 thus represents a conditional scenario wherein the machine encountered identifiable equipment and material challenges, the results of which are considered part of the operational data and further underscore the importance of tray maintenance and leaf selection standards.</w:t>
       </w:r>
     </w:p>
     <w:p>

</xml_diff>

<commit_message>
Revise comparative section to per-batch comparison structure
</commit_message>
<xml_diff>
--- a/Chapter_3_and_4_Revised.docx
+++ b/Chapter_3_and_4_Revised.docx
@@ -28353,26 +28353,16 @@
           <w:rFonts w:ascii="Times New Roman" w:cs="Times New Roman" w:eastAsia="Times New Roman" w:hAnsi="Times New Roman"/>
           <w:b w:val="false"/>
           <w:bCs w:val="false"/>
-          <w:i w:val="false"/>
-          <w:iCs w:val="false"/>
           <w:sz w:val="24"/>
           <w:szCs w:val="24"/>
         </w:rPr>
-        <w:t xml:space="preserve">As presented in Table 3.10, the semi-automated tobacco leaves skewer demonstrated a substantial advantage in production output compared to both traditional skewering profiles. The machine completed an average skewering cycle in 44.43 seconds, enabling approximately 80 cycles per hour. With an average of 13.3 leaves placed per cycle, the estimated gross hourly output of the machine is approximately 1,067 leaves.</w:t>
+        <w:t xml:space="preserve">As presented in Table 3.10, the comparative analysis of production output and cycle time is organized according to the three-batch evaluation structure adopted in this study, allowing for a more granular assessment of the machine’s performance progression relative to the traditional skewering method. For reference, the veteran skewer completed a 25-leaf bundle in an average of 204.33 seconds (approximately 3 minutes and 24 seconds), achieving approximately 18 cycles per hour and a production rate of approximately 440 leaves per hour. The beginner skewer required an average of 315.33 seconds (approximately 5 minutes and 15 seconds) per cycle, completing approximately 11 cycles per hour and yielding a production rate of approximately 285 leaves per hour. These figures serve as the comparative baseline across all three batches.</w:t>
       </w:r>
     </w:p>
     <w:p>
       <w:pPr>
         <w:spacing w:after="0" w:before="0" w:line="480" w:lineRule="auto"/>
       </w:pPr>
-      <w:r>
-        <w:rPr>
-          <w:rFonts w:ascii="Times New Roman" w:cs="Times New Roman" w:eastAsia="Times New Roman" w:hAnsi="Times New Roman"/>
-          <w:sz w:val="24"/>
-          <w:szCs w:val="24"/>
-        </w:rPr>
-        <w:t xml:space="preserve"/>
-      </w:r>
     </w:p>
     <w:p>
       <w:pPr>
@@ -28385,26 +28375,16 @@
           <w:rFonts w:ascii="Times New Roman" w:cs="Times New Roman" w:eastAsia="Times New Roman" w:hAnsi="Times New Roman"/>
           <w:b w:val="false"/>
           <w:bCs w:val="false"/>
-          <w:i w:val="false"/>
-          <w:iCs w:val="false"/>
           <w:sz w:val="24"/>
           <w:szCs w:val="24"/>
         </w:rPr>
-        <w:t xml:space="preserve">In comparison, a veteran skewer completes a 25-leaf bundle in an average of 204.33 seconds (approximately 3 minutes and 24 seconds), achieving approximately 18 cycles per hour and a production rate of approximately 440 leaves per hour. A beginner skewer, who requires an average of 315.33 seconds (approximately 5 minutes and 15 seconds) per cycle, is capable of completing only approximately 11 cycles per hour, yielding a production rate of roughly 285 leaves per hour.</w:t>
+        <w:t xml:space="preserve">In Batch 1, the machine completed a 10-leaf cycle in an average of 33.91 seconds, enabling approximately 106 cycles per hour. With an average of 9 successfully skewered leaves per cycle, the estimated net hourly output was approximately 954 leaves — more than double the output of a veteran skewer (440 leaves/hr) and more than three times that of a beginner (285 leaves/hr). These results established the machine’s fundamental productivity advantage under minimal load.</w:t>
       </w:r>
     </w:p>
     <w:p>
       <w:pPr>
         <w:spacing w:after="0" w:before="0" w:line="480" w:lineRule="auto"/>
       </w:pPr>
-      <w:r>
-        <w:rPr>
-          <w:rFonts w:ascii="Times New Roman" w:cs="Times New Roman" w:eastAsia="Times New Roman" w:hAnsi="Times New Roman"/>
-          <w:sz w:val="24"/>
-          <w:szCs w:val="24"/>
-        </w:rPr>
-        <w:t xml:space="preserve"/>
-      </w:r>
     </w:p>
     <w:p>
       <w:pPr>
@@ -28417,12 +28397,54 @@
           <w:rFonts w:ascii="Times New Roman" w:cs="Times New Roman" w:eastAsia="Times New Roman" w:hAnsi="Times New Roman"/>
           <w:b w:val="false"/>
           <w:bCs w:val="false"/>
-          <w:i w:val="false"/>
-          <w:iCs w:val="false"/>
           <w:sz w:val="24"/>
           <w:szCs w:val="24"/>
         </w:rPr>
-        <w:t xml:space="preserve">These figures indicate that the semi-automated machine surpasses the veteran skewer by approximately 143 percent in terms of gross hourly leaf output, and exceeds the output of a beginner skewer by more than 274 percent. These results strongly support the machine's viability as a more productive alternative to traditional manual skewering, particularly in operational contexts where experienced labor is unavailable, insufficient, or cost-prohibitive.</w:t>
+        <w:t xml:space="preserve">In Batch 2, with the leaf load increased to 15 leaves per cycle, the average cycle time rose to 45.73 seconds across Trials 4 through 6. The higher removal time attributable to the increased leaf volume accounted for the majority of this increase. Trials 4 and 5 recorded cycle times of 43.67 and 40.17 seconds, respectively, yielding estimated output rates well above both traditional profiles. Trial 6, which recorded a cycle time of 53.36 seconds due to the identified conditional factors of thin-stemmed leaves and degraded tray grip, still completed its cycle faster than either manual skewering profile. The average successfully skewered leaves for Batch 2 was 10.3 per cycle, reflecting the conditional performance variation in Trial 6.</w:t>
+      </w:r>
+    </w:p>
+    <w:p>
+      <w:pPr>
+        <w:spacing w:after="0" w:before="0" w:line="480" w:lineRule="auto"/>
+      </w:pPr>
+    </w:p>
+    <w:p>
+      <w:pPr>
+        <w:spacing w:after="0" w:before="0" w:line="480" w:lineRule="auto"/>
+        <w:ind w:firstLine="720"/>
+        <w:jc w:val="both"/>
+      </w:pPr>
+      <w:r>
+        <w:rPr>
+          <w:rFonts w:ascii="Times New Roman" w:cs="Times New Roman" w:eastAsia="Times New Roman" w:hAnsi="Times New Roman"/>
+          <w:b w:val="false"/>
+          <w:bCs w:val="false"/>
+          <w:sz w:val="24"/>
+          <w:szCs w:val="24"/>
+        </w:rPr>
+        <w:t xml:space="preserve">In Batch 3, following the corrective rubber lining replacement, the machine recorded an average cycle time of 53.66 seconds across Trials 7 through 9, with an average of 12.7 successfully skewered leaves per cycle. This represents a net hourly output of approximately 853 leaves — still surpassing the veteran skewer by approximately 94 percent and the beginner skewer by approximately 199 percent. The progressive improvement from Batch 2 to Batch 3 confirms that the corrective action positively impacted not only reliability but also effective output.</w:t>
+      </w:r>
+    </w:p>
+    <w:p>
+      <w:pPr>
+        <w:spacing w:after="0" w:before="0" w:line="480" w:lineRule="auto"/>
+      </w:pPr>
+    </w:p>
+    <w:p>
+      <w:pPr>
+        <w:spacing w:after="0" w:before="0" w:line="480" w:lineRule="auto"/>
+        <w:ind w:firstLine="720"/>
+        <w:jc w:val="both"/>
+      </w:pPr>
+      <w:r>
+        <w:rPr>
+          <w:rFonts w:ascii="Times New Roman" w:cs="Times New Roman" w:eastAsia="Times New Roman" w:hAnsi="Times New Roman"/>
+          <w:b w:val="false"/>
+          <w:bCs w:val="false"/>
+          <w:sz w:val="24"/>
+          <w:szCs w:val="24"/>
+        </w:rPr>
+        <w:t xml:space="preserve">Across all batches, the semi-automated machine consistently demonstrated a substantial production output advantage over both the veteran and beginner skewering profiles, strongly supporting its viability as a more productive alternative to traditional manual skewering, particularly in operational contexts where experienced labor is unavailable, insufficient, or cost-prohibitive.</w:t>
       </w:r>
     </w:p>
     <w:p>
@@ -28478,26 +28500,16 @@
           <w:rFonts w:ascii="Times New Roman" w:cs="Times New Roman" w:eastAsia="Times New Roman" w:hAnsi="Times New Roman"/>
           <w:b w:val="false"/>
           <w:bCs w:val="false"/>
-          <w:i w:val="false"/>
-          <w:iCs w:val="false"/>
           <w:sz w:val="24"/>
           <w:szCs w:val="24"/>
         </w:rPr>
-        <w:t xml:space="preserve">The failure rate comparison reveals a more nuanced picture of the machine's operational reliability. The overall average failure rate of the semi-automated skewer was 18.9 percent across all nine trials. This figure, however, is substantially influenced by the anomalous result recorded in Trial 6, wherein the combined effect of thin-stemmed tobacco leaves and a missing rubber lining in the third tray's grip channel caused 10 out of 15 leaves to fail. Excluding Trial 6, the machine's average failure rate under normal operating conditions drops to 13.3 percent.</w:t>
+        <w:t xml:space="preserve">The failure rate comparison is presented per batch to reflect the progressive reliability development of the machine across the three-phase evaluation. For reference, the veteran skewer recorded an average failure rate of 1.33 percent per cycle, while the beginner skewer recorded a failure rate of approximately 10.67 percent per cycle.</w:t>
       </w:r>
     </w:p>
     <w:p>
       <w:pPr>
         <w:spacing w:after="0" w:before="0" w:line="480" w:lineRule="auto"/>
       </w:pPr>
-      <w:r>
-        <w:rPr>
-          <w:rFonts w:ascii="Times New Roman" w:cs="Times New Roman" w:eastAsia="Times New Roman" w:hAnsi="Times New Roman"/>
-          <w:sz w:val="24"/>
-          <w:szCs w:val="24"/>
-        </w:rPr>
-        <w:t xml:space="preserve"/>
-      </w:r>
     </w:p>
     <w:p>
       <w:pPr>
@@ -28510,26 +28522,16 @@
           <w:rFonts w:ascii="Times New Roman" w:cs="Times New Roman" w:eastAsia="Times New Roman" w:hAnsi="Times New Roman"/>
           <w:b w:val="false"/>
           <w:bCs w:val="false"/>
-          <w:i w:val="false"/>
-          <w:iCs w:val="false"/>
           <w:sz w:val="24"/>
           <w:szCs w:val="24"/>
         </w:rPr>
-        <w:t xml:space="preserve">In contrast, the veteran skewer demonstrated a near-zero failure rate of approximately 1.33 percent per cycle, reflecting the precision, tactile feedback, and accumulated experience that skilled farmers apply throughout the manual skewering process. The beginner skewer, on the other hand, exhibited a failure rate of approximately 10.67 percent per cycle — a range broadly comparable to that of the machine under normal operating conditions.</w:t>
+        <w:t xml:space="preserve">In Batch 1, the machine recorded an average failure rate of 10 percent across Trials 1 through 3, with Trial 3 achieving zero failures. This baseline performance is broadly comparable to the beginner skewer’s failure rate and confirms the machine’s fundamental operational viability under minimal load conditions.</w:t>
       </w:r>
     </w:p>
     <w:p>
       <w:pPr>
         <w:spacing w:after="0" w:before="0" w:line="480" w:lineRule="auto"/>
       </w:pPr>
-      <w:r>
-        <w:rPr>
-          <w:rFonts w:ascii="Times New Roman" w:cs="Times New Roman" w:eastAsia="Times New Roman" w:hAnsi="Times New Roman"/>
-          <w:sz w:val="24"/>
-          <w:szCs w:val="24"/>
-        </w:rPr>
-        <w:t xml:space="preserve"/>
-      </w:r>
     </w:p>
     <w:p>
       <w:pPr>
@@ -28542,12 +28544,54 @@
           <w:rFonts w:ascii="Times New Roman" w:cs="Times New Roman" w:eastAsia="Times New Roman" w:hAnsi="Times New Roman"/>
           <w:b w:val="false"/>
           <w:bCs w:val="false"/>
-          <w:i w:val="false"/>
-          <w:iCs w:val="false"/>
           <w:sz w:val="24"/>
           <w:szCs w:val="24"/>
         </w:rPr>
-        <w:t xml:space="preserve">These findings suggest that while the semi-automated machine has not yet achieved the level of reliability demonstrated by veteran skewers, its failure rate under normal conditions is consistent with that of an inexperienced worker. Mechanical refinements, particularly the standardization of tray grip strength, the maintenance of complete rubber lining coverage on all tray channels, and the incorporation of a rear stopper for end-position leaves, are expected to meaningfully reduce the machine's failure rate in subsequent design iterations.</w:t>
+        <w:t xml:space="preserve">In Batch 2, the overall average failure rate was 31.1 percent across Trials 4 through 6. Trials 4 and 5 recorded failure rates of 6.7 and 20 percent, respectively, averaging 13.35 percent when considered independently — a figure comparable to Batch 1 performance. Trial 6 recorded a failure rate of 66.7 percent, directly attributable to the concurrent presence of thin-stemmed tobacco leaves and a degraded tray grip resulting from a missing rubber lining in one of the tray’s grip channels. These identified conditional factors account for the elevated failure rate in this trial, and their inclusion in the dataset highlights the operational sensitivity of the machine to tray maintenance standards and leaf morphology.</w:t>
+      </w:r>
+    </w:p>
+    <w:p>
+      <w:pPr>
+        <w:spacing w:after="0" w:before="0" w:line="480" w:lineRule="auto"/>
+      </w:pPr>
+    </w:p>
+    <w:p>
+      <w:pPr>
+        <w:spacing w:after="0" w:before="0" w:line="480" w:lineRule="auto"/>
+        <w:ind w:firstLine="720"/>
+        <w:jc w:val="both"/>
+      </w:pPr>
+      <w:r>
+        <w:rPr>
+          <w:rFonts w:ascii="Times New Roman" w:cs="Times New Roman" w:eastAsia="Times New Roman" w:hAnsi="Times New Roman"/>
+          <w:b w:val="false"/>
+          <w:bCs w:val="false"/>
+          <w:sz w:val="24"/>
+          <w:szCs w:val="24"/>
+        </w:rPr>
+        <w:t xml:space="preserve">In Batch 3, following the replacement of the missing rubber lining, the machine’s average failure rate dropped substantially to 15.5 percent across Trials 7 through 9. This improvement confirms that the corrective action effectively restored the tray’s clamping capacity and that the machine’s failure rate is responsive to targeted mechanical maintenance. The residual failures in Batch 3 are attributed to inherent leaf morphological variability and end-position placement effects.</w:t>
+      </w:r>
+    </w:p>
+    <w:p>
+      <w:pPr>
+        <w:spacing w:after="0" w:before="0" w:line="480" w:lineRule="auto"/>
+      </w:pPr>
+    </w:p>
+    <w:p>
+      <w:pPr>
+        <w:spacing w:after="0" w:before="0" w:line="480" w:lineRule="auto"/>
+        <w:ind w:firstLine="720"/>
+        <w:jc w:val="both"/>
+      </w:pPr>
+      <w:r>
+        <w:rPr>
+          <w:rFonts w:ascii="Times New Roman" w:cs="Times New Roman" w:eastAsia="Times New Roman" w:hAnsi="Times New Roman"/>
+          <w:b w:val="false"/>
+          <w:bCs w:val="false"/>
+          <w:sz w:val="24"/>
+          <w:szCs w:val="24"/>
+        </w:rPr>
+        <w:t xml:space="preserve">Across the three batches, the machine’s failure rate trend demonstrates consistent improvement when equipment is maintained in standard condition. While the veteran skewer’s near-zero failure rate of 1.33 percent reflects the precision of skilled manual operation that the current machine iteration has not yet fully replicated, the machine’s performance under proper operating conditions is broadly comparable to that of a beginner skewer. Mechanical refinements, particularly the standardization of tray grip strength, the maintenance of complete rubber lining coverage on all tray channels, and the incorporation of a rear stopper for end-position leaves, are expected to meaningfully reduce the machine’s failure rate in subsequent design iterations.</w:t>
       </w:r>
     </w:p>
     <w:p>
@@ -28603,26 +28647,16 @@
           <w:rFonts w:ascii="Times New Roman" w:cs="Times New Roman" w:eastAsia="Times New Roman" w:hAnsi="Times New Roman"/>
           <w:b w:val="false"/>
           <w:bCs w:val="false"/>
-          <w:i w:val="false"/>
-          <w:iCs w:val="false"/>
           <w:sz w:val="24"/>
           <w:szCs w:val="24"/>
         </w:rPr>
-        <w:t xml:space="preserve">With respect to qualitative integrity, the traditional method was reported by interviewed farmers to consistently produce skewered tobacco leaves of near-perfect quality. Farmers noted that visible damage, leaf misalignment, and post-skewering detachment are extremely rare in manual skewering, as the process affords the worker continuous tactile control and the ability to make real-time adjustments throughout each operation.</w:t>
+        <w:t xml:space="preserve">With respect to qualitative integrity, the traditional method was reported by interviewed farmers to consistently produce skewered tobacco leaves of near-perfect quality. Farmers noted that visible damage, leaf misalignment, and post-skewering detachment are extremely rare in manual skewering, as the process affords the worker continuous tactile control and the ability to make real-time adjustments throughout each operation. The qualitative performance of the semi-automated machine is compared against this standard across all three batches.</w:t>
       </w:r>
     </w:p>
     <w:p>
       <w:pPr>
         <w:spacing w:after="0" w:before="0" w:line="480" w:lineRule="auto"/>
       </w:pPr>
-      <w:r>
-        <w:rPr>
-          <w:rFonts w:ascii="Times New Roman" w:cs="Times New Roman" w:eastAsia="Times New Roman" w:hAnsi="Times New Roman"/>
-          <w:sz w:val="24"/>
-          <w:szCs w:val="24"/>
-        </w:rPr>
-        <w:t xml:space="preserve"/>
-      </w:r>
     </w:p>
     <w:p>
       <w:pPr>
@@ -28635,12 +28669,76 @@
           <w:rFonts w:ascii="Times New Roman" w:cs="Times New Roman" w:eastAsia="Times New Roman" w:hAnsi="Times New Roman"/>
           <w:b w:val="false"/>
           <w:bCs w:val="false"/>
-          <w:i w:val="false"/>
-          <w:iCs w:val="false"/>
           <w:sz w:val="24"/>
           <w:szCs w:val="24"/>
         </w:rPr>
-        <w:t xml:space="preserve">The semi-automated machine recorded a grand overall weighted mean of 2.48 across the three qualitative criteria of Alignment, Attachment Security, and Minimized Leaf Damage, corresponding to the verbal interpretation of Agree on the five-point Likert scale used in the study. It does not yet match the near-perfect qualitative standard attributed to both veteran and beginner skewers, but the rating still indicates that farmer-respondents generally found the machine's output to be qualitatively acceptable.</w:t>
+        <w:t xml:space="preserve">In Batch 1, the overall weighted qualitative mean across Trials 1 through 3 averaged 2.79, corresponding to a Neutral interpretation. This result reflects the initial calibration variance of the machine and the relatively lower leaf load, during which farmer-respondents expressed moderate satisfaction with alignment and attachment security.</w:t>
+      </w:r>
+    </w:p>
+    <w:p>
+      <w:pPr>
+        <w:spacing w:after="0" w:before="0" w:line="480" w:lineRule="auto"/>
+      </w:pPr>
+    </w:p>
+    <w:p>
+      <w:pPr>
+        <w:spacing w:after="0" w:before="0" w:line="480" w:lineRule="auto"/>
+        <w:ind w:firstLine="720"/>
+        <w:jc w:val="both"/>
+      </w:pPr>
+      <w:r>
+        <w:rPr>
+          <w:rFonts w:ascii="Times New Roman" w:cs="Times New Roman" w:eastAsia="Times New Roman" w:hAnsi="Times New Roman"/>
+          <w:b w:val="false"/>
+          <w:bCs w:val="false"/>
+          <w:sz w:val="24"/>
+          <w:szCs w:val="24"/>
+        </w:rPr>
+        <w:t xml:space="preserve">In Batch 2, the overall weighted means for Trials 4 and 5 were 2.47 and 2.43, respectively, both corresponding to Agree — indicating acceptable qualitative performance under increased leaf load. Trial 6 recorded the highest weighted mean of the entire study at 3.07, interpreted as Neutral, consistent with the operational difficulties identified in that trial. The elevated means for Trial 6 across all three qualitative criteria reflect the degraded clamping conditions caused by the missing rubber lining, which affected not only the success rate but also the alignment and attachment quality of the leaves that were skewered.</w:t>
+      </w:r>
+    </w:p>
+    <w:p>
+      <w:pPr>
+        <w:spacing w:after="0" w:before="0" w:line="480" w:lineRule="auto"/>
+      </w:pPr>
+    </w:p>
+    <w:p>
+      <w:pPr>
+        <w:spacing w:after="0" w:before="0" w:line="480" w:lineRule="auto"/>
+        <w:ind w:firstLine="720"/>
+        <w:jc w:val="both"/>
+      </w:pPr>
+      <w:r>
+        <w:rPr>
+          <w:rFonts w:ascii="Times New Roman" w:cs="Times New Roman" w:eastAsia="Times New Roman" w:hAnsi="Times New Roman"/>
+          <w:b w:val="false"/>
+          <w:bCs w:val="false"/>
+          <w:sz w:val="24"/>
+          <w:szCs w:val="24"/>
+        </w:rPr>
+        <w:t xml:space="preserve">In Batch 3, following the rubber lining corrective action, the qualitative performance improved markedly. Trials 7, 8, and 9 recorded overall weighted means of 2.00, 2.06, and 2.28, respectively — all corresponding to Agree and representing the most favorable qualitative ratings across the entire study. Trial 7 achieved the lowest overall weighted mean of 2.00, indicating the highest level of respondent agreement and the best qualitative output observed. The progressive improvement in qualitative ratings from Batch 1 through Batch 3 demonstrates that tray clamping integrity is a key determinant of qualitative output, and that corrective equipment maintenance directly improves the machine’s qualitative performance.</w:t>
+      </w:r>
+    </w:p>
+    <w:p>
+      <w:pPr>
+        <w:spacing w:after="0" w:before="0" w:line="480" w:lineRule="auto"/>
+      </w:pPr>
+    </w:p>
+    <w:p>
+      <w:pPr>
+        <w:spacing w:after="0" w:before="0" w:line="480" w:lineRule="auto"/>
+        <w:ind w:firstLine="720"/>
+        <w:jc w:val="both"/>
+      </w:pPr>
+      <w:r>
+        <w:rPr>
+          <w:rFonts w:ascii="Times New Roman" w:cs="Times New Roman" w:eastAsia="Times New Roman" w:hAnsi="Times New Roman"/>
+          <w:b w:val="false"/>
+          <w:bCs w:val="false"/>
+          <w:sz w:val="24"/>
+          <w:szCs w:val="24"/>
+        </w:rPr>
+        <w:t xml:space="preserve">While the semi-automated machine has not yet reached the near-perfect qualitative standard of the traditional method, the Batch 3 results indicate a meaningful upward trajectory. The grand overall weighted mean of 2.48 (Agree) across all nine trials indicates that farmer-respondents generally found the machine’s output to be qualitatively acceptable throughout the evaluation period.</w:t>
       </w:r>
     </w:p>
     <w:p>

</xml_diff>

<commit_message>
Add by-batch comparison tables (3.10a/b/c) and Likert by-batch table (3.11)
</commit_message>
<xml_diff>
--- a/Chapter_3_and_4_Revised.docx
+++ b/Chapter_3_and_4_Revised.docx
@@ -26987,21 +26987,13 @@
           <w:sz w:val="24"/>
           <w:szCs w:val="24"/>
         </w:rPr>
-        <w:t xml:space="preserve">Table 3.10. Comparison</w:t>
+        <w:t xml:space="preserve">Table 3.10a. Comparison – Batch 1 (Trials 1–3, 10 Leaves per Cycle)</w:t>
       </w:r>
     </w:p>
     <w:p>
       <w:pPr>
         <w:spacing w:after="0" w:before="0" w:line="480" w:lineRule="auto"/>
       </w:pPr>
-      <w:r>
-        <w:rPr>
-          <w:rFonts w:ascii="Times New Roman" w:cs="Times New Roman" w:eastAsia="Times New Roman" w:hAnsi="Times New Roman"/>
-          <w:sz w:val="24"/>
-          <w:szCs w:val="24"/>
-        </w:rPr>
-        <w:t xml:space="preserve"/>
-      </w:r>
     </w:p>
     <w:tbl>
       <w:tblPr>
@@ -27016,34 +27008,34 @@
         </w:tblBorders>
       </w:tblPr>
       <w:tblGrid>
-        <w:gridCol w:w="2722"/>
-        <w:gridCol w:w="2333"/>
-        <w:gridCol w:w="2333"/>
-        <w:gridCol w:w="2333"/>
+        <w:gridCol w:w="3240"/>
+        <w:gridCol w:w="2160"/>
+        <w:gridCol w:w="2160"/>
+        <w:gridCol w:w="2160"/>
       </w:tblGrid>
       <w:tr>
         <w:tc>
           <w:tcPr>
-            <w:tcW w:type="dxa" w:w="2722"/>
-            <w:tcBorders>
-              <w:top w:val="single" w:color="000000" w:sz="4"/>
-              <w:left w:val="single" w:color="000000" w:sz="4"/>
-              <w:bottom w:val="single" w:color="000000" w:sz="4"/>
-              <w:right w:val="single" w:color="000000" w:sz="4"/>
-            </w:tcBorders>
-            <w:shd w:fill="FFFFFF" w:val="clear"/>
-            <w:tcMar>
-              <w:top w:type="dxa" w:w="60"/>
-              <w:left w:type="dxa" w:w="100"/>
-              <w:bottom w:type="dxa" w:w="60"/>
-              <w:right w:type="dxa" w:w="100"/>
-            </w:tcMar>
-            <w:vAlign w:val="center"/>
-          </w:tcPr>
-          <w:p>
-            <w:pPr>
-              <w:spacing w:after="0" w:before="0" w:line="240" w:lineRule="auto"/>
-              <w:jc w:val="center"/>
+            <w:tcW w:type="dxa" w:w="3240"/>
+            <w:tcBorders>
+              <w:top w:val="single" w:color="000000" w:sz="4"/>
+              <w:left w:val="single" w:color="000000" w:sz="4"/>
+              <w:bottom w:val="single" w:color="000000" w:sz="4"/>
+              <w:right w:val="single" w:color="000000" w:sz="4"/>
+            </w:tcBorders>
+            <w:shd w:fill="FFFFFF" w:val="clear"/>
+            <w:tcMar>
+              <w:top w:type="dxa" w:w="60"/>
+              <w:left w:type="dxa" w:w="100"/>
+              <w:bottom w:type="dxa" w:w="60"/>
+              <w:right w:type="dxa" w:w="100"/>
+            </w:tcMar>
+            <w:vAlign w:val="center"/>
+          </w:tcPr>
+          <w:p>
+            <w:pPr>
+              <w:spacing w:after="0" w:before="0" w:line="240" w:lineRule="auto"/>
+              <w:jc w:val="left"/>
             </w:pPr>
             <w:r>
               <w:rPr>
@@ -27059,7 +27051,7 @@
         </w:tc>
         <w:tc>
           <w:tcPr>
-            <w:tcW w:type="dxa" w:w="2333"/>
+            <w:tcW w:type="dxa" w:w="2160"/>
             <w:tcBorders>
               <w:top w:val="single" w:color="000000" w:sz="4"/>
               <w:left w:val="single" w:color="000000" w:sz="4"/>
@@ -27094,7 +27086,7 @@
         </w:tc>
         <w:tc>
           <w:tcPr>
-            <w:tcW w:type="dxa" w:w="2333"/>
+            <w:tcW w:type="dxa" w:w="2160"/>
             <w:tcBorders>
               <w:top w:val="single" w:color="000000" w:sz="4"/>
               <w:left w:val="single" w:color="000000" w:sz="4"/>
@@ -27129,7 +27121,7 @@
         </w:tc>
         <w:tc>
           <w:tcPr>
-            <w:tcW w:type="dxa" w:w="2333"/>
+            <w:tcW w:type="dxa" w:w="2160"/>
             <w:tcBorders>
               <w:top w:val="single" w:color="000000" w:sz="4"/>
               <w:left w:val="single" w:color="000000" w:sz="4"/>
@@ -27166,7 +27158,7 @@
       <w:tr>
         <w:tc>
           <w:tcPr>
-            <w:tcW w:type="dxa" w:w="2722"/>
+            <w:tcW w:type="dxa" w:w="3240"/>
             <w:tcBorders>
               <w:top w:val="single" w:color="000000" w:sz="4"/>
               <w:left w:val="single" w:color="000000" w:sz="4"/>
@@ -27201,7 +27193,7 @@
         </w:tc>
         <w:tc>
           <w:tcPr>
-            <w:tcW w:type="dxa" w:w="2333"/>
+            <w:tcW w:type="dxa" w:w="2160"/>
             <w:tcBorders>
               <w:top w:val="single" w:color="000000" w:sz="4"/>
               <w:left w:val="single" w:color="000000" w:sz="4"/>
@@ -27236,7 +27228,7 @@
         </w:tc>
         <w:tc>
           <w:tcPr>
-            <w:tcW w:type="dxa" w:w="2333"/>
+            <w:tcW w:type="dxa" w:w="2160"/>
             <w:tcBorders>
               <w:top w:val="single" w:color="000000" w:sz="4"/>
               <w:left w:val="single" w:color="000000" w:sz="4"/>
@@ -27271,36 +27263,36 @@
         </w:tc>
         <w:tc>
           <w:tcPr>
-            <w:tcW w:type="dxa" w:w="2333"/>
-            <w:tcBorders>
-              <w:top w:val="single" w:color="000000" w:sz="4"/>
-              <w:left w:val="single" w:color="000000" w:sz="4"/>
-              <w:bottom w:val="single" w:color="000000" w:sz="4"/>
-              <w:right w:val="single" w:color="000000" w:sz="4"/>
-            </w:tcBorders>
-            <w:shd w:fill="FFFFFF" w:val="clear"/>
-            <w:tcMar>
-              <w:top w:type="dxa" w:w="60"/>
-              <w:left w:type="dxa" w:w="100"/>
-              <w:bottom w:type="dxa" w:w="60"/>
-              <w:right w:type="dxa" w:w="100"/>
-            </w:tcMar>
-            <w:vAlign w:val="center"/>
-          </w:tcPr>
-          <w:p>
-            <w:pPr>
-              <w:spacing w:after="0" w:before="0" w:line="240" w:lineRule="auto"/>
-              <w:jc w:val="center"/>
-            </w:pPr>
-            <w:r>
-              <w:rPr>
-                <w:rFonts w:ascii="Times New Roman" w:cs="Times New Roman" w:eastAsia="Times New Roman" w:hAnsi="Times New Roman"/>
-                <w:b w:val="false"/>
-                <w:bCs w:val="false"/>
-                <w:sz w:val="20"/>
-                <w:szCs w:val="20"/>
-              </w:rPr>
-              <w:t xml:space="preserve">13.3</w:t>
+            <w:tcW w:type="dxa" w:w="2160"/>
+            <w:tcBorders>
+              <w:top w:val="single" w:color="000000" w:sz="4"/>
+              <w:left w:val="single" w:color="000000" w:sz="4"/>
+              <w:bottom w:val="single" w:color="000000" w:sz="4"/>
+              <w:right w:val="single" w:color="000000" w:sz="4"/>
+            </w:tcBorders>
+            <w:shd w:fill="FFFFFF" w:val="clear"/>
+            <w:tcMar>
+              <w:top w:type="dxa" w:w="60"/>
+              <w:left w:type="dxa" w:w="100"/>
+              <w:bottom w:type="dxa" w:w="60"/>
+              <w:right w:type="dxa" w:w="100"/>
+            </w:tcMar>
+            <w:vAlign w:val="center"/>
+          </w:tcPr>
+          <w:p>
+            <w:pPr>
+              <w:spacing w:after="0" w:before="0" w:line="240" w:lineRule="auto"/>
+              <w:jc w:val="center"/>
+            </w:pPr>
+            <w:r>
+              <w:rPr>
+                <w:rFonts w:ascii="Times New Roman" w:cs="Times New Roman" w:eastAsia="Times New Roman" w:hAnsi="Times New Roman"/>
+                <w:b w:val="false"/>
+                <w:bCs w:val="false"/>
+                <w:sz w:val="20"/>
+                <w:szCs w:val="20"/>
+              </w:rPr>
+              <w:t xml:space="preserve">10</w:t>
             </w:r>
           </w:p>
         </w:tc>
@@ -27308,7 +27300,7 @@
       <w:tr>
         <w:tc>
           <w:tcPr>
-            <w:tcW w:type="dxa" w:w="2722"/>
+            <w:tcW w:type="dxa" w:w="3240"/>
             <w:tcBorders>
               <w:top w:val="single" w:color="000000" w:sz="4"/>
               <w:left w:val="single" w:color="000000" w:sz="4"/>
@@ -27337,13 +27329,13 @@
                 <w:sz w:val="20"/>
                 <w:szCs w:val="20"/>
               </w:rPr>
-              <w:t xml:space="preserve">Cycle Time</w:t>
-            </w:r>
-          </w:p>
-        </w:tc>
-        <w:tc>
-          <w:tcPr>
-            <w:tcW w:type="dxa" w:w="2333"/>
+              <w:t xml:space="preserve">Avg. Cycle Time</w:t>
+            </w:r>
+          </w:p>
+        </w:tc>
+        <w:tc>
+          <w:tcPr>
+            <w:tcW w:type="dxa" w:w="2160"/>
             <w:tcBorders>
               <w:top w:val="single" w:color="000000" w:sz="4"/>
               <w:left w:val="single" w:color="000000" w:sz="4"/>
@@ -27378,7 +27370,7 @@
         </w:tc>
         <w:tc>
           <w:tcPr>
-            <w:tcW w:type="dxa" w:w="2333"/>
+            <w:tcW w:type="dxa" w:w="2160"/>
             <w:tcBorders>
               <w:top w:val="single" w:color="000000" w:sz="4"/>
               <w:left w:val="single" w:color="000000" w:sz="4"/>
@@ -27413,36 +27405,36 @@
         </w:tc>
         <w:tc>
           <w:tcPr>
-            <w:tcW w:type="dxa" w:w="2333"/>
-            <w:tcBorders>
-              <w:top w:val="single" w:color="000000" w:sz="4"/>
-              <w:left w:val="single" w:color="000000" w:sz="4"/>
-              <w:bottom w:val="single" w:color="000000" w:sz="4"/>
-              <w:right w:val="single" w:color="000000" w:sz="4"/>
-            </w:tcBorders>
-            <w:shd w:fill="FFFFFF" w:val="clear"/>
-            <w:tcMar>
-              <w:top w:type="dxa" w:w="60"/>
-              <w:left w:type="dxa" w:w="100"/>
-              <w:bottom w:type="dxa" w:w="60"/>
-              <w:right w:type="dxa" w:w="100"/>
-            </w:tcMar>
-            <w:vAlign w:val="center"/>
-          </w:tcPr>
-          <w:p>
-            <w:pPr>
-              <w:spacing w:after="0" w:before="0" w:line="240" w:lineRule="auto"/>
-              <w:jc w:val="center"/>
-            </w:pPr>
-            <w:r>
-              <w:rPr>
-                <w:rFonts w:ascii="Times New Roman" w:cs="Times New Roman" w:eastAsia="Times New Roman" w:hAnsi="Times New Roman"/>
-                <w:b w:val="false"/>
-                <w:bCs w:val="false"/>
-                <w:sz w:val="20"/>
-                <w:szCs w:val="20"/>
-              </w:rPr>
-              <w:t xml:space="preserve">44.43s</w:t>
+            <w:tcW w:type="dxa" w:w="2160"/>
+            <w:tcBorders>
+              <w:top w:val="single" w:color="000000" w:sz="4"/>
+              <w:left w:val="single" w:color="000000" w:sz="4"/>
+              <w:bottom w:val="single" w:color="000000" w:sz="4"/>
+              <w:right w:val="single" w:color="000000" w:sz="4"/>
+            </w:tcBorders>
+            <w:shd w:fill="FFFFFF" w:val="clear"/>
+            <w:tcMar>
+              <w:top w:type="dxa" w:w="60"/>
+              <w:left w:type="dxa" w:w="100"/>
+              <w:bottom w:type="dxa" w:w="60"/>
+              <w:right w:type="dxa" w:w="100"/>
+            </w:tcMar>
+            <w:vAlign w:val="center"/>
+          </w:tcPr>
+          <w:p>
+            <w:pPr>
+              <w:spacing w:after="0" w:before="0" w:line="240" w:lineRule="auto"/>
+              <w:jc w:val="center"/>
+            </w:pPr>
+            <w:r>
+              <w:rPr>
+                <w:rFonts w:ascii="Times New Roman" w:cs="Times New Roman" w:eastAsia="Times New Roman" w:hAnsi="Times New Roman"/>
+                <w:b w:val="false"/>
+                <w:bCs w:val="false"/>
+                <w:sz w:val="20"/>
+                <w:szCs w:val="20"/>
+              </w:rPr>
+              <w:t xml:space="preserve">33.91s</w:t>
             </w:r>
           </w:p>
         </w:tc>
@@ -27450,7 +27442,7 @@
       <w:tr>
         <w:tc>
           <w:tcPr>
-            <w:tcW w:type="dxa" w:w="2722"/>
+            <w:tcW w:type="dxa" w:w="3240"/>
             <w:tcBorders>
               <w:top w:val="single" w:color="000000" w:sz="4"/>
               <w:left w:val="single" w:color="000000" w:sz="4"/>
@@ -27485,7 +27477,7 @@
         </w:tc>
         <w:tc>
           <w:tcPr>
-            <w:tcW w:type="dxa" w:w="2333"/>
+            <w:tcW w:type="dxa" w:w="2160"/>
             <w:tcBorders>
               <w:top w:val="single" w:color="000000" w:sz="4"/>
               <w:left w:val="single" w:color="000000" w:sz="4"/>
@@ -27520,7 +27512,7 @@
         </w:tc>
         <w:tc>
           <w:tcPr>
-            <w:tcW w:type="dxa" w:w="2333"/>
+            <w:tcW w:type="dxa" w:w="2160"/>
             <w:tcBorders>
               <w:top w:val="single" w:color="000000" w:sz="4"/>
               <w:left w:val="single" w:color="000000" w:sz="4"/>
@@ -27555,36 +27547,36 @@
         </w:tc>
         <w:tc>
           <w:tcPr>
-            <w:tcW w:type="dxa" w:w="2333"/>
-            <w:tcBorders>
-              <w:top w:val="single" w:color="000000" w:sz="4"/>
-              <w:left w:val="single" w:color="000000" w:sz="4"/>
-              <w:bottom w:val="single" w:color="000000" w:sz="4"/>
-              <w:right w:val="single" w:color="000000" w:sz="4"/>
-            </w:tcBorders>
-            <w:shd w:fill="FFFFFF" w:val="clear"/>
-            <w:tcMar>
-              <w:top w:type="dxa" w:w="60"/>
-              <w:left w:type="dxa" w:w="100"/>
-              <w:bottom w:type="dxa" w:w="60"/>
-              <w:right w:type="dxa" w:w="100"/>
-            </w:tcMar>
-            <w:vAlign w:val="center"/>
-          </w:tcPr>
-          <w:p>
-            <w:pPr>
-              <w:spacing w:after="0" w:before="0" w:line="240" w:lineRule="auto"/>
-              <w:jc w:val="center"/>
-            </w:pPr>
-            <w:r>
-              <w:rPr>
-                <w:rFonts w:ascii="Times New Roman" w:cs="Times New Roman" w:eastAsia="Times New Roman" w:hAnsi="Times New Roman"/>
-                <w:b w:val="false"/>
-                <w:bCs w:val="false"/>
-                <w:sz w:val="20"/>
-                <w:szCs w:val="20"/>
-              </w:rPr>
-              <w:t xml:space="preserve">Approx. 80</w:t>
+            <w:tcW w:type="dxa" w:w="2160"/>
+            <w:tcBorders>
+              <w:top w:val="single" w:color="000000" w:sz="4"/>
+              <w:left w:val="single" w:color="000000" w:sz="4"/>
+              <w:bottom w:val="single" w:color="000000" w:sz="4"/>
+              <w:right w:val="single" w:color="000000" w:sz="4"/>
+            </w:tcBorders>
+            <w:shd w:fill="FFFFFF" w:val="clear"/>
+            <w:tcMar>
+              <w:top w:type="dxa" w:w="60"/>
+              <w:left w:type="dxa" w:w="100"/>
+              <w:bottom w:type="dxa" w:w="60"/>
+              <w:right w:type="dxa" w:w="100"/>
+            </w:tcMar>
+            <w:vAlign w:val="center"/>
+          </w:tcPr>
+          <w:p>
+            <w:pPr>
+              <w:spacing w:after="0" w:before="0" w:line="240" w:lineRule="auto"/>
+              <w:jc w:val="center"/>
+            </w:pPr>
+            <w:r>
+              <w:rPr>
+                <w:rFonts w:ascii="Times New Roman" w:cs="Times New Roman" w:eastAsia="Times New Roman" w:hAnsi="Times New Roman"/>
+                <w:b w:val="false"/>
+                <w:bCs w:val="false"/>
+                <w:sz w:val="20"/>
+                <w:szCs w:val="20"/>
+              </w:rPr>
+              <w:t xml:space="preserve">Approx. 106</w:t>
             </w:r>
           </w:p>
         </w:tc>
@@ -27592,7 +27584,7 @@
       <w:tr>
         <w:tc>
           <w:tcPr>
-            <w:tcW w:type="dxa" w:w="2722"/>
+            <w:tcW w:type="dxa" w:w="3240"/>
             <w:tcBorders>
               <w:top w:val="single" w:color="000000" w:sz="4"/>
               <w:left w:val="single" w:color="000000" w:sz="4"/>
@@ -27621,13 +27613,13 @@
                 <w:sz w:val="20"/>
                 <w:szCs w:val="20"/>
               </w:rPr>
-              <w:t xml:space="preserve">Estimated Output (Leaves/hr)</w:t>
-            </w:r>
-          </w:p>
-        </w:tc>
-        <w:tc>
-          <w:tcPr>
-            <w:tcW w:type="dxa" w:w="2333"/>
+              <w:t xml:space="preserve">Est. Output (Leaves/hr)</w:t>
+            </w:r>
+          </w:p>
+        </w:tc>
+        <w:tc>
+          <w:tcPr>
+            <w:tcW w:type="dxa" w:w="2160"/>
             <w:tcBorders>
               <w:top w:val="single" w:color="000000" w:sz="4"/>
               <w:left w:val="single" w:color="000000" w:sz="4"/>
@@ -27662,7 +27654,7 @@
         </w:tc>
         <w:tc>
           <w:tcPr>
-            <w:tcW w:type="dxa" w:w="2333"/>
+            <w:tcW w:type="dxa" w:w="2160"/>
             <w:tcBorders>
               <w:top w:val="single" w:color="000000" w:sz="4"/>
               <w:left w:val="single" w:color="000000" w:sz="4"/>
@@ -27697,36 +27689,36 @@
         </w:tc>
         <w:tc>
           <w:tcPr>
-            <w:tcW w:type="dxa" w:w="2333"/>
-            <w:tcBorders>
-              <w:top w:val="single" w:color="000000" w:sz="4"/>
-              <w:left w:val="single" w:color="000000" w:sz="4"/>
-              <w:bottom w:val="single" w:color="000000" w:sz="4"/>
-              <w:right w:val="single" w:color="000000" w:sz="4"/>
-            </w:tcBorders>
-            <w:shd w:fill="FFFFFF" w:val="clear"/>
-            <w:tcMar>
-              <w:top w:type="dxa" w:w="60"/>
-              <w:left w:type="dxa" w:w="100"/>
-              <w:bottom w:type="dxa" w:w="60"/>
-              <w:right w:type="dxa" w:w="100"/>
-            </w:tcMar>
-            <w:vAlign w:val="center"/>
-          </w:tcPr>
-          <w:p>
-            <w:pPr>
-              <w:spacing w:after="0" w:before="0" w:line="240" w:lineRule="auto"/>
-              <w:jc w:val="center"/>
-            </w:pPr>
-            <w:r>
-              <w:rPr>
-                <w:rFonts w:ascii="Times New Roman" w:cs="Times New Roman" w:eastAsia="Times New Roman" w:hAnsi="Times New Roman"/>
-                <w:b w:val="false"/>
-                <w:bCs w:val="false"/>
-                <w:sz w:val="20"/>
-                <w:szCs w:val="20"/>
-              </w:rPr>
-              <w:t xml:space="preserve">Approx. 1,067</w:t>
+            <w:tcW w:type="dxa" w:w="2160"/>
+            <w:tcBorders>
+              <w:top w:val="single" w:color="000000" w:sz="4"/>
+              <w:left w:val="single" w:color="000000" w:sz="4"/>
+              <w:bottom w:val="single" w:color="000000" w:sz="4"/>
+              <w:right w:val="single" w:color="000000" w:sz="4"/>
+            </w:tcBorders>
+            <w:shd w:fill="FFFFFF" w:val="clear"/>
+            <w:tcMar>
+              <w:top w:type="dxa" w:w="60"/>
+              <w:left w:type="dxa" w:w="100"/>
+              <w:bottom w:type="dxa" w:w="60"/>
+              <w:right w:type="dxa" w:w="100"/>
+            </w:tcMar>
+            <w:vAlign w:val="center"/>
+          </w:tcPr>
+          <w:p>
+            <w:pPr>
+              <w:spacing w:after="0" w:before="0" w:line="240" w:lineRule="auto"/>
+              <w:jc w:val="center"/>
+            </w:pPr>
+            <w:r>
+              <w:rPr>
+                <w:rFonts w:ascii="Times New Roman" w:cs="Times New Roman" w:eastAsia="Times New Roman" w:hAnsi="Times New Roman"/>
+                <w:b w:val="false"/>
+                <w:bCs w:val="false"/>
+                <w:sz w:val="20"/>
+                <w:szCs w:val="20"/>
+              </w:rPr>
+              <w:t xml:space="preserve">Approx. 954</w:t>
             </w:r>
           </w:p>
         </w:tc>
@@ -27734,7 +27726,7 @@
       <w:tr>
         <w:tc>
           <w:tcPr>
-            <w:tcW w:type="dxa" w:w="2722"/>
+            <w:tcW w:type="dxa" w:w="3240"/>
             <w:tcBorders>
               <w:top w:val="single" w:color="000000" w:sz="4"/>
               <w:left w:val="single" w:color="000000" w:sz="4"/>
@@ -27763,13 +27755,13 @@
                 <w:sz w:val="20"/>
                 <w:szCs w:val="20"/>
               </w:rPr>
-              <w:t xml:space="preserve">Failure Rate %</w:t>
-            </w:r>
-          </w:p>
-        </w:tc>
-        <w:tc>
-          <w:tcPr>
-            <w:tcW w:type="dxa" w:w="2333"/>
+              <w:t xml:space="preserve">Avg. Failure Rate %</w:t>
+            </w:r>
+          </w:p>
+        </w:tc>
+        <w:tc>
+          <w:tcPr>
+            <w:tcW w:type="dxa" w:w="2160"/>
             <w:tcBorders>
               <w:top w:val="single" w:color="000000" w:sz="4"/>
               <w:left w:val="single" w:color="000000" w:sz="4"/>
@@ -27804,7 +27796,7 @@
         </w:tc>
         <w:tc>
           <w:tcPr>
-            <w:tcW w:type="dxa" w:w="2333"/>
+            <w:tcW w:type="dxa" w:w="2160"/>
             <w:tcBorders>
               <w:top w:val="single" w:color="000000" w:sz="4"/>
               <w:left w:val="single" w:color="000000" w:sz="4"/>
@@ -27839,36 +27831,36 @@
         </w:tc>
         <w:tc>
           <w:tcPr>
-            <w:tcW w:type="dxa" w:w="2333"/>
-            <w:tcBorders>
-              <w:top w:val="single" w:color="000000" w:sz="4"/>
-              <w:left w:val="single" w:color="000000" w:sz="4"/>
-              <w:bottom w:val="single" w:color="000000" w:sz="4"/>
-              <w:right w:val="single" w:color="000000" w:sz="4"/>
-            </w:tcBorders>
-            <w:shd w:fill="FFFFFF" w:val="clear"/>
-            <w:tcMar>
-              <w:top w:type="dxa" w:w="60"/>
-              <w:left w:type="dxa" w:w="100"/>
-              <w:bottom w:type="dxa" w:w="60"/>
-              <w:right w:type="dxa" w:w="100"/>
-            </w:tcMar>
-            <w:vAlign w:val="center"/>
-          </w:tcPr>
-          <w:p>
-            <w:pPr>
-              <w:spacing w:after="0" w:before="0" w:line="240" w:lineRule="auto"/>
-              <w:jc w:val="center"/>
-            </w:pPr>
-            <w:r>
-              <w:rPr>
-                <w:rFonts w:ascii="Times New Roman" w:cs="Times New Roman" w:eastAsia="Times New Roman" w:hAnsi="Times New Roman"/>
-                <w:b w:val="false"/>
-                <w:bCs w:val="false"/>
-                <w:sz w:val="20"/>
-                <w:szCs w:val="20"/>
-              </w:rPr>
-              <w:t xml:space="preserve">18.9% (13.3% excl. Trial 6)</w:t>
+            <w:tcW w:type="dxa" w:w="2160"/>
+            <w:tcBorders>
+              <w:top w:val="single" w:color="000000" w:sz="4"/>
+              <w:left w:val="single" w:color="000000" w:sz="4"/>
+              <w:bottom w:val="single" w:color="000000" w:sz="4"/>
+              <w:right w:val="single" w:color="000000" w:sz="4"/>
+            </w:tcBorders>
+            <w:shd w:fill="FFFFFF" w:val="clear"/>
+            <w:tcMar>
+              <w:top w:type="dxa" w:w="60"/>
+              <w:left w:type="dxa" w:w="100"/>
+              <w:bottom w:type="dxa" w:w="60"/>
+              <w:right w:type="dxa" w:w="100"/>
+            </w:tcMar>
+            <w:vAlign w:val="center"/>
+          </w:tcPr>
+          <w:p>
+            <w:pPr>
+              <w:spacing w:after="0" w:before="0" w:line="240" w:lineRule="auto"/>
+              <w:jc w:val="center"/>
+            </w:pPr>
+            <w:r>
+              <w:rPr>
+                <w:rFonts w:ascii="Times New Roman" w:cs="Times New Roman" w:eastAsia="Times New Roman" w:hAnsi="Times New Roman"/>
+                <w:b w:val="false"/>
+                <w:bCs w:val="false"/>
+                <w:sz w:val="20"/>
+                <w:szCs w:val="20"/>
+              </w:rPr>
+              <w:t xml:space="preserve">10%</w:t>
             </w:r>
           </w:p>
         </w:tc>
@@ -27876,7 +27868,7 @@
       <w:tr>
         <w:tc>
           <w:tcPr>
-            <w:tcW w:type="dxa" w:w="2722"/>
+            <w:tcW w:type="dxa" w:w="3240"/>
             <w:tcBorders>
               <w:top w:val="single" w:color="000000" w:sz="4"/>
               <w:left w:val="single" w:color="000000" w:sz="4"/>
@@ -27905,13 +27897,13 @@
                 <w:sz w:val="20"/>
                 <w:szCs w:val="20"/>
               </w:rPr>
-              <w:t xml:space="preserve">Avg. Damaged Leaves per cycle</w:t>
-            </w:r>
-          </w:p>
-        </w:tc>
-        <w:tc>
-          <w:tcPr>
-            <w:tcW w:type="dxa" w:w="2333"/>
+              <w:t xml:space="preserve">Avg. Damaged Leaves/cycle</w:t>
+            </w:r>
+          </w:p>
+        </w:tc>
+        <w:tc>
+          <w:tcPr>
+            <w:tcW w:type="dxa" w:w="2160"/>
             <w:tcBorders>
               <w:top w:val="single" w:color="000000" w:sz="4"/>
               <w:left w:val="single" w:color="000000" w:sz="4"/>
@@ -27946,7 +27938,7 @@
         </w:tc>
         <w:tc>
           <w:tcPr>
-            <w:tcW w:type="dxa" w:w="2333"/>
+            <w:tcW w:type="dxa" w:w="2160"/>
             <w:tcBorders>
               <w:top w:val="single" w:color="000000" w:sz="4"/>
               <w:left w:val="single" w:color="000000" w:sz="4"/>
@@ -27981,36 +27973,36 @@
         </w:tc>
         <w:tc>
           <w:tcPr>
-            <w:tcW w:type="dxa" w:w="2333"/>
-            <w:tcBorders>
-              <w:top w:val="single" w:color="000000" w:sz="4"/>
-              <w:left w:val="single" w:color="000000" w:sz="4"/>
-              <w:bottom w:val="single" w:color="000000" w:sz="4"/>
-              <w:right w:val="single" w:color="000000" w:sz="4"/>
-            </w:tcBorders>
-            <w:shd w:fill="FFFFFF" w:val="clear"/>
-            <w:tcMar>
-              <w:top w:type="dxa" w:w="60"/>
-              <w:left w:type="dxa" w:w="100"/>
-              <w:bottom w:type="dxa" w:w="60"/>
-              <w:right w:type="dxa" w:w="100"/>
-            </w:tcMar>
-            <w:vAlign w:val="center"/>
-          </w:tcPr>
-          <w:p>
-            <w:pPr>
-              <w:spacing w:after="0" w:before="0" w:line="240" w:lineRule="auto"/>
-              <w:jc w:val="center"/>
-            </w:pPr>
-            <w:r>
-              <w:rPr>
-                <w:rFonts w:ascii="Times New Roman" w:cs="Times New Roman" w:eastAsia="Times New Roman" w:hAnsi="Times New Roman"/>
-                <w:b w:val="false"/>
-                <w:bCs w:val="false"/>
-                <w:sz w:val="20"/>
-                <w:szCs w:val="20"/>
-              </w:rPr>
-              <w:t xml:space="preserve">0.9</w:t>
+            <w:tcW w:type="dxa" w:w="2160"/>
+            <w:tcBorders>
+              <w:top w:val="single" w:color="000000" w:sz="4"/>
+              <w:left w:val="single" w:color="000000" w:sz="4"/>
+              <w:bottom w:val="single" w:color="000000" w:sz="4"/>
+              <w:right w:val="single" w:color="000000" w:sz="4"/>
+            </w:tcBorders>
+            <w:shd w:fill="FFFFFF" w:val="clear"/>
+            <w:tcMar>
+              <w:top w:type="dxa" w:w="60"/>
+              <w:left w:type="dxa" w:w="100"/>
+              <w:bottom w:type="dxa" w:w="60"/>
+              <w:right w:type="dxa" w:w="100"/>
+            </w:tcMar>
+            <w:vAlign w:val="center"/>
+          </w:tcPr>
+          <w:p>
+            <w:pPr>
+              <w:spacing w:after="0" w:before="0" w:line="240" w:lineRule="auto"/>
+              <w:jc w:val="center"/>
+            </w:pPr>
+            <w:r>
+              <w:rPr>
+                <w:rFonts w:ascii="Times New Roman" w:cs="Times New Roman" w:eastAsia="Times New Roman" w:hAnsi="Times New Roman"/>
+                <w:b w:val="false"/>
+                <w:bCs w:val="false"/>
+                <w:sz w:val="20"/>
+                <w:szCs w:val="20"/>
+              </w:rPr>
+              <w:t xml:space="preserve">0.33</w:t>
             </w:r>
           </w:p>
         </w:tc>
@@ -28018,7 +28010,7 @@
       <w:tr>
         <w:tc>
           <w:tcPr>
-            <w:tcW w:type="dxa" w:w="2722"/>
+            <w:tcW w:type="dxa" w:w="3240"/>
             <w:tcBorders>
               <w:top w:val="single" w:color="000000" w:sz="4"/>
               <w:left w:val="single" w:color="000000" w:sz="4"/>
@@ -28053,7 +28045,7 @@
         </w:tc>
         <w:tc>
           <w:tcPr>
-            <w:tcW w:type="dxa" w:w="2333"/>
+            <w:tcW w:type="dxa" w:w="2160"/>
             <w:tcBorders>
               <w:top w:val="single" w:color="000000" w:sz="4"/>
               <w:left w:val="single" w:color="000000" w:sz="4"/>
@@ -28088,7 +28080,7 @@
         </w:tc>
         <w:tc>
           <w:tcPr>
-            <w:tcW w:type="dxa" w:w="2333"/>
+            <w:tcW w:type="dxa" w:w="2160"/>
             <w:tcBorders>
               <w:top w:val="single" w:color="000000" w:sz="4"/>
               <w:left w:val="single" w:color="000000" w:sz="4"/>
@@ -28123,36 +28115,36 @@
         </w:tc>
         <w:tc>
           <w:tcPr>
-            <w:tcW w:type="dxa" w:w="2333"/>
-            <w:tcBorders>
-              <w:top w:val="single" w:color="000000" w:sz="4"/>
-              <w:left w:val="single" w:color="000000" w:sz="4"/>
-              <w:bottom w:val="single" w:color="000000" w:sz="4"/>
-              <w:right w:val="single" w:color="000000" w:sz="4"/>
-            </w:tcBorders>
-            <w:shd w:fill="FFFFFF" w:val="clear"/>
-            <w:tcMar>
-              <w:top w:type="dxa" w:w="60"/>
-              <w:left w:type="dxa" w:w="100"/>
-              <w:bottom w:type="dxa" w:w="60"/>
-              <w:right w:type="dxa" w:w="100"/>
-            </w:tcMar>
-            <w:vAlign w:val="center"/>
-          </w:tcPr>
-          <w:p>
-            <w:pPr>
-              <w:spacing w:after="0" w:before="0" w:line="240" w:lineRule="auto"/>
-              <w:jc w:val="center"/>
-            </w:pPr>
-            <w:r>
-              <w:rPr>
-                <w:rFonts w:ascii="Times New Roman" w:cs="Times New Roman" w:eastAsia="Times New Roman" w:hAnsi="Times New Roman"/>
-                <w:b w:val="false"/>
-                <w:bCs w:val="false"/>
-                <w:sz w:val="20"/>
-                <w:szCs w:val="20"/>
-              </w:rPr>
-              <w:t xml:space="preserve">6.3%</w:t>
+            <w:tcW w:type="dxa" w:w="2160"/>
+            <w:tcBorders>
+              <w:top w:val="single" w:color="000000" w:sz="4"/>
+              <w:left w:val="single" w:color="000000" w:sz="4"/>
+              <w:bottom w:val="single" w:color="000000" w:sz="4"/>
+              <w:right w:val="single" w:color="000000" w:sz="4"/>
+            </w:tcBorders>
+            <w:shd w:fill="FFFFFF" w:val="clear"/>
+            <w:tcMar>
+              <w:top w:type="dxa" w:w="60"/>
+              <w:left w:type="dxa" w:w="100"/>
+              <w:bottom w:type="dxa" w:w="60"/>
+              <w:right w:type="dxa" w:w="100"/>
+            </w:tcMar>
+            <w:vAlign w:val="center"/>
+          </w:tcPr>
+          <w:p>
+            <w:pPr>
+              <w:spacing w:after="0" w:before="0" w:line="240" w:lineRule="auto"/>
+              <w:jc w:val="center"/>
+            </w:pPr>
+            <w:r>
+              <w:rPr>
+                <w:rFonts w:ascii="Times New Roman" w:cs="Times New Roman" w:eastAsia="Times New Roman" w:hAnsi="Times New Roman"/>
+                <w:b w:val="false"/>
+                <w:bCs w:val="false"/>
+                <w:sz w:val="20"/>
+                <w:szCs w:val="20"/>
+              </w:rPr>
+              <w:t xml:space="preserve">3.33%</w:t>
             </w:r>
           </w:p>
         </w:tc>
@@ -28160,7 +28152,7 @@
       <w:tr>
         <w:tc>
           <w:tcPr>
-            <w:tcW w:type="dxa" w:w="2722"/>
+            <w:tcW w:type="dxa" w:w="3240"/>
             <w:tcBorders>
               <w:top w:val="single" w:color="000000" w:sz="4"/>
               <w:left w:val="single" w:color="000000" w:sz="4"/>
@@ -28195,7 +28187,7 @@
         </w:tc>
         <w:tc>
           <w:tcPr>
-            <w:tcW w:type="dxa" w:w="2333"/>
+            <w:tcW w:type="dxa" w:w="2160"/>
             <w:tcBorders>
               <w:top w:val="single" w:color="000000" w:sz="4"/>
               <w:left w:val="single" w:color="000000" w:sz="4"/>
@@ -28230,7 +28222,7 @@
         </w:tc>
         <w:tc>
           <w:tcPr>
-            <w:tcW w:type="dxa" w:w="2333"/>
+            <w:tcW w:type="dxa" w:w="2160"/>
             <w:tcBorders>
               <w:top w:val="single" w:color="000000" w:sz="4"/>
               <w:left w:val="single" w:color="000000" w:sz="4"/>
@@ -28265,36 +28257,36 @@
         </w:tc>
         <w:tc>
           <w:tcPr>
-            <w:tcW w:type="dxa" w:w="2333"/>
-            <w:tcBorders>
-              <w:top w:val="single" w:color="000000" w:sz="4"/>
-              <w:left w:val="single" w:color="000000" w:sz="4"/>
-              <w:bottom w:val="single" w:color="000000" w:sz="4"/>
-              <w:right w:val="single" w:color="000000" w:sz="4"/>
-            </w:tcBorders>
-            <w:shd w:fill="FFFFFF" w:val="clear"/>
-            <w:tcMar>
-              <w:top w:type="dxa" w:w="60"/>
-              <w:left w:type="dxa" w:w="100"/>
-              <w:bottom w:type="dxa" w:w="60"/>
-              <w:right w:type="dxa" w:w="100"/>
-            </w:tcMar>
-            <w:vAlign w:val="center"/>
-          </w:tcPr>
-          <w:p>
-            <w:pPr>
-              <w:spacing w:after="0" w:before="0" w:line="240" w:lineRule="auto"/>
-              <w:jc w:val="center"/>
-            </w:pPr>
-            <w:r>
-              <w:rPr>
-                <w:rFonts w:ascii="Times New Roman" w:cs="Times New Roman" w:eastAsia="Times New Roman" w:hAnsi="Times New Roman"/>
-                <w:b w:val="false"/>
-                <w:bCs w:val="false"/>
-                <w:sz w:val="20"/>
-                <w:szCs w:val="20"/>
-              </w:rPr>
-              <w:t xml:space="preserve">Grand Mean: 2.48 (Agree)</w:t>
+            <w:tcW w:type="dxa" w:w="2160"/>
+            <w:tcBorders>
+              <w:top w:val="single" w:color="000000" w:sz="4"/>
+              <w:left w:val="single" w:color="000000" w:sz="4"/>
+              <w:bottom w:val="single" w:color="000000" w:sz="4"/>
+              <w:right w:val="single" w:color="000000" w:sz="4"/>
+            </w:tcBorders>
+            <w:shd w:fill="FFFFFF" w:val="clear"/>
+            <w:tcMar>
+              <w:top w:type="dxa" w:w="60"/>
+              <w:left w:type="dxa" w:w="100"/>
+              <w:bottom w:type="dxa" w:w="60"/>
+              <w:right w:type="dxa" w:w="100"/>
+            </w:tcMar>
+            <w:vAlign w:val="center"/>
+          </w:tcPr>
+          <w:p>
+            <w:pPr>
+              <w:spacing w:after="0" w:before="0" w:line="240" w:lineRule="auto"/>
+              <w:jc w:val="center"/>
+            </w:pPr>
+            <w:r>
+              <w:rPr>
+                <w:rFonts w:ascii="Times New Roman" w:cs="Times New Roman" w:eastAsia="Times New Roman" w:hAnsi="Times New Roman"/>
+                <w:b w:val="false"/>
+                <w:bCs w:val="false"/>
+                <w:sz w:val="20"/>
+                <w:szCs w:val="20"/>
+              </w:rPr>
+              <w:t xml:space="preserve">Avg. Mean: 2.79 (Neutral)</w:t>
             </w:r>
           </w:p>
         </w:tc>
@@ -28304,14 +28296,2662 @@
       <w:pPr>
         <w:spacing w:after="0" w:before="0" w:line="480" w:lineRule="auto"/>
       </w:pPr>
+    </w:p>
+    <w:p>
+      <w:pPr>
+        <w:spacing w:after="0" w:before="0" w:line="480" w:lineRule="auto"/>
+      </w:pPr>
+    </w:p>
+    <w:p>
+      <w:pPr>
+        <w:spacing w:after="0" w:before="0" w:line="480" w:lineRule="auto"/>
+        <w:jc w:val="center"/>
+      </w:pPr>
       <w:r>
         <w:rPr>
           <w:rFonts w:ascii="Times New Roman" w:cs="Times New Roman" w:eastAsia="Times New Roman" w:hAnsi="Times New Roman"/>
+          <w:b/>
+          <w:bCs/>
           <w:sz w:val="24"/>
           <w:szCs w:val="24"/>
         </w:rPr>
-        <w:t xml:space="preserve"/>
+        <w:t xml:space="preserve">Table 3.10b. Comparison – Batch 2 (Trials 4–6, 15 Leaves per Cycle)</w:t>
       </w:r>
+    </w:p>
+    <w:p>
+      <w:pPr>
+        <w:spacing w:after="0" w:before="0" w:line="480" w:lineRule="auto"/>
+      </w:pPr>
+    </w:p>
+    <w:tbl>
+      <w:tblPr>
+        <w:tblW w:type="dxa" w:w="9720"/>
+        <w:tblBorders>
+          <w:top w:val="single" w:color="auto" w:sz="4"/>
+          <w:left w:val="single" w:color="auto" w:sz="4"/>
+          <w:bottom w:val="single" w:color="auto" w:sz="4"/>
+          <w:right w:val="single" w:color="auto" w:sz="4"/>
+          <w:insideH w:val="single" w:color="auto" w:sz="4"/>
+          <w:insideV w:val="single" w:color="auto" w:sz="4"/>
+        </w:tblBorders>
+      </w:tblPr>
+      <w:tblGrid>
+        <w:gridCol w:w="3240"/>
+        <w:gridCol w:w="2160"/>
+        <w:gridCol w:w="2160"/>
+        <w:gridCol w:w="2160"/>
+      </w:tblGrid>
+      <w:tr>
+        <w:tc>
+          <w:tcPr>
+            <w:tcW w:type="dxa" w:w="3240"/>
+            <w:tcBorders>
+              <w:top w:val="single" w:color="000000" w:sz="4"/>
+              <w:left w:val="single" w:color="000000" w:sz="4"/>
+              <w:bottom w:val="single" w:color="000000" w:sz="4"/>
+              <w:right w:val="single" w:color="000000" w:sz="4"/>
+            </w:tcBorders>
+            <w:shd w:fill="FFFFFF" w:val="clear"/>
+            <w:tcMar>
+              <w:top w:type="dxa" w:w="60"/>
+              <w:left w:type="dxa" w:w="100"/>
+              <w:bottom w:type="dxa" w:w="60"/>
+              <w:right w:type="dxa" w:w="100"/>
+            </w:tcMar>
+            <w:vAlign w:val="center"/>
+          </w:tcPr>
+          <w:p>
+            <w:pPr>
+              <w:spacing w:after="0" w:before="0" w:line="240" w:lineRule="auto"/>
+              <w:jc w:val="left"/>
+            </w:pPr>
+            <w:r>
+              <w:rPr>
+                <w:rFonts w:ascii="Times New Roman" w:cs="Times New Roman" w:eastAsia="Times New Roman" w:hAnsi="Times New Roman"/>
+                <w:b/>
+                <w:bCs/>
+                <w:sz w:val="20"/>
+                <w:szCs w:val="20"/>
+              </w:rPr>
+              <w:t xml:space="preserve">Indicator</w:t>
+            </w:r>
+          </w:p>
+        </w:tc>
+        <w:tc>
+          <w:tcPr>
+            <w:tcW w:type="dxa" w:w="2160"/>
+            <w:tcBorders>
+              <w:top w:val="single" w:color="000000" w:sz="4"/>
+              <w:left w:val="single" w:color="000000" w:sz="4"/>
+              <w:bottom w:val="single" w:color="000000" w:sz="4"/>
+              <w:right w:val="single" w:color="000000" w:sz="4"/>
+            </w:tcBorders>
+            <w:shd w:fill="FFFFFF" w:val="clear"/>
+            <w:tcMar>
+              <w:top w:type="dxa" w:w="60"/>
+              <w:left w:type="dxa" w:w="100"/>
+              <w:bottom w:type="dxa" w:w="60"/>
+              <w:right w:type="dxa" w:w="100"/>
+            </w:tcMar>
+            <w:vAlign w:val="center"/>
+          </w:tcPr>
+          <w:p>
+            <w:pPr>
+              <w:spacing w:after="0" w:before="0" w:line="240" w:lineRule="auto"/>
+              <w:jc w:val="center"/>
+            </w:pPr>
+            <w:r>
+              <w:rPr>
+                <w:rFonts w:ascii="Times New Roman" w:cs="Times New Roman" w:eastAsia="Times New Roman" w:hAnsi="Times New Roman"/>
+                <w:b/>
+                <w:bCs/>
+                <w:sz w:val="20"/>
+                <w:szCs w:val="20"/>
+              </w:rPr>
+              <w:t xml:space="preserve">Traditional (Veteran)</w:t>
+            </w:r>
+          </w:p>
+        </w:tc>
+        <w:tc>
+          <w:tcPr>
+            <w:tcW w:type="dxa" w:w="2160"/>
+            <w:tcBorders>
+              <w:top w:val="single" w:color="000000" w:sz="4"/>
+              <w:left w:val="single" w:color="000000" w:sz="4"/>
+              <w:bottom w:val="single" w:color="000000" w:sz="4"/>
+              <w:right w:val="single" w:color="000000" w:sz="4"/>
+            </w:tcBorders>
+            <w:shd w:fill="FFFFFF" w:val="clear"/>
+            <w:tcMar>
+              <w:top w:type="dxa" w:w="60"/>
+              <w:left w:type="dxa" w:w="100"/>
+              <w:bottom w:type="dxa" w:w="60"/>
+              <w:right w:type="dxa" w:w="100"/>
+            </w:tcMar>
+            <w:vAlign w:val="center"/>
+          </w:tcPr>
+          <w:p>
+            <w:pPr>
+              <w:spacing w:after="0" w:before="0" w:line="240" w:lineRule="auto"/>
+              <w:jc w:val="center"/>
+            </w:pPr>
+            <w:r>
+              <w:rPr>
+                <w:rFonts w:ascii="Times New Roman" w:cs="Times New Roman" w:eastAsia="Times New Roman" w:hAnsi="Times New Roman"/>
+                <w:b/>
+                <w:bCs/>
+                <w:sz w:val="20"/>
+                <w:szCs w:val="20"/>
+              </w:rPr>
+              <w:t xml:space="preserve">Traditional (Beginner)</w:t>
+            </w:r>
+          </w:p>
+        </w:tc>
+        <w:tc>
+          <w:tcPr>
+            <w:tcW w:type="dxa" w:w="2160"/>
+            <w:tcBorders>
+              <w:top w:val="single" w:color="000000" w:sz="4"/>
+              <w:left w:val="single" w:color="000000" w:sz="4"/>
+              <w:bottom w:val="single" w:color="000000" w:sz="4"/>
+              <w:right w:val="single" w:color="000000" w:sz="4"/>
+            </w:tcBorders>
+            <w:shd w:fill="FFFFFF" w:val="clear"/>
+            <w:tcMar>
+              <w:top w:type="dxa" w:w="60"/>
+              <w:left w:type="dxa" w:w="100"/>
+              <w:bottom w:type="dxa" w:w="60"/>
+              <w:right w:type="dxa" w:w="100"/>
+            </w:tcMar>
+            <w:vAlign w:val="center"/>
+          </w:tcPr>
+          <w:p>
+            <w:pPr>
+              <w:spacing w:after="0" w:before="0" w:line="240" w:lineRule="auto"/>
+              <w:jc w:val="center"/>
+            </w:pPr>
+            <w:r>
+              <w:rPr>
+                <w:rFonts w:ascii="Times New Roman" w:cs="Times New Roman" w:eastAsia="Times New Roman" w:hAnsi="Times New Roman"/>
+                <w:b/>
+                <w:bCs/>
+                <w:sz w:val="20"/>
+                <w:szCs w:val="20"/>
+              </w:rPr>
+              <w:t xml:space="preserve">Semi-Automated Machine</w:t>
+            </w:r>
+          </w:p>
+        </w:tc>
+      </w:tr>
+      <w:tr>
+        <w:tc>
+          <w:tcPr>
+            <w:tcW w:type="dxa" w:w="3240"/>
+            <w:tcBorders>
+              <w:top w:val="single" w:color="000000" w:sz="4"/>
+              <w:left w:val="single" w:color="000000" w:sz="4"/>
+              <w:bottom w:val="single" w:color="000000" w:sz="4"/>
+              <w:right w:val="single" w:color="000000" w:sz="4"/>
+            </w:tcBorders>
+            <w:shd w:fill="FFFFFF" w:val="clear"/>
+            <w:tcMar>
+              <w:top w:type="dxa" w:w="60"/>
+              <w:left w:type="dxa" w:w="100"/>
+              <w:bottom w:type="dxa" w:w="60"/>
+              <w:right w:type="dxa" w:w="100"/>
+            </w:tcMar>
+            <w:vAlign w:val="center"/>
+          </w:tcPr>
+          <w:p>
+            <w:pPr>
+              <w:spacing w:after="0" w:before="0" w:line="240" w:lineRule="auto"/>
+              <w:jc w:val="left"/>
+            </w:pPr>
+            <w:r>
+              <w:rPr>
+                <w:rFonts w:ascii="Times New Roman" w:cs="Times New Roman" w:eastAsia="Times New Roman" w:hAnsi="Times New Roman"/>
+                <w:b w:val="false"/>
+                <w:bCs w:val="false"/>
+                <w:sz w:val="20"/>
+                <w:szCs w:val="20"/>
+              </w:rPr>
+              <w:t xml:space="preserve">Leaves per cycle</w:t>
+            </w:r>
+          </w:p>
+        </w:tc>
+        <w:tc>
+          <w:tcPr>
+            <w:tcW w:type="dxa" w:w="2160"/>
+            <w:tcBorders>
+              <w:top w:val="single" w:color="000000" w:sz="4"/>
+              <w:left w:val="single" w:color="000000" w:sz="4"/>
+              <w:bottom w:val="single" w:color="000000" w:sz="4"/>
+              <w:right w:val="single" w:color="000000" w:sz="4"/>
+            </w:tcBorders>
+            <w:shd w:fill="FFFFFF" w:val="clear"/>
+            <w:tcMar>
+              <w:top w:type="dxa" w:w="60"/>
+              <w:left w:type="dxa" w:w="100"/>
+              <w:bottom w:type="dxa" w:w="60"/>
+              <w:right w:type="dxa" w:w="100"/>
+            </w:tcMar>
+            <w:vAlign w:val="center"/>
+          </w:tcPr>
+          <w:p>
+            <w:pPr>
+              <w:spacing w:after="0" w:before="0" w:line="240" w:lineRule="auto"/>
+              <w:jc w:val="center"/>
+            </w:pPr>
+            <w:r>
+              <w:rPr>
+                <w:rFonts w:ascii="Times New Roman" w:cs="Times New Roman" w:eastAsia="Times New Roman" w:hAnsi="Times New Roman"/>
+                <w:b w:val="false"/>
+                <w:bCs w:val="false"/>
+                <w:sz w:val="20"/>
+                <w:szCs w:val="20"/>
+              </w:rPr>
+              <w:t xml:space="preserve">25</w:t>
+            </w:r>
+          </w:p>
+        </w:tc>
+        <w:tc>
+          <w:tcPr>
+            <w:tcW w:type="dxa" w:w="2160"/>
+            <w:tcBorders>
+              <w:top w:val="single" w:color="000000" w:sz="4"/>
+              <w:left w:val="single" w:color="000000" w:sz="4"/>
+              <w:bottom w:val="single" w:color="000000" w:sz="4"/>
+              <w:right w:val="single" w:color="000000" w:sz="4"/>
+            </w:tcBorders>
+            <w:shd w:fill="FFFFFF" w:val="clear"/>
+            <w:tcMar>
+              <w:top w:type="dxa" w:w="60"/>
+              <w:left w:type="dxa" w:w="100"/>
+              <w:bottom w:type="dxa" w:w="60"/>
+              <w:right w:type="dxa" w:w="100"/>
+            </w:tcMar>
+            <w:vAlign w:val="center"/>
+          </w:tcPr>
+          <w:p>
+            <w:pPr>
+              <w:spacing w:after="0" w:before="0" w:line="240" w:lineRule="auto"/>
+              <w:jc w:val="center"/>
+            </w:pPr>
+            <w:r>
+              <w:rPr>
+                <w:rFonts w:ascii="Times New Roman" w:cs="Times New Roman" w:eastAsia="Times New Roman" w:hAnsi="Times New Roman"/>
+                <w:b w:val="false"/>
+                <w:bCs w:val="false"/>
+                <w:sz w:val="20"/>
+                <w:szCs w:val="20"/>
+              </w:rPr>
+              <w:t xml:space="preserve">25</w:t>
+            </w:r>
+          </w:p>
+        </w:tc>
+        <w:tc>
+          <w:tcPr>
+            <w:tcW w:type="dxa" w:w="2160"/>
+            <w:tcBorders>
+              <w:top w:val="single" w:color="000000" w:sz="4"/>
+              <w:left w:val="single" w:color="000000" w:sz="4"/>
+              <w:bottom w:val="single" w:color="000000" w:sz="4"/>
+              <w:right w:val="single" w:color="000000" w:sz="4"/>
+            </w:tcBorders>
+            <w:shd w:fill="FFFFFF" w:val="clear"/>
+            <w:tcMar>
+              <w:top w:type="dxa" w:w="60"/>
+              <w:left w:type="dxa" w:w="100"/>
+              <w:bottom w:type="dxa" w:w="60"/>
+              <w:right w:type="dxa" w:w="100"/>
+            </w:tcMar>
+            <w:vAlign w:val="center"/>
+          </w:tcPr>
+          <w:p>
+            <w:pPr>
+              <w:spacing w:after="0" w:before="0" w:line="240" w:lineRule="auto"/>
+              <w:jc w:val="center"/>
+            </w:pPr>
+            <w:r>
+              <w:rPr>
+                <w:rFonts w:ascii="Times New Roman" w:cs="Times New Roman" w:eastAsia="Times New Roman" w:hAnsi="Times New Roman"/>
+                <w:b w:val="false"/>
+                <w:bCs w:val="false"/>
+                <w:sz w:val="20"/>
+                <w:szCs w:val="20"/>
+              </w:rPr>
+              <w:t xml:space="preserve">15</w:t>
+            </w:r>
+          </w:p>
+        </w:tc>
+      </w:tr>
+      <w:tr>
+        <w:tc>
+          <w:tcPr>
+            <w:tcW w:type="dxa" w:w="3240"/>
+            <w:tcBorders>
+              <w:top w:val="single" w:color="000000" w:sz="4"/>
+              <w:left w:val="single" w:color="000000" w:sz="4"/>
+              <w:bottom w:val="single" w:color="000000" w:sz="4"/>
+              <w:right w:val="single" w:color="000000" w:sz="4"/>
+            </w:tcBorders>
+            <w:shd w:fill="FFFFFF" w:val="clear"/>
+            <w:tcMar>
+              <w:top w:type="dxa" w:w="60"/>
+              <w:left w:type="dxa" w:w="100"/>
+              <w:bottom w:type="dxa" w:w="60"/>
+              <w:right w:type="dxa" w:w="100"/>
+            </w:tcMar>
+            <w:vAlign w:val="center"/>
+          </w:tcPr>
+          <w:p>
+            <w:pPr>
+              <w:spacing w:after="0" w:before="0" w:line="240" w:lineRule="auto"/>
+              <w:jc w:val="left"/>
+            </w:pPr>
+            <w:r>
+              <w:rPr>
+                <w:rFonts w:ascii="Times New Roman" w:cs="Times New Roman" w:eastAsia="Times New Roman" w:hAnsi="Times New Roman"/>
+                <w:b w:val="false"/>
+                <w:bCs w:val="false"/>
+                <w:sz w:val="20"/>
+                <w:szCs w:val="20"/>
+              </w:rPr>
+              <w:t xml:space="preserve">Avg. Cycle Time</w:t>
+            </w:r>
+          </w:p>
+        </w:tc>
+        <w:tc>
+          <w:tcPr>
+            <w:tcW w:type="dxa" w:w="2160"/>
+            <w:tcBorders>
+              <w:top w:val="single" w:color="000000" w:sz="4"/>
+              <w:left w:val="single" w:color="000000" w:sz="4"/>
+              <w:bottom w:val="single" w:color="000000" w:sz="4"/>
+              <w:right w:val="single" w:color="000000" w:sz="4"/>
+            </w:tcBorders>
+            <w:shd w:fill="FFFFFF" w:val="clear"/>
+            <w:tcMar>
+              <w:top w:type="dxa" w:w="60"/>
+              <w:left w:type="dxa" w:w="100"/>
+              <w:bottom w:type="dxa" w:w="60"/>
+              <w:right w:type="dxa" w:w="100"/>
+            </w:tcMar>
+            <w:vAlign w:val="center"/>
+          </w:tcPr>
+          <w:p>
+            <w:pPr>
+              <w:spacing w:after="0" w:before="0" w:line="240" w:lineRule="auto"/>
+              <w:jc w:val="center"/>
+            </w:pPr>
+            <w:r>
+              <w:rPr>
+                <w:rFonts w:ascii="Times New Roman" w:cs="Times New Roman" w:eastAsia="Times New Roman" w:hAnsi="Times New Roman"/>
+                <w:b w:val="false"/>
+                <w:bCs w:val="false"/>
+                <w:sz w:val="20"/>
+                <w:szCs w:val="20"/>
+              </w:rPr>
+              <w:t xml:space="preserve">204.33s (3:24)</w:t>
+            </w:r>
+          </w:p>
+        </w:tc>
+        <w:tc>
+          <w:tcPr>
+            <w:tcW w:type="dxa" w:w="2160"/>
+            <w:tcBorders>
+              <w:top w:val="single" w:color="000000" w:sz="4"/>
+              <w:left w:val="single" w:color="000000" w:sz="4"/>
+              <w:bottom w:val="single" w:color="000000" w:sz="4"/>
+              <w:right w:val="single" w:color="000000" w:sz="4"/>
+            </w:tcBorders>
+            <w:shd w:fill="FFFFFF" w:val="clear"/>
+            <w:tcMar>
+              <w:top w:type="dxa" w:w="60"/>
+              <w:left w:type="dxa" w:w="100"/>
+              <w:bottom w:type="dxa" w:w="60"/>
+              <w:right w:type="dxa" w:w="100"/>
+            </w:tcMar>
+            <w:vAlign w:val="center"/>
+          </w:tcPr>
+          <w:p>
+            <w:pPr>
+              <w:spacing w:after="0" w:before="0" w:line="240" w:lineRule="auto"/>
+              <w:jc w:val="center"/>
+            </w:pPr>
+            <w:r>
+              <w:rPr>
+                <w:rFonts w:ascii="Times New Roman" w:cs="Times New Roman" w:eastAsia="Times New Roman" w:hAnsi="Times New Roman"/>
+                <w:b w:val="false"/>
+                <w:bCs w:val="false"/>
+                <w:sz w:val="20"/>
+                <w:szCs w:val="20"/>
+              </w:rPr>
+              <w:t xml:space="preserve">315.33s (5:15)</w:t>
+            </w:r>
+          </w:p>
+        </w:tc>
+        <w:tc>
+          <w:tcPr>
+            <w:tcW w:type="dxa" w:w="2160"/>
+            <w:tcBorders>
+              <w:top w:val="single" w:color="000000" w:sz="4"/>
+              <w:left w:val="single" w:color="000000" w:sz="4"/>
+              <w:bottom w:val="single" w:color="000000" w:sz="4"/>
+              <w:right w:val="single" w:color="000000" w:sz="4"/>
+            </w:tcBorders>
+            <w:shd w:fill="FFFFFF" w:val="clear"/>
+            <w:tcMar>
+              <w:top w:type="dxa" w:w="60"/>
+              <w:left w:type="dxa" w:w="100"/>
+              <w:bottom w:type="dxa" w:w="60"/>
+              <w:right w:type="dxa" w:w="100"/>
+            </w:tcMar>
+            <w:vAlign w:val="center"/>
+          </w:tcPr>
+          <w:p>
+            <w:pPr>
+              <w:spacing w:after="0" w:before="0" w:line="240" w:lineRule="auto"/>
+              <w:jc w:val="center"/>
+            </w:pPr>
+            <w:r>
+              <w:rPr>
+                <w:rFonts w:ascii="Times New Roman" w:cs="Times New Roman" w:eastAsia="Times New Roman" w:hAnsi="Times New Roman"/>
+                <w:b w:val="false"/>
+                <w:bCs w:val="false"/>
+                <w:sz w:val="20"/>
+                <w:szCs w:val="20"/>
+              </w:rPr>
+              <w:t xml:space="preserve">45.73s</w:t>
+            </w:r>
+          </w:p>
+        </w:tc>
+      </w:tr>
+      <w:tr>
+        <w:tc>
+          <w:tcPr>
+            <w:tcW w:type="dxa" w:w="3240"/>
+            <w:tcBorders>
+              <w:top w:val="single" w:color="000000" w:sz="4"/>
+              <w:left w:val="single" w:color="000000" w:sz="4"/>
+              <w:bottom w:val="single" w:color="000000" w:sz="4"/>
+              <w:right w:val="single" w:color="000000" w:sz="4"/>
+            </w:tcBorders>
+            <w:shd w:fill="FFFFFF" w:val="clear"/>
+            <w:tcMar>
+              <w:top w:type="dxa" w:w="60"/>
+              <w:left w:type="dxa" w:w="100"/>
+              <w:bottom w:type="dxa" w:w="60"/>
+              <w:right w:type="dxa" w:w="100"/>
+            </w:tcMar>
+            <w:vAlign w:val="center"/>
+          </w:tcPr>
+          <w:p>
+            <w:pPr>
+              <w:spacing w:after="0" w:before="0" w:line="240" w:lineRule="auto"/>
+              <w:jc w:val="left"/>
+            </w:pPr>
+            <w:r>
+              <w:rPr>
+                <w:rFonts w:ascii="Times New Roman" w:cs="Times New Roman" w:eastAsia="Times New Roman" w:hAnsi="Times New Roman"/>
+                <w:b w:val="false"/>
+                <w:bCs w:val="false"/>
+                <w:sz w:val="20"/>
+                <w:szCs w:val="20"/>
+              </w:rPr>
+              <w:t xml:space="preserve">Cycles per hour</w:t>
+            </w:r>
+          </w:p>
+        </w:tc>
+        <w:tc>
+          <w:tcPr>
+            <w:tcW w:type="dxa" w:w="2160"/>
+            <w:tcBorders>
+              <w:top w:val="single" w:color="000000" w:sz="4"/>
+              <w:left w:val="single" w:color="000000" w:sz="4"/>
+              <w:bottom w:val="single" w:color="000000" w:sz="4"/>
+              <w:right w:val="single" w:color="000000" w:sz="4"/>
+            </w:tcBorders>
+            <w:shd w:fill="FFFFFF" w:val="clear"/>
+            <w:tcMar>
+              <w:top w:type="dxa" w:w="60"/>
+              <w:left w:type="dxa" w:w="100"/>
+              <w:bottom w:type="dxa" w:w="60"/>
+              <w:right w:type="dxa" w:w="100"/>
+            </w:tcMar>
+            <w:vAlign w:val="center"/>
+          </w:tcPr>
+          <w:p>
+            <w:pPr>
+              <w:spacing w:after="0" w:before="0" w:line="240" w:lineRule="auto"/>
+              <w:jc w:val="center"/>
+            </w:pPr>
+            <w:r>
+              <w:rPr>
+                <w:rFonts w:ascii="Times New Roman" w:cs="Times New Roman" w:eastAsia="Times New Roman" w:hAnsi="Times New Roman"/>
+                <w:b w:val="false"/>
+                <w:bCs w:val="false"/>
+                <w:sz w:val="20"/>
+                <w:szCs w:val="20"/>
+              </w:rPr>
+              <w:t xml:space="preserve">Approx. 18</w:t>
+            </w:r>
+          </w:p>
+        </w:tc>
+        <w:tc>
+          <w:tcPr>
+            <w:tcW w:type="dxa" w:w="2160"/>
+            <w:tcBorders>
+              <w:top w:val="single" w:color="000000" w:sz="4"/>
+              <w:left w:val="single" w:color="000000" w:sz="4"/>
+              <w:bottom w:val="single" w:color="000000" w:sz="4"/>
+              <w:right w:val="single" w:color="000000" w:sz="4"/>
+            </w:tcBorders>
+            <w:shd w:fill="FFFFFF" w:val="clear"/>
+            <w:tcMar>
+              <w:top w:type="dxa" w:w="60"/>
+              <w:left w:type="dxa" w:w="100"/>
+              <w:bottom w:type="dxa" w:w="60"/>
+              <w:right w:type="dxa" w:w="100"/>
+            </w:tcMar>
+            <w:vAlign w:val="center"/>
+          </w:tcPr>
+          <w:p>
+            <w:pPr>
+              <w:spacing w:after="0" w:before="0" w:line="240" w:lineRule="auto"/>
+              <w:jc w:val="center"/>
+            </w:pPr>
+            <w:r>
+              <w:rPr>
+                <w:rFonts w:ascii="Times New Roman" w:cs="Times New Roman" w:eastAsia="Times New Roman" w:hAnsi="Times New Roman"/>
+                <w:b w:val="false"/>
+                <w:bCs w:val="false"/>
+                <w:sz w:val="20"/>
+                <w:szCs w:val="20"/>
+              </w:rPr>
+              <w:t xml:space="preserve">Approx. 11</w:t>
+            </w:r>
+          </w:p>
+        </w:tc>
+        <w:tc>
+          <w:tcPr>
+            <w:tcW w:type="dxa" w:w="2160"/>
+            <w:tcBorders>
+              <w:top w:val="single" w:color="000000" w:sz="4"/>
+              <w:left w:val="single" w:color="000000" w:sz="4"/>
+              <w:bottom w:val="single" w:color="000000" w:sz="4"/>
+              <w:right w:val="single" w:color="000000" w:sz="4"/>
+            </w:tcBorders>
+            <w:shd w:fill="FFFFFF" w:val="clear"/>
+            <w:tcMar>
+              <w:top w:type="dxa" w:w="60"/>
+              <w:left w:type="dxa" w:w="100"/>
+              <w:bottom w:type="dxa" w:w="60"/>
+              <w:right w:type="dxa" w:w="100"/>
+            </w:tcMar>
+            <w:vAlign w:val="center"/>
+          </w:tcPr>
+          <w:p>
+            <w:pPr>
+              <w:spacing w:after="0" w:before="0" w:line="240" w:lineRule="auto"/>
+              <w:jc w:val="center"/>
+            </w:pPr>
+            <w:r>
+              <w:rPr>
+                <w:rFonts w:ascii="Times New Roman" w:cs="Times New Roman" w:eastAsia="Times New Roman" w:hAnsi="Times New Roman"/>
+                <w:b w:val="false"/>
+                <w:bCs w:val="false"/>
+                <w:sz w:val="20"/>
+                <w:szCs w:val="20"/>
+              </w:rPr>
+              <w:t xml:space="preserve">Approx. 79</w:t>
+            </w:r>
+          </w:p>
+        </w:tc>
+      </w:tr>
+      <w:tr>
+        <w:tc>
+          <w:tcPr>
+            <w:tcW w:type="dxa" w:w="3240"/>
+            <w:tcBorders>
+              <w:top w:val="single" w:color="000000" w:sz="4"/>
+              <w:left w:val="single" w:color="000000" w:sz="4"/>
+              <w:bottom w:val="single" w:color="000000" w:sz="4"/>
+              <w:right w:val="single" w:color="000000" w:sz="4"/>
+            </w:tcBorders>
+            <w:shd w:fill="FFFFFF" w:val="clear"/>
+            <w:tcMar>
+              <w:top w:type="dxa" w:w="60"/>
+              <w:left w:type="dxa" w:w="100"/>
+              <w:bottom w:type="dxa" w:w="60"/>
+              <w:right w:type="dxa" w:w="100"/>
+            </w:tcMar>
+            <w:vAlign w:val="center"/>
+          </w:tcPr>
+          <w:p>
+            <w:pPr>
+              <w:spacing w:after="0" w:before="0" w:line="240" w:lineRule="auto"/>
+              <w:jc w:val="left"/>
+            </w:pPr>
+            <w:r>
+              <w:rPr>
+                <w:rFonts w:ascii="Times New Roman" w:cs="Times New Roman" w:eastAsia="Times New Roman" w:hAnsi="Times New Roman"/>
+                <w:b w:val="false"/>
+                <w:bCs w:val="false"/>
+                <w:sz w:val="20"/>
+                <w:szCs w:val="20"/>
+              </w:rPr>
+              <w:t xml:space="preserve">Est. Output (Leaves/hr)</w:t>
+            </w:r>
+          </w:p>
+        </w:tc>
+        <w:tc>
+          <w:tcPr>
+            <w:tcW w:type="dxa" w:w="2160"/>
+            <w:tcBorders>
+              <w:top w:val="single" w:color="000000" w:sz="4"/>
+              <w:left w:val="single" w:color="000000" w:sz="4"/>
+              <w:bottom w:val="single" w:color="000000" w:sz="4"/>
+              <w:right w:val="single" w:color="000000" w:sz="4"/>
+            </w:tcBorders>
+            <w:shd w:fill="FFFFFF" w:val="clear"/>
+            <w:tcMar>
+              <w:top w:type="dxa" w:w="60"/>
+              <w:left w:type="dxa" w:w="100"/>
+              <w:bottom w:type="dxa" w:w="60"/>
+              <w:right w:type="dxa" w:w="100"/>
+            </w:tcMar>
+            <w:vAlign w:val="center"/>
+          </w:tcPr>
+          <w:p>
+            <w:pPr>
+              <w:spacing w:after="0" w:before="0" w:line="240" w:lineRule="auto"/>
+              <w:jc w:val="center"/>
+            </w:pPr>
+            <w:r>
+              <w:rPr>
+                <w:rFonts w:ascii="Times New Roman" w:cs="Times New Roman" w:eastAsia="Times New Roman" w:hAnsi="Times New Roman"/>
+                <w:b w:val="false"/>
+                <w:bCs w:val="false"/>
+                <w:sz w:val="20"/>
+                <w:szCs w:val="20"/>
+              </w:rPr>
+              <w:t xml:space="preserve">Approx. 440</w:t>
+            </w:r>
+          </w:p>
+        </w:tc>
+        <w:tc>
+          <w:tcPr>
+            <w:tcW w:type="dxa" w:w="2160"/>
+            <w:tcBorders>
+              <w:top w:val="single" w:color="000000" w:sz="4"/>
+              <w:left w:val="single" w:color="000000" w:sz="4"/>
+              <w:bottom w:val="single" w:color="000000" w:sz="4"/>
+              <w:right w:val="single" w:color="000000" w:sz="4"/>
+            </w:tcBorders>
+            <w:shd w:fill="FFFFFF" w:val="clear"/>
+            <w:tcMar>
+              <w:top w:type="dxa" w:w="60"/>
+              <w:left w:type="dxa" w:w="100"/>
+              <w:bottom w:type="dxa" w:w="60"/>
+              <w:right w:type="dxa" w:w="100"/>
+            </w:tcMar>
+            <w:vAlign w:val="center"/>
+          </w:tcPr>
+          <w:p>
+            <w:pPr>
+              <w:spacing w:after="0" w:before="0" w:line="240" w:lineRule="auto"/>
+              <w:jc w:val="center"/>
+            </w:pPr>
+            <w:r>
+              <w:rPr>
+                <w:rFonts w:ascii="Times New Roman" w:cs="Times New Roman" w:eastAsia="Times New Roman" w:hAnsi="Times New Roman"/>
+                <w:b w:val="false"/>
+                <w:bCs w:val="false"/>
+                <w:sz w:val="20"/>
+                <w:szCs w:val="20"/>
+              </w:rPr>
+              <w:t xml:space="preserve">Approx. 285</w:t>
+            </w:r>
+          </w:p>
+        </w:tc>
+        <w:tc>
+          <w:tcPr>
+            <w:tcW w:type="dxa" w:w="2160"/>
+            <w:tcBorders>
+              <w:top w:val="single" w:color="000000" w:sz="4"/>
+              <w:left w:val="single" w:color="000000" w:sz="4"/>
+              <w:bottom w:val="single" w:color="000000" w:sz="4"/>
+              <w:right w:val="single" w:color="000000" w:sz="4"/>
+            </w:tcBorders>
+            <w:shd w:fill="FFFFFF" w:val="clear"/>
+            <w:tcMar>
+              <w:top w:type="dxa" w:w="60"/>
+              <w:left w:type="dxa" w:w="100"/>
+              <w:bottom w:type="dxa" w:w="60"/>
+              <w:right w:type="dxa" w:w="100"/>
+            </w:tcMar>
+            <w:vAlign w:val="center"/>
+          </w:tcPr>
+          <w:p>
+            <w:pPr>
+              <w:spacing w:after="0" w:before="0" w:line="240" w:lineRule="auto"/>
+              <w:jc w:val="center"/>
+            </w:pPr>
+            <w:r>
+              <w:rPr>
+                <w:rFonts w:ascii="Times New Roman" w:cs="Times New Roman" w:eastAsia="Times New Roman" w:hAnsi="Times New Roman"/>
+                <w:b w:val="false"/>
+                <w:bCs w:val="false"/>
+                <w:sz w:val="20"/>
+                <w:szCs w:val="20"/>
+              </w:rPr>
+              <w:t xml:space="preserve">Approx. 821</w:t>
+            </w:r>
+          </w:p>
+        </w:tc>
+      </w:tr>
+      <w:tr>
+        <w:tc>
+          <w:tcPr>
+            <w:tcW w:type="dxa" w:w="3240"/>
+            <w:tcBorders>
+              <w:top w:val="single" w:color="000000" w:sz="4"/>
+              <w:left w:val="single" w:color="000000" w:sz="4"/>
+              <w:bottom w:val="single" w:color="000000" w:sz="4"/>
+              <w:right w:val="single" w:color="000000" w:sz="4"/>
+            </w:tcBorders>
+            <w:shd w:fill="FFFFFF" w:val="clear"/>
+            <w:tcMar>
+              <w:top w:type="dxa" w:w="60"/>
+              <w:left w:type="dxa" w:w="100"/>
+              <w:bottom w:type="dxa" w:w="60"/>
+              <w:right w:type="dxa" w:w="100"/>
+            </w:tcMar>
+            <w:vAlign w:val="center"/>
+          </w:tcPr>
+          <w:p>
+            <w:pPr>
+              <w:spacing w:after="0" w:before="0" w:line="240" w:lineRule="auto"/>
+              <w:jc w:val="left"/>
+            </w:pPr>
+            <w:r>
+              <w:rPr>
+                <w:rFonts w:ascii="Times New Roman" w:cs="Times New Roman" w:eastAsia="Times New Roman" w:hAnsi="Times New Roman"/>
+                <w:b w:val="false"/>
+                <w:bCs w:val="false"/>
+                <w:sz w:val="20"/>
+                <w:szCs w:val="20"/>
+              </w:rPr>
+              <w:t xml:space="preserve">Avg. Failure Rate %</w:t>
+            </w:r>
+          </w:p>
+        </w:tc>
+        <w:tc>
+          <w:tcPr>
+            <w:tcW w:type="dxa" w:w="2160"/>
+            <w:tcBorders>
+              <w:top w:val="single" w:color="000000" w:sz="4"/>
+              <w:left w:val="single" w:color="000000" w:sz="4"/>
+              <w:bottom w:val="single" w:color="000000" w:sz="4"/>
+              <w:right w:val="single" w:color="000000" w:sz="4"/>
+            </w:tcBorders>
+            <w:shd w:fill="FFFFFF" w:val="clear"/>
+            <w:tcMar>
+              <w:top w:type="dxa" w:w="60"/>
+              <w:left w:type="dxa" w:w="100"/>
+              <w:bottom w:type="dxa" w:w="60"/>
+              <w:right w:type="dxa" w:w="100"/>
+            </w:tcMar>
+            <w:vAlign w:val="center"/>
+          </w:tcPr>
+          <w:p>
+            <w:pPr>
+              <w:spacing w:after="0" w:before="0" w:line="240" w:lineRule="auto"/>
+              <w:jc w:val="center"/>
+            </w:pPr>
+            <w:r>
+              <w:rPr>
+                <w:rFonts w:ascii="Times New Roman" w:cs="Times New Roman" w:eastAsia="Times New Roman" w:hAnsi="Times New Roman"/>
+                <w:b w:val="false"/>
+                <w:bCs w:val="false"/>
+                <w:sz w:val="20"/>
+                <w:szCs w:val="20"/>
+              </w:rPr>
+              <w:t xml:space="preserve">1.33%</w:t>
+            </w:r>
+          </w:p>
+        </w:tc>
+        <w:tc>
+          <w:tcPr>
+            <w:tcW w:type="dxa" w:w="2160"/>
+            <w:tcBorders>
+              <w:top w:val="single" w:color="000000" w:sz="4"/>
+              <w:left w:val="single" w:color="000000" w:sz="4"/>
+              <w:bottom w:val="single" w:color="000000" w:sz="4"/>
+              <w:right w:val="single" w:color="000000" w:sz="4"/>
+            </w:tcBorders>
+            <w:shd w:fill="FFFFFF" w:val="clear"/>
+            <w:tcMar>
+              <w:top w:type="dxa" w:w="60"/>
+              <w:left w:type="dxa" w:w="100"/>
+              <w:bottom w:type="dxa" w:w="60"/>
+              <w:right w:type="dxa" w:w="100"/>
+            </w:tcMar>
+            <w:vAlign w:val="center"/>
+          </w:tcPr>
+          <w:p>
+            <w:pPr>
+              <w:spacing w:after="0" w:before="0" w:line="240" w:lineRule="auto"/>
+              <w:jc w:val="center"/>
+            </w:pPr>
+            <w:r>
+              <w:rPr>
+                <w:rFonts w:ascii="Times New Roman" w:cs="Times New Roman" w:eastAsia="Times New Roman" w:hAnsi="Times New Roman"/>
+                <w:b w:val="false"/>
+                <w:bCs w:val="false"/>
+                <w:sz w:val="20"/>
+                <w:szCs w:val="20"/>
+              </w:rPr>
+              <w:t xml:space="preserve">10.67%</w:t>
+            </w:r>
+          </w:p>
+        </w:tc>
+        <w:tc>
+          <w:tcPr>
+            <w:tcW w:type="dxa" w:w="2160"/>
+            <w:tcBorders>
+              <w:top w:val="single" w:color="000000" w:sz="4"/>
+              <w:left w:val="single" w:color="000000" w:sz="4"/>
+              <w:bottom w:val="single" w:color="000000" w:sz="4"/>
+              <w:right w:val="single" w:color="000000" w:sz="4"/>
+            </w:tcBorders>
+            <w:shd w:fill="FFFFFF" w:val="clear"/>
+            <w:tcMar>
+              <w:top w:type="dxa" w:w="60"/>
+              <w:left w:type="dxa" w:w="100"/>
+              <w:bottom w:type="dxa" w:w="60"/>
+              <w:right w:type="dxa" w:w="100"/>
+            </w:tcMar>
+            <w:vAlign w:val="center"/>
+          </w:tcPr>
+          <w:p>
+            <w:pPr>
+              <w:spacing w:after="0" w:before="0" w:line="240" w:lineRule="auto"/>
+              <w:jc w:val="center"/>
+            </w:pPr>
+            <w:r>
+              <w:rPr>
+                <w:rFonts w:ascii="Times New Roman" w:cs="Times New Roman" w:eastAsia="Times New Roman" w:hAnsi="Times New Roman"/>
+                <w:b w:val="false"/>
+                <w:bCs w:val="false"/>
+                <w:sz w:val="20"/>
+                <w:szCs w:val="20"/>
+              </w:rPr>
+              <w:t xml:space="preserve">31.1% (T4 &amp; T5: 13.35%)</w:t>
+            </w:r>
+          </w:p>
+        </w:tc>
+      </w:tr>
+      <w:tr>
+        <w:tc>
+          <w:tcPr>
+            <w:tcW w:type="dxa" w:w="3240"/>
+            <w:tcBorders>
+              <w:top w:val="single" w:color="000000" w:sz="4"/>
+              <w:left w:val="single" w:color="000000" w:sz="4"/>
+              <w:bottom w:val="single" w:color="000000" w:sz="4"/>
+              <w:right w:val="single" w:color="000000" w:sz="4"/>
+            </w:tcBorders>
+            <w:shd w:fill="FFFFFF" w:val="clear"/>
+            <w:tcMar>
+              <w:top w:type="dxa" w:w="60"/>
+              <w:left w:type="dxa" w:w="100"/>
+              <w:bottom w:type="dxa" w:w="60"/>
+              <w:right w:type="dxa" w:w="100"/>
+            </w:tcMar>
+            <w:vAlign w:val="center"/>
+          </w:tcPr>
+          <w:p>
+            <w:pPr>
+              <w:spacing w:after="0" w:before="0" w:line="240" w:lineRule="auto"/>
+              <w:jc w:val="left"/>
+            </w:pPr>
+            <w:r>
+              <w:rPr>
+                <w:rFonts w:ascii="Times New Roman" w:cs="Times New Roman" w:eastAsia="Times New Roman" w:hAnsi="Times New Roman"/>
+                <w:b w:val="false"/>
+                <w:bCs w:val="false"/>
+                <w:sz w:val="20"/>
+                <w:szCs w:val="20"/>
+              </w:rPr>
+              <w:t xml:space="preserve">Avg. Damaged Leaves/cycle</w:t>
+            </w:r>
+          </w:p>
+        </w:tc>
+        <w:tc>
+          <w:tcPr>
+            <w:tcW w:type="dxa" w:w="2160"/>
+            <w:tcBorders>
+              <w:top w:val="single" w:color="000000" w:sz="4"/>
+              <w:left w:val="single" w:color="000000" w:sz="4"/>
+              <w:bottom w:val="single" w:color="000000" w:sz="4"/>
+              <w:right w:val="single" w:color="000000" w:sz="4"/>
+            </w:tcBorders>
+            <w:shd w:fill="FFFFFF" w:val="clear"/>
+            <w:tcMar>
+              <w:top w:type="dxa" w:w="60"/>
+              <w:left w:type="dxa" w:w="100"/>
+              <w:bottom w:type="dxa" w:w="60"/>
+              <w:right w:type="dxa" w:w="100"/>
+            </w:tcMar>
+            <w:vAlign w:val="center"/>
+          </w:tcPr>
+          <w:p>
+            <w:pPr>
+              <w:spacing w:after="0" w:before="0" w:line="240" w:lineRule="auto"/>
+              <w:jc w:val="center"/>
+            </w:pPr>
+            <w:r>
+              <w:rPr>
+                <w:rFonts w:ascii="Times New Roman" w:cs="Times New Roman" w:eastAsia="Times New Roman" w:hAnsi="Times New Roman"/>
+                <w:b w:val="false"/>
+                <w:bCs w:val="false"/>
+                <w:sz w:val="20"/>
+                <w:szCs w:val="20"/>
+              </w:rPr>
+              <w:t xml:space="preserve">0</w:t>
+            </w:r>
+          </w:p>
+        </w:tc>
+        <w:tc>
+          <w:tcPr>
+            <w:tcW w:type="dxa" w:w="2160"/>
+            <w:tcBorders>
+              <w:top w:val="single" w:color="000000" w:sz="4"/>
+              <w:left w:val="single" w:color="000000" w:sz="4"/>
+              <w:bottom w:val="single" w:color="000000" w:sz="4"/>
+              <w:right w:val="single" w:color="000000" w:sz="4"/>
+            </w:tcBorders>
+            <w:shd w:fill="FFFFFF" w:val="clear"/>
+            <w:tcMar>
+              <w:top w:type="dxa" w:w="60"/>
+              <w:left w:type="dxa" w:w="100"/>
+              <w:bottom w:type="dxa" w:w="60"/>
+              <w:right w:type="dxa" w:w="100"/>
+            </w:tcMar>
+            <w:vAlign w:val="center"/>
+          </w:tcPr>
+          <w:p>
+            <w:pPr>
+              <w:spacing w:after="0" w:before="0" w:line="240" w:lineRule="auto"/>
+              <w:jc w:val="center"/>
+            </w:pPr>
+            <w:r>
+              <w:rPr>
+                <w:rFonts w:ascii="Times New Roman" w:cs="Times New Roman" w:eastAsia="Times New Roman" w:hAnsi="Times New Roman"/>
+                <w:b w:val="false"/>
+                <w:bCs w:val="false"/>
+                <w:sz w:val="20"/>
+                <w:szCs w:val="20"/>
+              </w:rPr>
+              <w:t xml:space="preserve">2.67</w:t>
+            </w:r>
+          </w:p>
+        </w:tc>
+        <w:tc>
+          <w:tcPr>
+            <w:tcW w:type="dxa" w:w="2160"/>
+            <w:tcBorders>
+              <w:top w:val="single" w:color="000000" w:sz="4"/>
+              <w:left w:val="single" w:color="000000" w:sz="4"/>
+              <w:bottom w:val="single" w:color="000000" w:sz="4"/>
+              <w:right w:val="single" w:color="000000" w:sz="4"/>
+            </w:tcBorders>
+            <w:shd w:fill="FFFFFF" w:val="clear"/>
+            <w:tcMar>
+              <w:top w:type="dxa" w:w="60"/>
+              <w:left w:type="dxa" w:w="100"/>
+              <w:bottom w:type="dxa" w:w="60"/>
+              <w:right w:type="dxa" w:w="100"/>
+            </w:tcMar>
+            <w:vAlign w:val="center"/>
+          </w:tcPr>
+          <w:p>
+            <w:pPr>
+              <w:spacing w:after="0" w:before="0" w:line="240" w:lineRule="auto"/>
+              <w:jc w:val="center"/>
+            </w:pPr>
+            <w:r>
+              <w:rPr>
+                <w:rFonts w:ascii="Times New Roman" w:cs="Times New Roman" w:eastAsia="Times New Roman" w:hAnsi="Times New Roman"/>
+                <w:b w:val="false"/>
+                <w:bCs w:val="false"/>
+                <w:sz w:val="20"/>
+                <w:szCs w:val="20"/>
+              </w:rPr>
+              <w:t xml:space="preserve">1</w:t>
+            </w:r>
+          </w:p>
+        </w:tc>
+      </w:tr>
+      <w:tr>
+        <w:tc>
+          <w:tcPr>
+            <w:tcW w:type="dxa" w:w="3240"/>
+            <w:tcBorders>
+              <w:top w:val="single" w:color="000000" w:sz="4"/>
+              <w:left w:val="single" w:color="000000" w:sz="4"/>
+              <w:bottom w:val="single" w:color="000000" w:sz="4"/>
+              <w:right w:val="single" w:color="000000" w:sz="4"/>
+            </w:tcBorders>
+            <w:shd w:fill="FFFFFF" w:val="clear"/>
+            <w:tcMar>
+              <w:top w:type="dxa" w:w="60"/>
+              <w:left w:type="dxa" w:w="100"/>
+              <w:bottom w:type="dxa" w:w="60"/>
+              <w:right w:type="dxa" w:w="100"/>
+            </w:tcMar>
+            <w:vAlign w:val="center"/>
+          </w:tcPr>
+          <w:p>
+            <w:pPr>
+              <w:spacing w:after="0" w:before="0" w:line="240" w:lineRule="auto"/>
+              <w:jc w:val="left"/>
+            </w:pPr>
+            <w:r>
+              <w:rPr>
+                <w:rFonts w:ascii="Times New Roman" w:cs="Times New Roman" w:eastAsia="Times New Roman" w:hAnsi="Times New Roman"/>
+                <w:b w:val="false"/>
+                <w:bCs w:val="false"/>
+                <w:sz w:val="20"/>
+                <w:szCs w:val="20"/>
+              </w:rPr>
+              <w:t xml:space="preserve">Damage Rate</w:t>
+            </w:r>
+          </w:p>
+        </w:tc>
+        <w:tc>
+          <w:tcPr>
+            <w:tcW w:type="dxa" w:w="2160"/>
+            <w:tcBorders>
+              <w:top w:val="single" w:color="000000" w:sz="4"/>
+              <w:left w:val="single" w:color="000000" w:sz="4"/>
+              <w:bottom w:val="single" w:color="000000" w:sz="4"/>
+              <w:right w:val="single" w:color="000000" w:sz="4"/>
+            </w:tcBorders>
+            <w:shd w:fill="FFFFFF" w:val="clear"/>
+            <w:tcMar>
+              <w:top w:type="dxa" w:w="60"/>
+              <w:left w:type="dxa" w:w="100"/>
+              <w:bottom w:type="dxa" w:w="60"/>
+              <w:right w:type="dxa" w:w="100"/>
+            </w:tcMar>
+            <w:vAlign w:val="center"/>
+          </w:tcPr>
+          <w:p>
+            <w:pPr>
+              <w:spacing w:after="0" w:before="0" w:line="240" w:lineRule="auto"/>
+              <w:jc w:val="center"/>
+            </w:pPr>
+            <w:r>
+              <w:rPr>
+                <w:rFonts w:ascii="Times New Roman" w:cs="Times New Roman" w:eastAsia="Times New Roman" w:hAnsi="Times New Roman"/>
+                <w:b w:val="false"/>
+                <w:bCs w:val="false"/>
+                <w:sz w:val="20"/>
+                <w:szCs w:val="20"/>
+              </w:rPr>
+              <w:t xml:space="preserve">0%</w:t>
+            </w:r>
+          </w:p>
+        </w:tc>
+        <w:tc>
+          <w:tcPr>
+            <w:tcW w:type="dxa" w:w="2160"/>
+            <w:tcBorders>
+              <w:top w:val="single" w:color="000000" w:sz="4"/>
+              <w:left w:val="single" w:color="000000" w:sz="4"/>
+              <w:bottom w:val="single" w:color="000000" w:sz="4"/>
+              <w:right w:val="single" w:color="000000" w:sz="4"/>
+            </w:tcBorders>
+            <w:shd w:fill="FFFFFF" w:val="clear"/>
+            <w:tcMar>
+              <w:top w:type="dxa" w:w="60"/>
+              <w:left w:type="dxa" w:w="100"/>
+              <w:bottom w:type="dxa" w:w="60"/>
+              <w:right w:type="dxa" w:w="100"/>
+            </w:tcMar>
+            <w:vAlign w:val="center"/>
+          </w:tcPr>
+          <w:p>
+            <w:pPr>
+              <w:spacing w:after="0" w:before="0" w:line="240" w:lineRule="auto"/>
+              <w:jc w:val="center"/>
+            </w:pPr>
+            <w:r>
+              <w:rPr>
+                <w:rFonts w:ascii="Times New Roman" w:cs="Times New Roman" w:eastAsia="Times New Roman" w:hAnsi="Times New Roman"/>
+                <w:b w:val="false"/>
+                <w:bCs w:val="false"/>
+                <w:sz w:val="20"/>
+                <w:szCs w:val="20"/>
+              </w:rPr>
+              <w:t xml:space="preserve">10.67%</w:t>
+            </w:r>
+          </w:p>
+        </w:tc>
+        <w:tc>
+          <w:tcPr>
+            <w:tcW w:type="dxa" w:w="2160"/>
+            <w:tcBorders>
+              <w:top w:val="single" w:color="000000" w:sz="4"/>
+              <w:left w:val="single" w:color="000000" w:sz="4"/>
+              <w:bottom w:val="single" w:color="000000" w:sz="4"/>
+              <w:right w:val="single" w:color="000000" w:sz="4"/>
+            </w:tcBorders>
+            <w:shd w:fill="FFFFFF" w:val="clear"/>
+            <w:tcMar>
+              <w:top w:type="dxa" w:w="60"/>
+              <w:left w:type="dxa" w:w="100"/>
+              <w:bottom w:type="dxa" w:w="60"/>
+              <w:right w:type="dxa" w:w="100"/>
+            </w:tcMar>
+            <w:vAlign w:val="center"/>
+          </w:tcPr>
+          <w:p>
+            <w:pPr>
+              <w:spacing w:after="0" w:before="0" w:line="240" w:lineRule="auto"/>
+              <w:jc w:val="center"/>
+            </w:pPr>
+            <w:r>
+              <w:rPr>
+                <w:rFonts w:ascii="Times New Roman" w:cs="Times New Roman" w:eastAsia="Times New Roman" w:hAnsi="Times New Roman"/>
+                <w:b w:val="false"/>
+                <w:bCs w:val="false"/>
+                <w:sz w:val="20"/>
+                <w:szCs w:val="20"/>
+              </w:rPr>
+              <w:t xml:space="preserve">6.7%</w:t>
+            </w:r>
+          </w:p>
+        </w:tc>
+      </w:tr>
+      <w:tr>
+        <w:tc>
+          <w:tcPr>
+            <w:tcW w:type="dxa" w:w="3240"/>
+            <w:tcBorders>
+              <w:top w:val="single" w:color="000000" w:sz="4"/>
+              <w:left w:val="single" w:color="000000" w:sz="4"/>
+              <w:bottom w:val="single" w:color="000000" w:sz="4"/>
+              <w:right w:val="single" w:color="000000" w:sz="4"/>
+            </w:tcBorders>
+            <w:shd w:fill="FFFFFF" w:val="clear"/>
+            <w:tcMar>
+              <w:top w:type="dxa" w:w="60"/>
+              <w:left w:type="dxa" w:w="100"/>
+              <w:bottom w:type="dxa" w:w="60"/>
+              <w:right w:type="dxa" w:w="100"/>
+            </w:tcMar>
+            <w:vAlign w:val="center"/>
+          </w:tcPr>
+          <w:p>
+            <w:pPr>
+              <w:spacing w:after="0" w:before="0" w:line="240" w:lineRule="auto"/>
+              <w:jc w:val="left"/>
+            </w:pPr>
+            <w:r>
+              <w:rPr>
+                <w:rFonts w:ascii="Times New Roman" w:cs="Times New Roman" w:eastAsia="Times New Roman" w:hAnsi="Times New Roman"/>
+                <w:b w:val="false"/>
+                <w:bCs w:val="false"/>
+                <w:sz w:val="20"/>
+                <w:szCs w:val="20"/>
+              </w:rPr>
+              <w:t xml:space="preserve">Qualitative Integrity</w:t>
+            </w:r>
+          </w:p>
+        </w:tc>
+        <w:tc>
+          <w:tcPr>
+            <w:tcW w:type="dxa" w:w="2160"/>
+            <w:tcBorders>
+              <w:top w:val="single" w:color="000000" w:sz="4"/>
+              <w:left w:val="single" w:color="000000" w:sz="4"/>
+              <w:bottom w:val="single" w:color="000000" w:sz="4"/>
+              <w:right w:val="single" w:color="000000" w:sz="4"/>
+            </w:tcBorders>
+            <w:shd w:fill="FFFFFF" w:val="clear"/>
+            <w:tcMar>
+              <w:top w:type="dxa" w:w="60"/>
+              <w:left w:type="dxa" w:w="100"/>
+              <w:bottom w:type="dxa" w:w="60"/>
+              <w:right w:type="dxa" w:w="100"/>
+            </w:tcMar>
+            <w:vAlign w:val="center"/>
+          </w:tcPr>
+          <w:p>
+            <w:pPr>
+              <w:spacing w:after="0" w:before="0" w:line="240" w:lineRule="auto"/>
+              <w:jc w:val="center"/>
+            </w:pPr>
+            <w:r>
+              <w:rPr>
+                <w:rFonts w:ascii="Times New Roman" w:cs="Times New Roman" w:eastAsia="Times New Roman" w:hAnsi="Times New Roman"/>
+                <w:b w:val="false"/>
+                <w:bCs w:val="false"/>
+                <w:sz w:val="20"/>
+                <w:szCs w:val="20"/>
+              </w:rPr>
+              <w:t xml:space="preserve">Near Perfect (interview)</w:t>
+            </w:r>
+          </w:p>
+        </w:tc>
+        <w:tc>
+          <w:tcPr>
+            <w:tcW w:type="dxa" w:w="2160"/>
+            <w:tcBorders>
+              <w:top w:val="single" w:color="000000" w:sz="4"/>
+              <w:left w:val="single" w:color="000000" w:sz="4"/>
+              <w:bottom w:val="single" w:color="000000" w:sz="4"/>
+              <w:right w:val="single" w:color="000000" w:sz="4"/>
+            </w:tcBorders>
+            <w:shd w:fill="FFFFFF" w:val="clear"/>
+            <w:tcMar>
+              <w:top w:type="dxa" w:w="60"/>
+              <w:left w:type="dxa" w:w="100"/>
+              <w:bottom w:type="dxa" w:w="60"/>
+              <w:right w:type="dxa" w:w="100"/>
+            </w:tcMar>
+            <w:vAlign w:val="center"/>
+          </w:tcPr>
+          <w:p>
+            <w:pPr>
+              <w:spacing w:after="0" w:before="0" w:line="240" w:lineRule="auto"/>
+              <w:jc w:val="center"/>
+            </w:pPr>
+            <w:r>
+              <w:rPr>
+                <w:rFonts w:ascii="Times New Roman" w:cs="Times New Roman" w:eastAsia="Times New Roman" w:hAnsi="Times New Roman"/>
+                <w:b w:val="false"/>
+                <w:bCs w:val="false"/>
+                <w:sz w:val="20"/>
+                <w:szCs w:val="20"/>
+              </w:rPr>
+              <w:t xml:space="preserve">Near Perfect (interview)</w:t>
+            </w:r>
+          </w:p>
+        </w:tc>
+        <w:tc>
+          <w:tcPr>
+            <w:tcW w:type="dxa" w:w="2160"/>
+            <w:tcBorders>
+              <w:top w:val="single" w:color="000000" w:sz="4"/>
+              <w:left w:val="single" w:color="000000" w:sz="4"/>
+              <w:bottom w:val="single" w:color="000000" w:sz="4"/>
+              <w:right w:val="single" w:color="000000" w:sz="4"/>
+            </w:tcBorders>
+            <w:shd w:fill="FFFFFF" w:val="clear"/>
+            <w:tcMar>
+              <w:top w:type="dxa" w:w="60"/>
+              <w:left w:type="dxa" w:w="100"/>
+              <w:bottom w:type="dxa" w:w="60"/>
+              <w:right w:type="dxa" w:w="100"/>
+            </w:tcMar>
+            <w:vAlign w:val="center"/>
+          </w:tcPr>
+          <w:p>
+            <w:pPr>
+              <w:spacing w:after="0" w:before="0" w:line="240" w:lineRule="auto"/>
+              <w:jc w:val="center"/>
+            </w:pPr>
+            <w:r>
+              <w:rPr>
+                <w:rFonts w:ascii="Times New Roman" w:cs="Times New Roman" w:eastAsia="Times New Roman" w:hAnsi="Times New Roman"/>
+                <w:b w:val="false"/>
+                <w:bCs w:val="false"/>
+                <w:sz w:val="20"/>
+                <w:szCs w:val="20"/>
+              </w:rPr>
+              <w:t xml:space="preserve">Avg. Mean: 2.72 (Neutral)</w:t>
+            </w:r>
+          </w:p>
+        </w:tc>
+      </w:tr>
+    </w:tbl>
+    <w:p>
+      <w:pPr>
+        <w:spacing w:after="0" w:before="0" w:line="480" w:lineRule="auto"/>
+      </w:pPr>
+    </w:p>
+    <w:p>
+      <w:pPr>
+        <w:spacing w:after="0" w:before="0" w:line="480" w:lineRule="auto"/>
+      </w:pPr>
+    </w:p>
+    <w:p>
+      <w:pPr>
+        <w:spacing w:after="0" w:before="0" w:line="480" w:lineRule="auto"/>
+        <w:jc w:val="center"/>
+      </w:pPr>
+      <w:r>
+        <w:rPr>
+          <w:rFonts w:ascii="Times New Roman" w:cs="Times New Roman" w:eastAsia="Times New Roman" w:hAnsi="Times New Roman"/>
+          <w:b/>
+          <w:bCs/>
+          <w:sz w:val="24"/>
+          <w:szCs w:val="24"/>
+        </w:rPr>
+        <w:t xml:space="preserve">Table 3.10c. Comparison – Batch 3 (Trials 7–9, 15 Leaves per Cycle, Post-Corrective Action)</w:t>
+      </w:r>
+    </w:p>
+    <w:p>
+      <w:pPr>
+        <w:spacing w:after="0" w:before="0" w:line="480" w:lineRule="auto"/>
+      </w:pPr>
+    </w:p>
+    <w:tbl>
+      <w:tblPr>
+        <w:tblW w:type="dxa" w:w="9720"/>
+        <w:tblBorders>
+          <w:top w:val="single" w:color="auto" w:sz="4"/>
+          <w:left w:val="single" w:color="auto" w:sz="4"/>
+          <w:bottom w:val="single" w:color="auto" w:sz="4"/>
+          <w:right w:val="single" w:color="auto" w:sz="4"/>
+          <w:insideH w:val="single" w:color="auto" w:sz="4"/>
+          <w:insideV w:val="single" w:color="auto" w:sz="4"/>
+        </w:tblBorders>
+      </w:tblPr>
+      <w:tblGrid>
+        <w:gridCol w:w="3240"/>
+        <w:gridCol w:w="2160"/>
+        <w:gridCol w:w="2160"/>
+        <w:gridCol w:w="2160"/>
+      </w:tblGrid>
+      <w:tr>
+        <w:tc>
+          <w:tcPr>
+            <w:tcW w:type="dxa" w:w="3240"/>
+            <w:tcBorders>
+              <w:top w:val="single" w:color="000000" w:sz="4"/>
+              <w:left w:val="single" w:color="000000" w:sz="4"/>
+              <w:bottom w:val="single" w:color="000000" w:sz="4"/>
+              <w:right w:val="single" w:color="000000" w:sz="4"/>
+            </w:tcBorders>
+            <w:shd w:fill="FFFFFF" w:val="clear"/>
+            <w:tcMar>
+              <w:top w:type="dxa" w:w="60"/>
+              <w:left w:type="dxa" w:w="100"/>
+              <w:bottom w:type="dxa" w:w="60"/>
+              <w:right w:type="dxa" w:w="100"/>
+            </w:tcMar>
+            <w:vAlign w:val="center"/>
+          </w:tcPr>
+          <w:p>
+            <w:pPr>
+              <w:spacing w:after="0" w:before="0" w:line="240" w:lineRule="auto"/>
+              <w:jc w:val="left"/>
+            </w:pPr>
+            <w:r>
+              <w:rPr>
+                <w:rFonts w:ascii="Times New Roman" w:cs="Times New Roman" w:eastAsia="Times New Roman" w:hAnsi="Times New Roman"/>
+                <w:b/>
+                <w:bCs/>
+                <w:sz w:val="20"/>
+                <w:szCs w:val="20"/>
+              </w:rPr>
+              <w:t xml:space="preserve">Indicator</w:t>
+            </w:r>
+          </w:p>
+        </w:tc>
+        <w:tc>
+          <w:tcPr>
+            <w:tcW w:type="dxa" w:w="2160"/>
+            <w:tcBorders>
+              <w:top w:val="single" w:color="000000" w:sz="4"/>
+              <w:left w:val="single" w:color="000000" w:sz="4"/>
+              <w:bottom w:val="single" w:color="000000" w:sz="4"/>
+              <w:right w:val="single" w:color="000000" w:sz="4"/>
+            </w:tcBorders>
+            <w:shd w:fill="FFFFFF" w:val="clear"/>
+            <w:tcMar>
+              <w:top w:type="dxa" w:w="60"/>
+              <w:left w:type="dxa" w:w="100"/>
+              <w:bottom w:type="dxa" w:w="60"/>
+              <w:right w:type="dxa" w:w="100"/>
+            </w:tcMar>
+            <w:vAlign w:val="center"/>
+          </w:tcPr>
+          <w:p>
+            <w:pPr>
+              <w:spacing w:after="0" w:before="0" w:line="240" w:lineRule="auto"/>
+              <w:jc w:val="center"/>
+            </w:pPr>
+            <w:r>
+              <w:rPr>
+                <w:rFonts w:ascii="Times New Roman" w:cs="Times New Roman" w:eastAsia="Times New Roman" w:hAnsi="Times New Roman"/>
+                <w:b/>
+                <w:bCs/>
+                <w:sz w:val="20"/>
+                <w:szCs w:val="20"/>
+              </w:rPr>
+              <w:t xml:space="preserve">Traditional (Veteran)</w:t>
+            </w:r>
+          </w:p>
+        </w:tc>
+        <w:tc>
+          <w:tcPr>
+            <w:tcW w:type="dxa" w:w="2160"/>
+            <w:tcBorders>
+              <w:top w:val="single" w:color="000000" w:sz="4"/>
+              <w:left w:val="single" w:color="000000" w:sz="4"/>
+              <w:bottom w:val="single" w:color="000000" w:sz="4"/>
+              <w:right w:val="single" w:color="000000" w:sz="4"/>
+            </w:tcBorders>
+            <w:shd w:fill="FFFFFF" w:val="clear"/>
+            <w:tcMar>
+              <w:top w:type="dxa" w:w="60"/>
+              <w:left w:type="dxa" w:w="100"/>
+              <w:bottom w:type="dxa" w:w="60"/>
+              <w:right w:type="dxa" w:w="100"/>
+            </w:tcMar>
+            <w:vAlign w:val="center"/>
+          </w:tcPr>
+          <w:p>
+            <w:pPr>
+              <w:spacing w:after="0" w:before="0" w:line="240" w:lineRule="auto"/>
+              <w:jc w:val="center"/>
+            </w:pPr>
+            <w:r>
+              <w:rPr>
+                <w:rFonts w:ascii="Times New Roman" w:cs="Times New Roman" w:eastAsia="Times New Roman" w:hAnsi="Times New Roman"/>
+                <w:b/>
+                <w:bCs/>
+                <w:sz w:val="20"/>
+                <w:szCs w:val="20"/>
+              </w:rPr>
+              <w:t xml:space="preserve">Traditional (Beginner)</w:t>
+            </w:r>
+          </w:p>
+        </w:tc>
+        <w:tc>
+          <w:tcPr>
+            <w:tcW w:type="dxa" w:w="2160"/>
+            <w:tcBorders>
+              <w:top w:val="single" w:color="000000" w:sz="4"/>
+              <w:left w:val="single" w:color="000000" w:sz="4"/>
+              <w:bottom w:val="single" w:color="000000" w:sz="4"/>
+              <w:right w:val="single" w:color="000000" w:sz="4"/>
+            </w:tcBorders>
+            <w:shd w:fill="FFFFFF" w:val="clear"/>
+            <w:tcMar>
+              <w:top w:type="dxa" w:w="60"/>
+              <w:left w:type="dxa" w:w="100"/>
+              <w:bottom w:type="dxa" w:w="60"/>
+              <w:right w:type="dxa" w:w="100"/>
+            </w:tcMar>
+            <w:vAlign w:val="center"/>
+          </w:tcPr>
+          <w:p>
+            <w:pPr>
+              <w:spacing w:after="0" w:before="0" w:line="240" w:lineRule="auto"/>
+              <w:jc w:val="center"/>
+            </w:pPr>
+            <w:r>
+              <w:rPr>
+                <w:rFonts w:ascii="Times New Roman" w:cs="Times New Roman" w:eastAsia="Times New Roman" w:hAnsi="Times New Roman"/>
+                <w:b/>
+                <w:bCs/>
+                <w:sz w:val="20"/>
+                <w:szCs w:val="20"/>
+              </w:rPr>
+              <w:t xml:space="preserve">Semi-Automated Machine</w:t>
+            </w:r>
+          </w:p>
+        </w:tc>
+      </w:tr>
+      <w:tr>
+        <w:tc>
+          <w:tcPr>
+            <w:tcW w:type="dxa" w:w="3240"/>
+            <w:tcBorders>
+              <w:top w:val="single" w:color="000000" w:sz="4"/>
+              <w:left w:val="single" w:color="000000" w:sz="4"/>
+              <w:bottom w:val="single" w:color="000000" w:sz="4"/>
+              <w:right w:val="single" w:color="000000" w:sz="4"/>
+            </w:tcBorders>
+            <w:shd w:fill="FFFFFF" w:val="clear"/>
+            <w:tcMar>
+              <w:top w:type="dxa" w:w="60"/>
+              <w:left w:type="dxa" w:w="100"/>
+              <w:bottom w:type="dxa" w:w="60"/>
+              <w:right w:type="dxa" w:w="100"/>
+            </w:tcMar>
+            <w:vAlign w:val="center"/>
+          </w:tcPr>
+          <w:p>
+            <w:pPr>
+              <w:spacing w:after="0" w:before="0" w:line="240" w:lineRule="auto"/>
+              <w:jc w:val="left"/>
+            </w:pPr>
+            <w:r>
+              <w:rPr>
+                <w:rFonts w:ascii="Times New Roman" w:cs="Times New Roman" w:eastAsia="Times New Roman" w:hAnsi="Times New Roman"/>
+                <w:b w:val="false"/>
+                <w:bCs w:val="false"/>
+                <w:sz w:val="20"/>
+                <w:szCs w:val="20"/>
+              </w:rPr>
+              <w:t xml:space="preserve">Leaves per cycle</w:t>
+            </w:r>
+          </w:p>
+        </w:tc>
+        <w:tc>
+          <w:tcPr>
+            <w:tcW w:type="dxa" w:w="2160"/>
+            <w:tcBorders>
+              <w:top w:val="single" w:color="000000" w:sz="4"/>
+              <w:left w:val="single" w:color="000000" w:sz="4"/>
+              <w:bottom w:val="single" w:color="000000" w:sz="4"/>
+              <w:right w:val="single" w:color="000000" w:sz="4"/>
+            </w:tcBorders>
+            <w:shd w:fill="FFFFFF" w:val="clear"/>
+            <w:tcMar>
+              <w:top w:type="dxa" w:w="60"/>
+              <w:left w:type="dxa" w:w="100"/>
+              <w:bottom w:type="dxa" w:w="60"/>
+              <w:right w:type="dxa" w:w="100"/>
+            </w:tcMar>
+            <w:vAlign w:val="center"/>
+          </w:tcPr>
+          <w:p>
+            <w:pPr>
+              <w:spacing w:after="0" w:before="0" w:line="240" w:lineRule="auto"/>
+              <w:jc w:val="center"/>
+            </w:pPr>
+            <w:r>
+              <w:rPr>
+                <w:rFonts w:ascii="Times New Roman" w:cs="Times New Roman" w:eastAsia="Times New Roman" w:hAnsi="Times New Roman"/>
+                <w:b w:val="false"/>
+                <w:bCs w:val="false"/>
+                <w:sz w:val="20"/>
+                <w:szCs w:val="20"/>
+              </w:rPr>
+              <w:t xml:space="preserve">25</w:t>
+            </w:r>
+          </w:p>
+        </w:tc>
+        <w:tc>
+          <w:tcPr>
+            <w:tcW w:type="dxa" w:w="2160"/>
+            <w:tcBorders>
+              <w:top w:val="single" w:color="000000" w:sz="4"/>
+              <w:left w:val="single" w:color="000000" w:sz="4"/>
+              <w:bottom w:val="single" w:color="000000" w:sz="4"/>
+              <w:right w:val="single" w:color="000000" w:sz="4"/>
+            </w:tcBorders>
+            <w:shd w:fill="FFFFFF" w:val="clear"/>
+            <w:tcMar>
+              <w:top w:type="dxa" w:w="60"/>
+              <w:left w:type="dxa" w:w="100"/>
+              <w:bottom w:type="dxa" w:w="60"/>
+              <w:right w:type="dxa" w:w="100"/>
+            </w:tcMar>
+            <w:vAlign w:val="center"/>
+          </w:tcPr>
+          <w:p>
+            <w:pPr>
+              <w:spacing w:after="0" w:before="0" w:line="240" w:lineRule="auto"/>
+              <w:jc w:val="center"/>
+            </w:pPr>
+            <w:r>
+              <w:rPr>
+                <w:rFonts w:ascii="Times New Roman" w:cs="Times New Roman" w:eastAsia="Times New Roman" w:hAnsi="Times New Roman"/>
+                <w:b w:val="false"/>
+                <w:bCs w:val="false"/>
+                <w:sz w:val="20"/>
+                <w:szCs w:val="20"/>
+              </w:rPr>
+              <w:t xml:space="preserve">25</w:t>
+            </w:r>
+          </w:p>
+        </w:tc>
+        <w:tc>
+          <w:tcPr>
+            <w:tcW w:type="dxa" w:w="2160"/>
+            <w:tcBorders>
+              <w:top w:val="single" w:color="000000" w:sz="4"/>
+              <w:left w:val="single" w:color="000000" w:sz="4"/>
+              <w:bottom w:val="single" w:color="000000" w:sz="4"/>
+              <w:right w:val="single" w:color="000000" w:sz="4"/>
+            </w:tcBorders>
+            <w:shd w:fill="FFFFFF" w:val="clear"/>
+            <w:tcMar>
+              <w:top w:type="dxa" w:w="60"/>
+              <w:left w:type="dxa" w:w="100"/>
+              <w:bottom w:type="dxa" w:w="60"/>
+              <w:right w:type="dxa" w:w="100"/>
+            </w:tcMar>
+            <w:vAlign w:val="center"/>
+          </w:tcPr>
+          <w:p>
+            <w:pPr>
+              <w:spacing w:after="0" w:before="0" w:line="240" w:lineRule="auto"/>
+              <w:jc w:val="center"/>
+            </w:pPr>
+            <w:r>
+              <w:rPr>
+                <w:rFonts w:ascii="Times New Roman" w:cs="Times New Roman" w:eastAsia="Times New Roman" w:hAnsi="Times New Roman"/>
+                <w:b w:val="false"/>
+                <w:bCs w:val="false"/>
+                <w:sz w:val="20"/>
+                <w:szCs w:val="20"/>
+              </w:rPr>
+              <w:t xml:space="preserve">15</w:t>
+            </w:r>
+          </w:p>
+        </w:tc>
+      </w:tr>
+      <w:tr>
+        <w:tc>
+          <w:tcPr>
+            <w:tcW w:type="dxa" w:w="3240"/>
+            <w:tcBorders>
+              <w:top w:val="single" w:color="000000" w:sz="4"/>
+              <w:left w:val="single" w:color="000000" w:sz="4"/>
+              <w:bottom w:val="single" w:color="000000" w:sz="4"/>
+              <w:right w:val="single" w:color="000000" w:sz="4"/>
+            </w:tcBorders>
+            <w:shd w:fill="FFFFFF" w:val="clear"/>
+            <w:tcMar>
+              <w:top w:type="dxa" w:w="60"/>
+              <w:left w:type="dxa" w:w="100"/>
+              <w:bottom w:type="dxa" w:w="60"/>
+              <w:right w:type="dxa" w:w="100"/>
+            </w:tcMar>
+            <w:vAlign w:val="center"/>
+          </w:tcPr>
+          <w:p>
+            <w:pPr>
+              <w:spacing w:after="0" w:before="0" w:line="240" w:lineRule="auto"/>
+              <w:jc w:val="left"/>
+            </w:pPr>
+            <w:r>
+              <w:rPr>
+                <w:rFonts w:ascii="Times New Roman" w:cs="Times New Roman" w:eastAsia="Times New Roman" w:hAnsi="Times New Roman"/>
+                <w:b w:val="false"/>
+                <w:bCs w:val="false"/>
+                <w:sz w:val="20"/>
+                <w:szCs w:val="20"/>
+              </w:rPr>
+              <w:t xml:space="preserve">Avg. Cycle Time</w:t>
+            </w:r>
+          </w:p>
+        </w:tc>
+        <w:tc>
+          <w:tcPr>
+            <w:tcW w:type="dxa" w:w="2160"/>
+            <w:tcBorders>
+              <w:top w:val="single" w:color="000000" w:sz="4"/>
+              <w:left w:val="single" w:color="000000" w:sz="4"/>
+              <w:bottom w:val="single" w:color="000000" w:sz="4"/>
+              <w:right w:val="single" w:color="000000" w:sz="4"/>
+            </w:tcBorders>
+            <w:shd w:fill="FFFFFF" w:val="clear"/>
+            <w:tcMar>
+              <w:top w:type="dxa" w:w="60"/>
+              <w:left w:type="dxa" w:w="100"/>
+              <w:bottom w:type="dxa" w:w="60"/>
+              <w:right w:type="dxa" w:w="100"/>
+            </w:tcMar>
+            <w:vAlign w:val="center"/>
+          </w:tcPr>
+          <w:p>
+            <w:pPr>
+              <w:spacing w:after="0" w:before="0" w:line="240" w:lineRule="auto"/>
+              <w:jc w:val="center"/>
+            </w:pPr>
+            <w:r>
+              <w:rPr>
+                <w:rFonts w:ascii="Times New Roman" w:cs="Times New Roman" w:eastAsia="Times New Roman" w:hAnsi="Times New Roman"/>
+                <w:b w:val="false"/>
+                <w:bCs w:val="false"/>
+                <w:sz w:val="20"/>
+                <w:szCs w:val="20"/>
+              </w:rPr>
+              <w:t xml:space="preserve">204.33s (3:24)</w:t>
+            </w:r>
+          </w:p>
+        </w:tc>
+        <w:tc>
+          <w:tcPr>
+            <w:tcW w:type="dxa" w:w="2160"/>
+            <w:tcBorders>
+              <w:top w:val="single" w:color="000000" w:sz="4"/>
+              <w:left w:val="single" w:color="000000" w:sz="4"/>
+              <w:bottom w:val="single" w:color="000000" w:sz="4"/>
+              <w:right w:val="single" w:color="000000" w:sz="4"/>
+            </w:tcBorders>
+            <w:shd w:fill="FFFFFF" w:val="clear"/>
+            <w:tcMar>
+              <w:top w:type="dxa" w:w="60"/>
+              <w:left w:type="dxa" w:w="100"/>
+              <w:bottom w:type="dxa" w:w="60"/>
+              <w:right w:type="dxa" w:w="100"/>
+            </w:tcMar>
+            <w:vAlign w:val="center"/>
+          </w:tcPr>
+          <w:p>
+            <w:pPr>
+              <w:spacing w:after="0" w:before="0" w:line="240" w:lineRule="auto"/>
+              <w:jc w:val="center"/>
+            </w:pPr>
+            <w:r>
+              <w:rPr>
+                <w:rFonts w:ascii="Times New Roman" w:cs="Times New Roman" w:eastAsia="Times New Roman" w:hAnsi="Times New Roman"/>
+                <w:b w:val="false"/>
+                <w:bCs w:val="false"/>
+                <w:sz w:val="20"/>
+                <w:szCs w:val="20"/>
+              </w:rPr>
+              <w:t xml:space="preserve">315.33s (5:15)</w:t>
+            </w:r>
+          </w:p>
+        </w:tc>
+        <w:tc>
+          <w:tcPr>
+            <w:tcW w:type="dxa" w:w="2160"/>
+            <w:tcBorders>
+              <w:top w:val="single" w:color="000000" w:sz="4"/>
+              <w:left w:val="single" w:color="000000" w:sz="4"/>
+              <w:bottom w:val="single" w:color="000000" w:sz="4"/>
+              <w:right w:val="single" w:color="000000" w:sz="4"/>
+            </w:tcBorders>
+            <w:shd w:fill="FFFFFF" w:val="clear"/>
+            <w:tcMar>
+              <w:top w:type="dxa" w:w="60"/>
+              <w:left w:type="dxa" w:w="100"/>
+              <w:bottom w:type="dxa" w:w="60"/>
+              <w:right w:type="dxa" w:w="100"/>
+            </w:tcMar>
+            <w:vAlign w:val="center"/>
+          </w:tcPr>
+          <w:p>
+            <w:pPr>
+              <w:spacing w:after="0" w:before="0" w:line="240" w:lineRule="auto"/>
+              <w:jc w:val="center"/>
+            </w:pPr>
+            <w:r>
+              <w:rPr>
+                <w:rFonts w:ascii="Times New Roman" w:cs="Times New Roman" w:eastAsia="Times New Roman" w:hAnsi="Times New Roman"/>
+                <w:b w:val="false"/>
+                <w:bCs w:val="false"/>
+                <w:sz w:val="20"/>
+                <w:szCs w:val="20"/>
+              </w:rPr>
+              <w:t xml:space="preserve">53.66s</w:t>
+            </w:r>
+          </w:p>
+        </w:tc>
+      </w:tr>
+      <w:tr>
+        <w:tc>
+          <w:tcPr>
+            <w:tcW w:type="dxa" w:w="3240"/>
+            <w:tcBorders>
+              <w:top w:val="single" w:color="000000" w:sz="4"/>
+              <w:left w:val="single" w:color="000000" w:sz="4"/>
+              <w:bottom w:val="single" w:color="000000" w:sz="4"/>
+              <w:right w:val="single" w:color="000000" w:sz="4"/>
+            </w:tcBorders>
+            <w:shd w:fill="FFFFFF" w:val="clear"/>
+            <w:tcMar>
+              <w:top w:type="dxa" w:w="60"/>
+              <w:left w:type="dxa" w:w="100"/>
+              <w:bottom w:type="dxa" w:w="60"/>
+              <w:right w:type="dxa" w:w="100"/>
+            </w:tcMar>
+            <w:vAlign w:val="center"/>
+          </w:tcPr>
+          <w:p>
+            <w:pPr>
+              <w:spacing w:after="0" w:before="0" w:line="240" w:lineRule="auto"/>
+              <w:jc w:val="left"/>
+            </w:pPr>
+            <w:r>
+              <w:rPr>
+                <w:rFonts w:ascii="Times New Roman" w:cs="Times New Roman" w:eastAsia="Times New Roman" w:hAnsi="Times New Roman"/>
+                <w:b w:val="false"/>
+                <w:bCs w:val="false"/>
+                <w:sz w:val="20"/>
+                <w:szCs w:val="20"/>
+              </w:rPr>
+              <w:t xml:space="preserve">Cycles per hour</w:t>
+            </w:r>
+          </w:p>
+        </w:tc>
+        <w:tc>
+          <w:tcPr>
+            <w:tcW w:type="dxa" w:w="2160"/>
+            <w:tcBorders>
+              <w:top w:val="single" w:color="000000" w:sz="4"/>
+              <w:left w:val="single" w:color="000000" w:sz="4"/>
+              <w:bottom w:val="single" w:color="000000" w:sz="4"/>
+              <w:right w:val="single" w:color="000000" w:sz="4"/>
+            </w:tcBorders>
+            <w:shd w:fill="FFFFFF" w:val="clear"/>
+            <w:tcMar>
+              <w:top w:type="dxa" w:w="60"/>
+              <w:left w:type="dxa" w:w="100"/>
+              <w:bottom w:type="dxa" w:w="60"/>
+              <w:right w:type="dxa" w:w="100"/>
+            </w:tcMar>
+            <w:vAlign w:val="center"/>
+          </w:tcPr>
+          <w:p>
+            <w:pPr>
+              <w:spacing w:after="0" w:before="0" w:line="240" w:lineRule="auto"/>
+              <w:jc w:val="center"/>
+            </w:pPr>
+            <w:r>
+              <w:rPr>
+                <w:rFonts w:ascii="Times New Roman" w:cs="Times New Roman" w:eastAsia="Times New Roman" w:hAnsi="Times New Roman"/>
+                <w:b w:val="false"/>
+                <w:bCs w:val="false"/>
+                <w:sz w:val="20"/>
+                <w:szCs w:val="20"/>
+              </w:rPr>
+              <w:t xml:space="preserve">Approx. 18</w:t>
+            </w:r>
+          </w:p>
+        </w:tc>
+        <w:tc>
+          <w:tcPr>
+            <w:tcW w:type="dxa" w:w="2160"/>
+            <w:tcBorders>
+              <w:top w:val="single" w:color="000000" w:sz="4"/>
+              <w:left w:val="single" w:color="000000" w:sz="4"/>
+              <w:bottom w:val="single" w:color="000000" w:sz="4"/>
+              <w:right w:val="single" w:color="000000" w:sz="4"/>
+            </w:tcBorders>
+            <w:shd w:fill="FFFFFF" w:val="clear"/>
+            <w:tcMar>
+              <w:top w:type="dxa" w:w="60"/>
+              <w:left w:type="dxa" w:w="100"/>
+              <w:bottom w:type="dxa" w:w="60"/>
+              <w:right w:type="dxa" w:w="100"/>
+            </w:tcMar>
+            <w:vAlign w:val="center"/>
+          </w:tcPr>
+          <w:p>
+            <w:pPr>
+              <w:spacing w:after="0" w:before="0" w:line="240" w:lineRule="auto"/>
+              <w:jc w:val="center"/>
+            </w:pPr>
+            <w:r>
+              <w:rPr>
+                <w:rFonts w:ascii="Times New Roman" w:cs="Times New Roman" w:eastAsia="Times New Roman" w:hAnsi="Times New Roman"/>
+                <w:b w:val="false"/>
+                <w:bCs w:val="false"/>
+                <w:sz w:val="20"/>
+                <w:szCs w:val="20"/>
+              </w:rPr>
+              <w:t xml:space="preserve">Approx. 11</w:t>
+            </w:r>
+          </w:p>
+        </w:tc>
+        <w:tc>
+          <w:tcPr>
+            <w:tcW w:type="dxa" w:w="2160"/>
+            <w:tcBorders>
+              <w:top w:val="single" w:color="000000" w:sz="4"/>
+              <w:left w:val="single" w:color="000000" w:sz="4"/>
+              <w:bottom w:val="single" w:color="000000" w:sz="4"/>
+              <w:right w:val="single" w:color="000000" w:sz="4"/>
+            </w:tcBorders>
+            <w:shd w:fill="FFFFFF" w:val="clear"/>
+            <w:tcMar>
+              <w:top w:type="dxa" w:w="60"/>
+              <w:left w:type="dxa" w:w="100"/>
+              <w:bottom w:type="dxa" w:w="60"/>
+              <w:right w:type="dxa" w:w="100"/>
+            </w:tcMar>
+            <w:vAlign w:val="center"/>
+          </w:tcPr>
+          <w:p>
+            <w:pPr>
+              <w:spacing w:after="0" w:before="0" w:line="240" w:lineRule="auto"/>
+              <w:jc w:val="center"/>
+            </w:pPr>
+            <w:r>
+              <w:rPr>
+                <w:rFonts w:ascii="Times New Roman" w:cs="Times New Roman" w:eastAsia="Times New Roman" w:hAnsi="Times New Roman"/>
+                <w:b w:val="false"/>
+                <w:bCs w:val="false"/>
+                <w:sz w:val="20"/>
+                <w:szCs w:val="20"/>
+              </w:rPr>
+              <w:t xml:space="preserve">Approx. 67</w:t>
+            </w:r>
+          </w:p>
+        </w:tc>
+      </w:tr>
+      <w:tr>
+        <w:tc>
+          <w:tcPr>
+            <w:tcW w:type="dxa" w:w="3240"/>
+            <w:tcBorders>
+              <w:top w:val="single" w:color="000000" w:sz="4"/>
+              <w:left w:val="single" w:color="000000" w:sz="4"/>
+              <w:bottom w:val="single" w:color="000000" w:sz="4"/>
+              <w:right w:val="single" w:color="000000" w:sz="4"/>
+            </w:tcBorders>
+            <w:shd w:fill="FFFFFF" w:val="clear"/>
+            <w:tcMar>
+              <w:top w:type="dxa" w:w="60"/>
+              <w:left w:type="dxa" w:w="100"/>
+              <w:bottom w:type="dxa" w:w="60"/>
+              <w:right w:type="dxa" w:w="100"/>
+            </w:tcMar>
+            <w:vAlign w:val="center"/>
+          </w:tcPr>
+          <w:p>
+            <w:pPr>
+              <w:spacing w:after="0" w:before="0" w:line="240" w:lineRule="auto"/>
+              <w:jc w:val="left"/>
+            </w:pPr>
+            <w:r>
+              <w:rPr>
+                <w:rFonts w:ascii="Times New Roman" w:cs="Times New Roman" w:eastAsia="Times New Roman" w:hAnsi="Times New Roman"/>
+                <w:b w:val="false"/>
+                <w:bCs w:val="false"/>
+                <w:sz w:val="20"/>
+                <w:szCs w:val="20"/>
+              </w:rPr>
+              <w:t xml:space="preserve">Est. Output (Leaves/hr)</w:t>
+            </w:r>
+          </w:p>
+        </w:tc>
+        <w:tc>
+          <w:tcPr>
+            <w:tcW w:type="dxa" w:w="2160"/>
+            <w:tcBorders>
+              <w:top w:val="single" w:color="000000" w:sz="4"/>
+              <w:left w:val="single" w:color="000000" w:sz="4"/>
+              <w:bottom w:val="single" w:color="000000" w:sz="4"/>
+              <w:right w:val="single" w:color="000000" w:sz="4"/>
+            </w:tcBorders>
+            <w:shd w:fill="FFFFFF" w:val="clear"/>
+            <w:tcMar>
+              <w:top w:type="dxa" w:w="60"/>
+              <w:left w:type="dxa" w:w="100"/>
+              <w:bottom w:type="dxa" w:w="60"/>
+              <w:right w:type="dxa" w:w="100"/>
+            </w:tcMar>
+            <w:vAlign w:val="center"/>
+          </w:tcPr>
+          <w:p>
+            <w:pPr>
+              <w:spacing w:after="0" w:before="0" w:line="240" w:lineRule="auto"/>
+              <w:jc w:val="center"/>
+            </w:pPr>
+            <w:r>
+              <w:rPr>
+                <w:rFonts w:ascii="Times New Roman" w:cs="Times New Roman" w:eastAsia="Times New Roman" w:hAnsi="Times New Roman"/>
+                <w:b w:val="false"/>
+                <w:bCs w:val="false"/>
+                <w:sz w:val="20"/>
+                <w:szCs w:val="20"/>
+              </w:rPr>
+              <w:t xml:space="preserve">Approx. 440</w:t>
+            </w:r>
+          </w:p>
+        </w:tc>
+        <w:tc>
+          <w:tcPr>
+            <w:tcW w:type="dxa" w:w="2160"/>
+            <w:tcBorders>
+              <w:top w:val="single" w:color="000000" w:sz="4"/>
+              <w:left w:val="single" w:color="000000" w:sz="4"/>
+              <w:bottom w:val="single" w:color="000000" w:sz="4"/>
+              <w:right w:val="single" w:color="000000" w:sz="4"/>
+            </w:tcBorders>
+            <w:shd w:fill="FFFFFF" w:val="clear"/>
+            <w:tcMar>
+              <w:top w:type="dxa" w:w="60"/>
+              <w:left w:type="dxa" w:w="100"/>
+              <w:bottom w:type="dxa" w:w="60"/>
+              <w:right w:type="dxa" w:w="100"/>
+            </w:tcMar>
+            <w:vAlign w:val="center"/>
+          </w:tcPr>
+          <w:p>
+            <w:pPr>
+              <w:spacing w:after="0" w:before="0" w:line="240" w:lineRule="auto"/>
+              <w:jc w:val="center"/>
+            </w:pPr>
+            <w:r>
+              <w:rPr>
+                <w:rFonts w:ascii="Times New Roman" w:cs="Times New Roman" w:eastAsia="Times New Roman" w:hAnsi="Times New Roman"/>
+                <w:b w:val="false"/>
+                <w:bCs w:val="false"/>
+                <w:sz w:val="20"/>
+                <w:szCs w:val="20"/>
+              </w:rPr>
+              <w:t xml:space="preserve">Approx. 285</w:t>
+            </w:r>
+          </w:p>
+        </w:tc>
+        <w:tc>
+          <w:tcPr>
+            <w:tcW w:type="dxa" w:w="2160"/>
+            <w:tcBorders>
+              <w:top w:val="single" w:color="000000" w:sz="4"/>
+              <w:left w:val="single" w:color="000000" w:sz="4"/>
+              <w:bottom w:val="single" w:color="000000" w:sz="4"/>
+              <w:right w:val="single" w:color="000000" w:sz="4"/>
+            </w:tcBorders>
+            <w:shd w:fill="FFFFFF" w:val="clear"/>
+            <w:tcMar>
+              <w:top w:type="dxa" w:w="60"/>
+              <w:left w:type="dxa" w:w="100"/>
+              <w:bottom w:type="dxa" w:w="60"/>
+              <w:right w:type="dxa" w:w="100"/>
+            </w:tcMar>
+            <w:vAlign w:val="center"/>
+          </w:tcPr>
+          <w:p>
+            <w:pPr>
+              <w:spacing w:after="0" w:before="0" w:line="240" w:lineRule="auto"/>
+              <w:jc w:val="center"/>
+            </w:pPr>
+            <w:r>
+              <w:rPr>
+                <w:rFonts w:ascii="Times New Roman" w:cs="Times New Roman" w:eastAsia="Times New Roman" w:hAnsi="Times New Roman"/>
+                <w:b w:val="false"/>
+                <w:bCs w:val="false"/>
+                <w:sz w:val="20"/>
+                <w:szCs w:val="20"/>
+              </w:rPr>
+              <w:t xml:space="preserve">Approx. 853</w:t>
+            </w:r>
+          </w:p>
+        </w:tc>
+      </w:tr>
+      <w:tr>
+        <w:tc>
+          <w:tcPr>
+            <w:tcW w:type="dxa" w:w="3240"/>
+            <w:tcBorders>
+              <w:top w:val="single" w:color="000000" w:sz="4"/>
+              <w:left w:val="single" w:color="000000" w:sz="4"/>
+              <w:bottom w:val="single" w:color="000000" w:sz="4"/>
+              <w:right w:val="single" w:color="000000" w:sz="4"/>
+            </w:tcBorders>
+            <w:shd w:fill="FFFFFF" w:val="clear"/>
+            <w:tcMar>
+              <w:top w:type="dxa" w:w="60"/>
+              <w:left w:type="dxa" w:w="100"/>
+              <w:bottom w:type="dxa" w:w="60"/>
+              <w:right w:type="dxa" w:w="100"/>
+            </w:tcMar>
+            <w:vAlign w:val="center"/>
+          </w:tcPr>
+          <w:p>
+            <w:pPr>
+              <w:spacing w:after="0" w:before="0" w:line="240" w:lineRule="auto"/>
+              <w:jc w:val="left"/>
+            </w:pPr>
+            <w:r>
+              <w:rPr>
+                <w:rFonts w:ascii="Times New Roman" w:cs="Times New Roman" w:eastAsia="Times New Roman" w:hAnsi="Times New Roman"/>
+                <w:b w:val="false"/>
+                <w:bCs w:val="false"/>
+                <w:sz w:val="20"/>
+                <w:szCs w:val="20"/>
+              </w:rPr>
+              <w:t xml:space="preserve">Avg. Failure Rate %</w:t>
+            </w:r>
+          </w:p>
+        </w:tc>
+        <w:tc>
+          <w:tcPr>
+            <w:tcW w:type="dxa" w:w="2160"/>
+            <w:tcBorders>
+              <w:top w:val="single" w:color="000000" w:sz="4"/>
+              <w:left w:val="single" w:color="000000" w:sz="4"/>
+              <w:bottom w:val="single" w:color="000000" w:sz="4"/>
+              <w:right w:val="single" w:color="000000" w:sz="4"/>
+            </w:tcBorders>
+            <w:shd w:fill="FFFFFF" w:val="clear"/>
+            <w:tcMar>
+              <w:top w:type="dxa" w:w="60"/>
+              <w:left w:type="dxa" w:w="100"/>
+              <w:bottom w:type="dxa" w:w="60"/>
+              <w:right w:type="dxa" w:w="100"/>
+            </w:tcMar>
+            <w:vAlign w:val="center"/>
+          </w:tcPr>
+          <w:p>
+            <w:pPr>
+              <w:spacing w:after="0" w:before="0" w:line="240" w:lineRule="auto"/>
+              <w:jc w:val="center"/>
+            </w:pPr>
+            <w:r>
+              <w:rPr>
+                <w:rFonts w:ascii="Times New Roman" w:cs="Times New Roman" w:eastAsia="Times New Roman" w:hAnsi="Times New Roman"/>
+                <w:b w:val="false"/>
+                <w:bCs w:val="false"/>
+                <w:sz w:val="20"/>
+                <w:szCs w:val="20"/>
+              </w:rPr>
+              <w:t xml:space="preserve">1.33%</w:t>
+            </w:r>
+          </w:p>
+        </w:tc>
+        <w:tc>
+          <w:tcPr>
+            <w:tcW w:type="dxa" w:w="2160"/>
+            <w:tcBorders>
+              <w:top w:val="single" w:color="000000" w:sz="4"/>
+              <w:left w:val="single" w:color="000000" w:sz="4"/>
+              <w:bottom w:val="single" w:color="000000" w:sz="4"/>
+              <w:right w:val="single" w:color="000000" w:sz="4"/>
+            </w:tcBorders>
+            <w:shd w:fill="FFFFFF" w:val="clear"/>
+            <w:tcMar>
+              <w:top w:type="dxa" w:w="60"/>
+              <w:left w:type="dxa" w:w="100"/>
+              <w:bottom w:type="dxa" w:w="60"/>
+              <w:right w:type="dxa" w:w="100"/>
+            </w:tcMar>
+            <w:vAlign w:val="center"/>
+          </w:tcPr>
+          <w:p>
+            <w:pPr>
+              <w:spacing w:after="0" w:before="0" w:line="240" w:lineRule="auto"/>
+              <w:jc w:val="center"/>
+            </w:pPr>
+            <w:r>
+              <w:rPr>
+                <w:rFonts w:ascii="Times New Roman" w:cs="Times New Roman" w:eastAsia="Times New Roman" w:hAnsi="Times New Roman"/>
+                <w:b w:val="false"/>
+                <w:bCs w:val="false"/>
+                <w:sz w:val="20"/>
+                <w:szCs w:val="20"/>
+              </w:rPr>
+              <w:t xml:space="preserve">10.67%</w:t>
+            </w:r>
+          </w:p>
+        </w:tc>
+        <w:tc>
+          <w:tcPr>
+            <w:tcW w:type="dxa" w:w="2160"/>
+            <w:tcBorders>
+              <w:top w:val="single" w:color="000000" w:sz="4"/>
+              <w:left w:val="single" w:color="000000" w:sz="4"/>
+              <w:bottom w:val="single" w:color="000000" w:sz="4"/>
+              <w:right w:val="single" w:color="000000" w:sz="4"/>
+            </w:tcBorders>
+            <w:shd w:fill="FFFFFF" w:val="clear"/>
+            <w:tcMar>
+              <w:top w:type="dxa" w:w="60"/>
+              <w:left w:type="dxa" w:w="100"/>
+              <w:bottom w:type="dxa" w:w="60"/>
+              <w:right w:type="dxa" w:w="100"/>
+            </w:tcMar>
+            <w:vAlign w:val="center"/>
+          </w:tcPr>
+          <w:p>
+            <w:pPr>
+              <w:spacing w:after="0" w:before="0" w:line="240" w:lineRule="auto"/>
+              <w:jc w:val="center"/>
+            </w:pPr>
+            <w:r>
+              <w:rPr>
+                <w:rFonts w:ascii="Times New Roman" w:cs="Times New Roman" w:eastAsia="Times New Roman" w:hAnsi="Times New Roman"/>
+                <w:b w:val="false"/>
+                <w:bCs w:val="false"/>
+                <w:sz w:val="20"/>
+                <w:szCs w:val="20"/>
+              </w:rPr>
+              <w:t xml:space="preserve">15.5%</w:t>
+            </w:r>
+          </w:p>
+        </w:tc>
+      </w:tr>
+      <w:tr>
+        <w:tc>
+          <w:tcPr>
+            <w:tcW w:type="dxa" w:w="3240"/>
+            <w:tcBorders>
+              <w:top w:val="single" w:color="000000" w:sz="4"/>
+              <w:left w:val="single" w:color="000000" w:sz="4"/>
+              <w:bottom w:val="single" w:color="000000" w:sz="4"/>
+              <w:right w:val="single" w:color="000000" w:sz="4"/>
+            </w:tcBorders>
+            <w:shd w:fill="FFFFFF" w:val="clear"/>
+            <w:tcMar>
+              <w:top w:type="dxa" w:w="60"/>
+              <w:left w:type="dxa" w:w="100"/>
+              <w:bottom w:type="dxa" w:w="60"/>
+              <w:right w:type="dxa" w:w="100"/>
+            </w:tcMar>
+            <w:vAlign w:val="center"/>
+          </w:tcPr>
+          <w:p>
+            <w:pPr>
+              <w:spacing w:after="0" w:before="0" w:line="240" w:lineRule="auto"/>
+              <w:jc w:val="left"/>
+            </w:pPr>
+            <w:r>
+              <w:rPr>
+                <w:rFonts w:ascii="Times New Roman" w:cs="Times New Roman" w:eastAsia="Times New Roman" w:hAnsi="Times New Roman"/>
+                <w:b w:val="false"/>
+                <w:bCs w:val="false"/>
+                <w:sz w:val="20"/>
+                <w:szCs w:val="20"/>
+              </w:rPr>
+              <w:t xml:space="preserve">Avg. Damaged Leaves/cycle</w:t>
+            </w:r>
+          </w:p>
+        </w:tc>
+        <w:tc>
+          <w:tcPr>
+            <w:tcW w:type="dxa" w:w="2160"/>
+            <w:tcBorders>
+              <w:top w:val="single" w:color="000000" w:sz="4"/>
+              <w:left w:val="single" w:color="000000" w:sz="4"/>
+              <w:bottom w:val="single" w:color="000000" w:sz="4"/>
+              <w:right w:val="single" w:color="000000" w:sz="4"/>
+            </w:tcBorders>
+            <w:shd w:fill="FFFFFF" w:val="clear"/>
+            <w:tcMar>
+              <w:top w:type="dxa" w:w="60"/>
+              <w:left w:type="dxa" w:w="100"/>
+              <w:bottom w:type="dxa" w:w="60"/>
+              <w:right w:type="dxa" w:w="100"/>
+            </w:tcMar>
+            <w:vAlign w:val="center"/>
+          </w:tcPr>
+          <w:p>
+            <w:pPr>
+              <w:spacing w:after="0" w:before="0" w:line="240" w:lineRule="auto"/>
+              <w:jc w:val="center"/>
+            </w:pPr>
+            <w:r>
+              <w:rPr>
+                <w:rFonts w:ascii="Times New Roman" w:cs="Times New Roman" w:eastAsia="Times New Roman" w:hAnsi="Times New Roman"/>
+                <w:b w:val="false"/>
+                <w:bCs w:val="false"/>
+                <w:sz w:val="20"/>
+                <w:szCs w:val="20"/>
+              </w:rPr>
+              <w:t xml:space="preserve">0</w:t>
+            </w:r>
+          </w:p>
+        </w:tc>
+        <w:tc>
+          <w:tcPr>
+            <w:tcW w:type="dxa" w:w="2160"/>
+            <w:tcBorders>
+              <w:top w:val="single" w:color="000000" w:sz="4"/>
+              <w:left w:val="single" w:color="000000" w:sz="4"/>
+              <w:bottom w:val="single" w:color="000000" w:sz="4"/>
+              <w:right w:val="single" w:color="000000" w:sz="4"/>
+            </w:tcBorders>
+            <w:shd w:fill="FFFFFF" w:val="clear"/>
+            <w:tcMar>
+              <w:top w:type="dxa" w:w="60"/>
+              <w:left w:type="dxa" w:w="100"/>
+              <w:bottom w:type="dxa" w:w="60"/>
+              <w:right w:type="dxa" w:w="100"/>
+            </w:tcMar>
+            <w:vAlign w:val="center"/>
+          </w:tcPr>
+          <w:p>
+            <w:pPr>
+              <w:spacing w:after="0" w:before="0" w:line="240" w:lineRule="auto"/>
+              <w:jc w:val="center"/>
+            </w:pPr>
+            <w:r>
+              <w:rPr>
+                <w:rFonts w:ascii="Times New Roman" w:cs="Times New Roman" w:eastAsia="Times New Roman" w:hAnsi="Times New Roman"/>
+                <w:b w:val="false"/>
+                <w:bCs w:val="false"/>
+                <w:sz w:val="20"/>
+                <w:szCs w:val="20"/>
+              </w:rPr>
+              <w:t xml:space="preserve">2.67</w:t>
+            </w:r>
+          </w:p>
+        </w:tc>
+        <w:tc>
+          <w:tcPr>
+            <w:tcW w:type="dxa" w:w="2160"/>
+            <w:tcBorders>
+              <w:top w:val="single" w:color="000000" w:sz="4"/>
+              <w:left w:val="single" w:color="000000" w:sz="4"/>
+              <w:bottom w:val="single" w:color="000000" w:sz="4"/>
+              <w:right w:val="single" w:color="000000" w:sz="4"/>
+            </w:tcBorders>
+            <w:shd w:fill="FFFFFF" w:val="clear"/>
+            <w:tcMar>
+              <w:top w:type="dxa" w:w="60"/>
+              <w:left w:type="dxa" w:w="100"/>
+              <w:bottom w:type="dxa" w:w="60"/>
+              <w:right w:type="dxa" w:w="100"/>
+            </w:tcMar>
+            <w:vAlign w:val="center"/>
+          </w:tcPr>
+          <w:p>
+            <w:pPr>
+              <w:spacing w:after="0" w:before="0" w:line="240" w:lineRule="auto"/>
+              <w:jc w:val="center"/>
+            </w:pPr>
+            <w:r>
+              <w:rPr>
+                <w:rFonts w:ascii="Times New Roman" w:cs="Times New Roman" w:eastAsia="Times New Roman" w:hAnsi="Times New Roman"/>
+                <w:b w:val="false"/>
+                <w:bCs w:val="false"/>
+                <w:sz w:val="20"/>
+                <w:szCs w:val="20"/>
+              </w:rPr>
+              <w:t xml:space="preserve">1.33</w:t>
+            </w:r>
+          </w:p>
+        </w:tc>
+      </w:tr>
+      <w:tr>
+        <w:tc>
+          <w:tcPr>
+            <w:tcW w:type="dxa" w:w="3240"/>
+            <w:tcBorders>
+              <w:top w:val="single" w:color="000000" w:sz="4"/>
+              <w:left w:val="single" w:color="000000" w:sz="4"/>
+              <w:bottom w:val="single" w:color="000000" w:sz="4"/>
+              <w:right w:val="single" w:color="000000" w:sz="4"/>
+            </w:tcBorders>
+            <w:shd w:fill="FFFFFF" w:val="clear"/>
+            <w:tcMar>
+              <w:top w:type="dxa" w:w="60"/>
+              <w:left w:type="dxa" w:w="100"/>
+              <w:bottom w:type="dxa" w:w="60"/>
+              <w:right w:type="dxa" w:w="100"/>
+            </w:tcMar>
+            <w:vAlign w:val="center"/>
+          </w:tcPr>
+          <w:p>
+            <w:pPr>
+              <w:spacing w:after="0" w:before="0" w:line="240" w:lineRule="auto"/>
+              <w:jc w:val="left"/>
+            </w:pPr>
+            <w:r>
+              <w:rPr>
+                <w:rFonts w:ascii="Times New Roman" w:cs="Times New Roman" w:eastAsia="Times New Roman" w:hAnsi="Times New Roman"/>
+                <w:b w:val="false"/>
+                <w:bCs w:val="false"/>
+                <w:sz w:val="20"/>
+                <w:szCs w:val="20"/>
+              </w:rPr>
+              <w:t xml:space="preserve">Damage Rate</w:t>
+            </w:r>
+          </w:p>
+        </w:tc>
+        <w:tc>
+          <w:tcPr>
+            <w:tcW w:type="dxa" w:w="2160"/>
+            <w:tcBorders>
+              <w:top w:val="single" w:color="000000" w:sz="4"/>
+              <w:left w:val="single" w:color="000000" w:sz="4"/>
+              <w:bottom w:val="single" w:color="000000" w:sz="4"/>
+              <w:right w:val="single" w:color="000000" w:sz="4"/>
+            </w:tcBorders>
+            <w:shd w:fill="FFFFFF" w:val="clear"/>
+            <w:tcMar>
+              <w:top w:type="dxa" w:w="60"/>
+              <w:left w:type="dxa" w:w="100"/>
+              <w:bottom w:type="dxa" w:w="60"/>
+              <w:right w:type="dxa" w:w="100"/>
+            </w:tcMar>
+            <w:vAlign w:val="center"/>
+          </w:tcPr>
+          <w:p>
+            <w:pPr>
+              <w:spacing w:after="0" w:before="0" w:line="240" w:lineRule="auto"/>
+              <w:jc w:val="center"/>
+            </w:pPr>
+            <w:r>
+              <w:rPr>
+                <w:rFonts w:ascii="Times New Roman" w:cs="Times New Roman" w:eastAsia="Times New Roman" w:hAnsi="Times New Roman"/>
+                <w:b w:val="false"/>
+                <w:bCs w:val="false"/>
+                <w:sz w:val="20"/>
+                <w:szCs w:val="20"/>
+              </w:rPr>
+              <w:t xml:space="preserve">0%</w:t>
+            </w:r>
+          </w:p>
+        </w:tc>
+        <w:tc>
+          <w:tcPr>
+            <w:tcW w:type="dxa" w:w="2160"/>
+            <w:tcBorders>
+              <w:top w:val="single" w:color="000000" w:sz="4"/>
+              <w:left w:val="single" w:color="000000" w:sz="4"/>
+              <w:bottom w:val="single" w:color="000000" w:sz="4"/>
+              <w:right w:val="single" w:color="000000" w:sz="4"/>
+            </w:tcBorders>
+            <w:shd w:fill="FFFFFF" w:val="clear"/>
+            <w:tcMar>
+              <w:top w:type="dxa" w:w="60"/>
+              <w:left w:type="dxa" w:w="100"/>
+              <w:bottom w:type="dxa" w:w="60"/>
+              <w:right w:type="dxa" w:w="100"/>
+            </w:tcMar>
+            <w:vAlign w:val="center"/>
+          </w:tcPr>
+          <w:p>
+            <w:pPr>
+              <w:spacing w:after="0" w:before="0" w:line="240" w:lineRule="auto"/>
+              <w:jc w:val="center"/>
+            </w:pPr>
+            <w:r>
+              <w:rPr>
+                <w:rFonts w:ascii="Times New Roman" w:cs="Times New Roman" w:eastAsia="Times New Roman" w:hAnsi="Times New Roman"/>
+                <w:b w:val="false"/>
+                <w:bCs w:val="false"/>
+                <w:sz w:val="20"/>
+                <w:szCs w:val="20"/>
+              </w:rPr>
+              <w:t xml:space="preserve">10.67%</w:t>
+            </w:r>
+          </w:p>
+        </w:tc>
+        <w:tc>
+          <w:tcPr>
+            <w:tcW w:type="dxa" w:w="2160"/>
+            <w:tcBorders>
+              <w:top w:val="single" w:color="000000" w:sz="4"/>
+              <w:left w:val="single" w:color="000000" w:sz="4"/>
+              <w:bottom w:val="single" w:color="000000" w:sz="4"/>
+              <w:right w:val="single" w:color="000000" w:sz="4"/>
+            </w:tcBorders>
+            <w:shd w:fill="FFFFFF" w:val="clear"/>
+            <w:tcMar>
+              <w:top w:type="dxa" w:w="60"/>
+              <w:left w:type="dxa" w:w="100"/>
+              <w:bottom w:type="dxa" w:w="60"/>
+              <w:right w:type="dxa" w:w="100"/>
+            </w:tcMar>
+            <w:vAlign w:val="center"/>
+          </w:tcPr>
+          <w:p>
+            <w:pPr>
+              <w:spacing w:after="0" w:before="0" w:line="240" w:lineRule="auto"/>
+              <w:jc w:val="center"/>
+            </w:pPr>
+            <w:r>
+              <w:rPr>
+                <w:rFonts w:ascii="Times New Roman" w:cs="Times New Roman" w:eastAsia="Times New Roman" w:hAnsi="Times New Roman"/>
+                <w:b w:val="false"/>
+                <w:bCs w:val="false"/>
+                <w:sz w:val="20"/>
+                <w:szCs w:val="20"/>
+              </w:rPr>
+              <w:t xml:space="preserve">8.9%</w:t>
+            </w:r>
+          </w:p>
+        </w:tc>
+      </w:tr>
+      <w:tr>
+        <w:tc>
+          <w:tcPr>
+            <w:tcW w:type="dxa" w:w="3240"/>
+            <w:tcBorders>
+              <w:top w:val="single" w:color="000000" w:sz="4"/>
+              <w:left w:val="single" w:color="000000" w:sz="4"/>
+              <w:bottom w:val="single" w:color="000000" w:sz="4"/>
+              <w:right w:val="single" w:color="000000" w:sz="4"/>
+            </w:tcBorders>
+            <w:shd w:fill="FFFFFF" w:val="clear"/>
+            <w:tcMar>
+              <w:top w:type="dxa" w:w="60"/>
+              <w:left w:type="dxa" w:w="100"/>
+              <w:bottom w:type="dxa" w:w="60"/>
+              <w:right w:type="dxa" w:w="100"/>
+            </w:tcMar>
+            <w:vAlign w:val="center"/>
+          </w:tcPr>
+          <w:p>
+            <w:pPr>
+              <w:spacing w:after="0" w:before="0" w:line="240" w:lineRule="auto"/>
+              <w:jc w:val="left"/>
+            </w:pPr>
+            <w:r>
+              <w:rPr>
+                <w:rFonts w:ascii="Times New Roman" w:cs="Times New Roman" w:eastAsia="Times New Roman" w:hAnsi="Times New Roman"/>
+                <w:b w:val="false"/>
+                <w:bCs w:val="false"/>
+                <w:sz w:val="20"/>
+                <w:szCs w:val="20"/>
+              </w:rPr>
+              <w:t xml:space="preserve">Qualitative Integrity</w:t>
+            </w:r>
+          </w:p>
+        </w:tc>
+        <w:tc>
+          <w:tcPr>
+            <w:tcW w:type="dxa" w:w="2160"/>
+            <w:tcBorders>
+              <w:top w:val="single" w:color="000000" w:sz="4"/>
+              <w:left w:val="single" w:color="000000" w:sz="4"/>
+              <w:bottom w:val="single" w:color="000000" w:sz="4"/>
+              <w:right w:val="single" w:color="000000" w:sz="4"/>
+            </w:tcBorders>
+            <w:shd w:fill="FFFFFF" w:val="clear"/>
+            <w:tcMar>
+              <w:top w:type="dxa" w:w="60"/>
+              <w:left w:type="dxa" w:w="100"/>
+              <w:bottom w:type="dxa" w:w="60"/>
+              <w:right w:type="dxa" w:w="100"/>
+            </w:tcMar>
+            <w:vAlign w:val="center"/>
+          </w:tcPr>
+          <w:p>
+            <w:pPr>
+              <w:spacing w:after="0" w:before="0" w:line="240" w:lineRule="auto"/>
+              <w:jc w:val="center"/>
+            </w:pPr>
+            <w:r>
+              <w:rPr>
+                <w:rFonts w:ascii="Times New Roman" w:cs="Times New Roman" w:eastAsia="Times New Roman" w:hAnsi="Times New Roman"/>
+                <w:b w:val="false"/>
+                <w:bCs w:val="false"/>
+                <w:sz w:val="20"/>
+                <w:szCs w:val="20"/>
+              </w:rPr>
+              <w:t xml:space="preserve">Near Perfect (interview)</w:t>
+            </w:r>
+          </w:p>
+        </w:tc>
+        <w:tc>
+          <w:tcPr>
+            <w:tcW w:type="dxa" w:w="2160"/>
+            <w:tcBorders>
+              <w:top w:val="single" w:color="000000" w:sz="4"/>
+              <w:left w:val="single" w:color="000000" w:sz="4"/>
+              <w:bottom w:val="single" w:color="000000" w:sz="4"/>
+              <w:right w:val="single" w:color="000000" w:sz="4"/>
+            </w:tcBorders>
+            <w:shd w:fill="FFFFFF" w:val="clear"/>
+            <w:tcMar>
+              <w:top w:type="dxa" w:w="60"/>
+              <w:left w:type="dxa" w:w="100"/>
+              <w:bottom w:type="dxa" w:w="60"/>
+              <w:right w:type="dxa" w:w="100"/>
+            </w:tcMar>
+            <w:vAlign w:val="center"/>
+          </w:tcPr>
+          <w:p>
+            <w:pPr>
+              <w:spacing w:after="0" w:before="0" w:line="240" w:lineRule="auto"/>
+              <w:jc w:val="center"/>
+            </w:pPr>
+            <w:r>
+              <w:rPr>
+                <w:rFonts w:ascii="Times New Roman" w:cs="Times New Roman" w:eastAsia="Times New Roman" w:hAnsi="Times New Roman"/>
+                <w:b w:val="false"/>
+                <w:bCs w:val="false"/>
+                <w:sz w:val="20"/>
+                <w:szCs w:val="20"/>
+              </w:rPr>
+              <w:t xml:space="preserve">Near Perfect (interview)</w:t>
+            </w:r>
+          </w:p>
+        </w:tc>
+        <w:tc>
+          <w:tcPr>
+            <w:tcW w:type="dxa" w:w="2160"/>
+            <w:tcBorders>
+              <w:top w:val="single" w:color="000000" w:sz="4"/>
+              <w:left w:val="single" w:color="000000" w:sz="4"/>
+              <w:bottom w:val="single" w:color="000000" w:sz="4"/>
+              <w:right w:val="single" w:color="000000" w:sz="4"/>
+            </w:tcBorders>
+            <w:shd w:fill="FFFFFF" w:val="clear"/>
+            <w:tcMar>
+              <w:top w:type="dxa" w:w="60"/>
+              <w:left w:type="dxa" w:w="100"/>
+              <w:bottom w:type="dxa" w:w="60"/>
+              <w:right w:type="dxa" w:w="100"/>
+            </w:tcMar>
+            <w:vAlign w:val="center"/>
+          </w:tcPr>
+          <w:p>
+            <w:pPr>
+              <w:spacing w:after="0" w:before="0" w:line="240" w:lineRule="auto"/>
+              <w:jc w:val="center"/>
+            </w:pPr>
+            <w:r>
+              <w:rPr>
+                <w:rFonts w:ascii="Times New Roman" w:cs="Times New Roman" w:eastAsia="Times New Roman" w:hAnsi="Times New Roman"/>
+                <w:b w:val="false"/>
+                <w:bCs w:val="false"/>
+                <w:sz w:val="20"/>
+                <w:szCs w:val="20"/>
+              </w:rPr>
+              <w:t xml:space="preserve">Avg. Mean: 2.11 (Agree)</w:t>
+            </w:r>
+          </w:p>
+        </w:tc>
+      </w:tr>
+    </w:tbl>
+    <w:p>
+      <w:pPr>
+        <w:spacing w:after="0" w:before="0" w:line="480" w:lineRule="auto"/>
+      </w:pPr>
     </w:p>
     <w:p>
       <w:pPr>
@@ -28356,7 +30996,7 @@
           <w:sz w:val="24"/>
           <w:szCs w:val="24"/>
         </w:rPr>
-        <w:t xml:space="preserve">As presented in Table 3.10, the comparative analysis of production output and cycle time is organized according to the three-batch evaluation structure adopted in this study, allowing for a more granular assessment of the machine’s performance progression relative to the traditional skewering method. For reference, the veteran skewer completed a 25-leaf bundle in an average of 204.33 seconds (approximately 3 minutes and 24 seconds), achieving approximately 18 cycles per hour and a production rate of approximately 440 leaves per hour. The beginner skewer required an average of 315.33 seconds (approximately 5 minutes and 15 seconds) per cycle, completing approximately 11 cycles per hour and yielding a production rate of approximately 285 leaves per hour. These figures serve as the comparative baseline across all three batches.</w:t>
+        <w:t xml:space="preserve">As presented in Tables 3.10a, 3.10b, and 3.10c, the comparative analysis of production output and cycle time is organized according to the three-batch evaluation structure adopted in this study, allowing for a more granular assessment of the machine’s performance progression relative to the traditional skewering method. For reference, the veteran skewer completed a 25-leaf bundle in an average of 204.33 seconds (approximately 3 minutes and 24 seconds), achieving approximately 18 cycles per hour and a production rate of approximately 440 leaves per hour. The beginner skewer required an average of 315.33 seconds (approximately 5 minutes and 15 seconds) per cycle, completing approximately 11 cycles per hour and yielding a production rate of approximately 285 leaves per hour. These figures serve as the comparative baseline across all three batches.</w:t>
       </w:r>
     </w:p>
     <w:p>
@@ -28610,6 +31250,961 @@
     <w:p>
       <w:pPr>
         <w:spacing w:after="0" w:before="0" w:line="480" w:lineRule="auto"/>
+        <w:jc w:val="center"/>
+      </w:pPr>
+      <w:r>
+        <w:rPr>
+          <w:rFonts w:ascii="Times New Roman" w:cs="Times New Roman" w:eastAsia="Times New Roman" w:hAnsi="Times New Roman"/>
+          <w:b/>
+          <w:bCs/>
+          <w:sz w:val="24"/>
+          <w:szCs w:val="24"/>
+        </w:rPr>
+        <w:t xml:space="preserve">Table 3.11. Qualitative Integrity Comparison by Batch vs. Traditional Method</w:t>
+      </w:r>
+    </w:p>
+    <w:p>
+      <w:pPr>
+        <w:spacing w:after="0" w:before="0" w:line="480" w:lineRule="auto"/>
+      </w:pPr>
+    </w:p>
+    <w:tbl>
+      <w:tblPr>
+        <w:tblW w:type="dxa" w:w="9720"/>
+        <w:tblBorders>
+          <w:top w:val="single" w:color="auto" w:sz="4"/>
+          <w:left w:val="single" w:color="auto" w:sz="4"/>
+          <w:bottom w:val="single" w:color="auto" w:sz="4"/>
+          <w:right w:val="single" w:color="auto" w:sz="4"/>
+          <w:insideH w:val="single" w:color="auto" w:sz="4"/>
+          <w:insideV w:val="single" w:color="auto" w:sz="4"/>
+        </w:tblBorders>
+      </w:tblPr>
+      <w:tblGrid>
+        <w:gridCol w:w="2430"/>
+        <w:gridCol w:w="1620"/>
+        <w:gridCol w:w="1620"/>
+        <w:gridCol w:w="1620"/>
+        <w:gridCol w:w="2430"/>
+      </w:tblGrid>
+      <w:tr>
+        <w:tc>
+          <w:tcPr>
+            <w:tcW w:type="dxa" w:w="2430"/>
+            <w:tcBorders>
+              <w:top w:val="single" w:color="000000" w:sz="4"/>
+              <w:left w:val="single" w:color="000000" w:sz="4"/>
+              <w:bottom w:val="single" w:color="000000" w:sz="4"/>
+              <w:right w:val="single" w:color="000000" w:sz="4"/>
+            </w:tcBorders>
+            <w:shd w:fill="FFFFFF" w:val="clear"/>
+            <w:tcMar>
+              <w:top w:type="dxa" w:w="60"/>
+              <w:left w:type="dxa" w:w="100"/>
+              <w:bottom w:type="dxa" w:w="60"/>
+              <w:right w:type="dxa" w:w="100"/>
+            </w:tcMar>
+            <w:vAlign w:val="center"/>
+          </w:tcPr>
+          <w:p>
+            <w:pPr>
+              <w:spacing w:after="0" w:before="0" w:line="240" w:lineRule="auto"/>
+              <w:jc w:val="left"/>
+            </w:pPr>
+            <w:r>
+              <w:rPr>
+                <w:rFonts w:ascii="Times New Roman" w:cs="Times New Roman" w:eastAsia="Times New Roman" w:hAnsi="Times New Roman"/>
+                <w:b/>
+                <w:bCs/>
+                <w:sz w:val="20"/>
+                <w:szCs w:val="20"/>
+              </w:rPr>
+              <w:t xml:space="preserve">Criteria</w:t>
+            </w:r>
+          </w:p>
+        </w:tc>
+        <w:tc>
+          <w:tcPr>
+            <w:tcW w:type="dxa" w:w="1620"/>
+            <w:tcBorders>
+              <w:top w:val="single" w:color="000000" w:sz="4"/>
+              <w:left w:val="single" w:color="000000" w:sz="4"/>
+              <w:bottom w:val="single" w:color="000000" w:sz="4"/>
+              <w:right w:val="single" w:color="000000" w:sz="4"/>
+            </w:tcBorders>
+            <w:shd w:fill="FFFFFF" w:val="clear"/>
+            <w:tcMar>
+              <w:top w:type="dxa" w:w="60"/>
+              <w:left w:type="dxa" w:w="100"/>
+              <w:bottom w:type="dxa" w:w="60"/>
+              <w:right w:type="dxa" w:w="100"/>
+            </w:tcMar>
+            <w:vAlign w:val="center"/>
+          </w:tcPr>
+          <w:p>
+            <w:pPr>
+              <w:spacing w:after="0" w:before="0" w:line="240" w:lineRule="auto"/>
+              <w:jc w:val="center"/>
+            </w:pPr>
+            <w:r>
+              <w:rPr>
+                <w:rFonts w:ascii="Times New Roman" w:cs="Times New Roman" w:eastAsia="Times New Roman" w:hAnsi="Times New Roman"/>
+                <w:b/>
+                <w:bCs/>
+                <w:sz w:val="20"/>
+                <w:szCs w:val="20"/>
+              </w:rPr>
+              <w:t xml:space="preserve">Batch 1 Avg
+(T1–3)</w:t>
+            </w:r>
+          </w:p>
+        </w:tc>
+        <w:tc>
+          <w:tcPr>
+            <w:tcW w:type="dxa" w:w="1620"/>
+            <w:tcBorders>
+              <w:top w:val="single" w:color="000000" w:sz="4"/>
+              <w:left w:val="single" w:color="000000" w:sz="4"/>
+              <w:bottom w:val="single" w:color="000000" w:sz="4"/>
+              <w:right w:val="single" w:color="000000" w:sz="4"/>
+            </w:tcBorders>
+            <w:shd w:fill="FFFFFF" w:val="clear"/>
+            <w:tcMar>
+              <w:top w:type="dxa" w:w="60"/>
+              <w:left w:type="dxa" w:w="100"/>
+              <w:bottom w:type="dxa" w:w="60"/>
+              <w:right w:type="dxa" w:w="100"/>
+            </w:tcMar>
+            <w:vAlign w:val="center"/>
+          </w:tcPr>
+          <w:p>
+            <w:pPr>
+              <w:spacing w:after="0" w:before="0" w:line="240" w:lineRule="auto"/>
+              <w:jc w:val="center"/>
+            </w:pPr>
+            <w:r>
+              <w:rPr>
+                <w:rFonts w:ascii="Times New Roman" w:cs="Times New Roman" w:eastAsia="Times New Roman" w:hAnsi="Times New Roman"/>
+                <w:b/>
+                <w:bCs/>
+                <w:sz w:val="20"/>
+                <w:szCs w:val="20"/>
+              </w:rPr>
+              <w:t xml:space="preserve">Batch 2 Avg
+(T4–6)</w:t>
+            </w:r>
+          </w:p>
+        </w:tc>
+        <w:tc>
+          <w:tcPr>
+            <w:tcW w:type="dxa" w:w="1620"/>
+            <w:tcBorders>
+              <w:top w:val="single" w:color="000000" w:sz="4"/>
+              <w:left w:val="single" w:color="000000" w:sz="4"/>
+              <w:bottom w:val="single" w:color="000000" w:sz="4"/>
+              <w:right w:val="single" w:color="000000" w:sz="4"/>
+            </w:tcBorders>
+            <w:shd w:fill="FFFFFF" w:val="clear"/>
+            <w:tcMar>
+              <w:top w:type="dxa" w:w="60"/>
+              <w:left w:type="dxa" w:w="100"/>
+              <w:bottom w:type="dxa" w:w="60"/>
+              <w:right w:type="dxa" w:w="100"/>
+            </w:tcMar>
+            <w:vAlign w:val="center"/>
+          </w:tcPr>
+          <w:p>
+            <w:pPr>
+              <w:spacing w:after="0" w:before="0" w:line="240" w:lineRule="auto"/>
+              <w:jc w:val="center"/>
+            </w:pPr>
+            <w:r>
+              <w:rPr>
+                <w:rFonts w:ascii="Times New Roman" w:cs="Times New Roman" w:eastAsia="Times New Roman" w:hAnsi="Times New Roman"/>
+                <w:b/>
+                <w:bCs/>
+                <w:sz w:val="20"/>
+                <w:szCs w:val="20"/>
+              </w:rPr>
+              <w:t xml:space="preserve">Batch 3 Avg
+(T7–9)</w:t>
+            </w:r>
+          </w:p>
+        </w:tc>
+        <w:tc>
+          <w:tcPr>
+            <w:tcW w:type="dxa" w:w="2430"/>
+            <w:tcBorders>
+              <w:top w:val="single" w:color="000000" w:sz="4"/>
+              <w:left w:val="single" w:color="000000" w:sz="4"/>
+              <w:bottom w:val="single" w:color="000000" w:sz="4"/>
+              <w:right w:val="single" w:color="000000" w:sz="4"/>
+            </w:tcBorders>
+            <w:shd w:fill="FFFFFF" w:val="clear"/>
+            <w:tcMar>
+              <w:top w:type="dxa" w:w="60"/>
+              <w:left w:type="dxa" w:w="100"/>
+              <w:bottom w:type="dxa" w:w="60"/>
+              <w:right w:type="dxa" w:w="100"/>
+            </w:tcMar>
+            <w:vAlign w:val="center"/>
+          </w:tcPr>
+          <w:p>
+            <w:pPr>
+              <w:spacing w:after="0" w:before="0" w:line="240" w:lineRule="auto"/>
+              <w:jc w:val="center"/>
+            </w:pPr>
+            <w:r>
+              <w:rPr>
+                <w:rFonts w:ascii="Times New Roman" w:cs="Times New Roman" w:eastAsia="Times New Roman" w:hAnsi="Times New Roman"/>
+                <w:b/>
+                <w:bCs/>
+                <w:sz w:val="20"/>
+                <w:szCs w:val="20"/>
+              </w:rPr>
+              <w:t xml:space="preserve">Grand Mean</w:t>
+            </w:r>
+          </w:p>
+        </w:tc>
+      </w:tr>
+      <w:tr>
+        <w:tc>
+          <w:tcPr>
+            <w:tcW w:type="dxa" w:w="2430"/>
+            <w:tcBorders>
+              <w:top w:val="single" w:color="000000" w:sz="4"/>
+              <w:left w:val="single" w:color="000000" w:sz="4"/>
+              <w:bottom w:val="single" w:color="000000" w:sz="4"/>
+              <w:right w:val="single" w:color="000000" w:sz="4"/>
+            </w:tcBorders>
+            <w:shd w:fill="FFFFFF" w:val="clear"/>
+            <w:tcMar>
+              <w:top w:type="dxa" w:w="60"/>
+              <w:left w:type="dxa" w:w="100"/>
+              <w:bottom w:type="dxa" w:w="60"/>
+              <w:right w:type="dxa" w:w="100"/>
+            </w:tcMar>
+            <w:vAlign w:val="center"/>
+          </w:tcPr>
+          <w:p>
+            <w:pPr>
+              <w:spacing w:after="0" w:before="0" w:line="240" w:lineRule="auto"/>
+              <w:jc w:val="left"/>
+            </w:pPr>
+            <w:r>
+              <w:rPr>
+                <w:rFonts w:ascii="Times New Roman" w:cs="Times New Roman" w:eastAsia="Times New Roman" w:hAnsi="Times New Roman"/>
+                <w:b w:val="false"/>
+                <w:bCs w:val="false"/>
+                <w:sz w:val="20"/>
+                <w:szCs w:val="20"/>
+              </w:rPr>
+              <w:t xml:space="preserve">Alignment</w:t>
+            </w:r>
+          </w:p>
+        </w:tc>
+        <w:tc>
+          <w:tcPr>
+            <w:tcW w:type="dxa" w:w="1620"/>
+            <w:tcBorders>
+              <w:top w:val="single" w:color="000000" w:sz="4"/>
+              <w:left w:val="single" w:color="000000" w:sz="4"/>
+              <w:bottom w:val="single" w:color="000000" w:sz="4"/>
+              <w:right w:val="single" w:color="000000" w:sz="4"/>
+            </w:tcBorders>
+            <w:shd w:fill="FFFFFF" w:val="clear"/>
+            <w:tcMar>
+              <w:top w:type="dxa" w:w="60"/>
+              <w:left w:type="dxa" w:w="100"/>
+              <w:bottom w:type="dxa" w:w="60"/>
+              <w:right w:type="dxa" w:w="100"/>
+            </w:tcMar>
+            <w:vAlign w:val="center"/>
+          </w:tcPr>
+          <w:p>
+            <w:pPr>
+              <w:spacing w:after="0" w:before="0" w:line="240" w:lineRule="auto"/>
+              <w:jc w:val="center"/>
+            </w:pPr>
+            <w:r>
+              <w:rPr>
+                <w:rFonts w:ascii="Times New Roman" w:cs="Times New Roman" w:eastAsia="Times New Roman" w:hAnsi="Times New Roman"/>
+                <w:b w:val="false"/>
+                <w:bCs w:val="false"/>
+                <w:sz w:val="20"/>
+                <w:szCs w:val="20"/>
+              </w:rPr>
+              <w:t xml:space="preserve">2.88
+(Neutral)</w:t>
+            </w:r>
+          </w:p>
+        </w:tc>
+        <w:tc>
+          <w:tcPr>
+            <w:tcW w:type="dxa" w:w="1620"/>
+            <w:tcBorders>
+              <w:top w:val="single" w:color="000000" w:sz="4"/>
+              <w:left w:val="single" w:color="000000" w:sz="4"/>
+              <w:bottom w:val="single" w:color="000000" w:sz="4"/>
+              <w:right w:val="single" w:color="000000" w:sz="4"/>
+            </w:tcBorders>
+            <w:shd w:fill="FFFFFF" w:val="clear"/>
+            <w:tcMar>
+              <w:top w:type="dxa" w:w="60"/>
+              <w:left w:type="dxa" w:w="100"/>
+              <w:bottom w:type="dxa" w:w="60"/>
+              <w:right w:type="dxa" w:w="100"/>
+            </w:tcMar>
+            <w:vAlign w:val="center"/>
+          </w:tcPr>
+          <w:p>
+            <w:pPr>
+              <w:spacing w:after="0" w:before="0" w:line="240" w:lineRule="auto"/>
+              <w:jc w:val="center"/>
+            </w:pPr>
+            <w:r>
+              <w:rPr>
+                <w:rFonts w:ascii="Times New Roman" w:cs="Times New Roman" w:eastAsia="Times New Roman" w:hAnsi="Times New Roman"/>
+                <w:b w:val="false"/>
+                <w:bCs w:val="false"/>
+                <w:sz w:val="20"/>
+                <w:szCs w:val="20"/>
+              </w:rPr>
+              <w:t xml:space="preserve">2.65
+(Neutral)</w:t>
+            </w:r>
+          </w:p>
+        </w:tc>
+        <w:tc>
+          <w:tcPr>
+            <w:tcW w:type="dxa" w:w="1620"/>
+            <w:tcBorders>
+              <w:top w:val="single" w:color="000000" w:sz="4"/>
+              <w:left w:val="single" w:color="000000" w:sz="4"/>
+              <w:bottom w:val="single" w:color="000000" w:sz="4"/>
+              <w:right w:val="single" w:color="000000" w:sz="4"/>
+            </w:tcBorders>
+            <w:shd w:fill="FFFFFF" w:val="clear"/>
+            <w:tcMar>
+              <w:top w:type="dxa" w:w="60"/>
+              <w:left w:type="dxa" w:w="100"/>
+              <w:bottom w:type="dxa" w:w="60"/>
+              <w:right w:type="dxa" w:w="100"/>
+            </w:tcMar>
+            <w:vAlign w:val="center"/>
+          </w:tcPr>
+          <w:p>
+            <w:pPr>
+              <w:spacing w:after="0" w:before="0" w:line="240" w:lineRule="auto"/>
+              <w:jc w:val="center"/>
+            </w:pPr>
+            <w:r>
+              <w:rPr>
+                <w:rFonts w:ascii="Times New Roman" w:cs="Times New Roman" w:eastAsia="Times New Roman" w:hAnsi="Times New Roman"/>
+                <w:b w:val="false"/>
+                <w:bCs w:val="false"/>
+                <w:sz w:val="20"/>
+                <w:szCs w:val="20"/>
+              </w:rPr>
+              <w:t xml:space="preserve">2.10
+(Agree)</w:t>
+            </w:r>
+          </w:p>
+        </w:tc>
+        <w:tc>
+          <w:tcPr>
+            <w:tcW w:type="dxa" w:w="2430"/>
+            <w:tcBorders>
+              <w:top w:val="single" w:color="000000" w:sz="4"/>
+              <w:left w:val="single" w:color="000000" w:sz="4"/>
+              <w:bottom w:val="single" w:color="000000" w:sz="4"/>
+              <w:right w:val="single" w:color="000000" w:sz="4"/>
+            </w:tcBorders>
+            <w:shd w:fill="FFFFFF" w:val="clear"/>
+            <w:tcMar>
+              <w:top w:type="dxa" w:w="60"/>
+              <w:left w:type="dxa" w:w="100"/>
+              <w:bottom w:type="dxa" w:w="60"/>
+              <w:right w:type="dxa" w:w="100"/>
+            </w:tcMar>
+            <w:vAlign w:val="center"/>
+          </w:tcPr>
+          <w:p>
+            <w:pPr>
+              <w:spacing w:after="0" w:before="0" w:line="240" w:lineRule="auto"/>
+              <w:jc w:val="center"/>
+            </w:pPr>
+            <w:r>
+              <w:rPr>
+                <w:rFonts w:ascii="Times New Roman" w:cs="Times New Roman" w:eastAsia="Times New Roman" w:hAnsi="Times New Roman"/>
+                <w:b w:val="false"/>
+                <w:bCs w:val="false"/>
+                <w:sz w:val="20"/>
+                <w:szCs w:val="20"/>
+              </w:rPr>
+              <w:t xml:space="preserve">2.55
+(Neutral)</w:t>
+            </w:r>
+          </w:p>
+        </w:tc>
+      </w:tr>
+      <w:tr>
+        <w:tc>
+          <w:tcPr>
+            <w:tcW w:type="dxa" w:w="2430"/>
+            <w:tcBorders>
+              <w:top w:val="single" w:color="000000" w:sz="4"/>
+              <w:left w:val="single" w:color="000000" w:sz="4"/>
+              <w:bottom w:val="single" w:color="000000" w:sz="4"/>
+              <w:right w:val="single" w:color="000000" w:sz="4"/>
+            </w:tcBorders>
+            <w:shd w:fill="FFFFFF" w:val="clear"/>
+            <w:tcMar>
+              <w:top w:type="dxa" w:w="60"/>
+              <w:left w:type="dxa" w:w="100"/>
+              <w:bottom w:type="dxa" w:w="60"/>
+              <w:right w:type="dxa" w:w="100"/>
+            </w:tcMar>
+            <w:vAlign w:val="center"/>
+          </w:tcPr>
+          <w:p>
+            <w:pPr>
+              <w:spacing w:after="0" w:before="0" w:line="240" w:lineRule="auto"/>
+              <w:jc w:val="left"/>
+            </w:pPr>
+            <w:r>
+              <w:rPr>
+                <w:rFonts w:ascii="Times New Roman" w:cs="Times New Roman" w:eastAsia="Times New Roman" w:hAnsi="Times New Roman"/>
+                <w:b w:val="false"/>
+                <w:bCs w:val="false"/>
+                <w:sz w:val="20"/>
+                <w:szCs w:val="20"/>
+              </w:rPr>
+              <w:t xml:space="preserve">Attachment Security</w:t>
+            </w:r>
+          </w:p>
+        </w:tc>
+        <w:tc>
+          <w:tcPr>
+            <w:tcW w:type="dxa" w:w="1620"/>
+            <w:tcBorders>
+              <w:top w:val="single" w:color="000000" w:sz="4"/>
+              <w:left w:val="single" w:color="000000" w:sz="4"/>
+              <w:bottom w:val="single" w:color="000000" w:sz="4"/>
+              <w:right w:val="single" w:color="000000" w:sz="4"/>
+            </w:tcBorders>
+            <w:shd w:fill="FFFFFF" w:val="clear"/>
+            <w:tcMar>
+              <w:top w:type="dxa" w:w="60"/>
+              <w:left w:type="dxa" w:w="100"/>
+              <w:bottom w:type="dxa" w:w="60"/>
+              <w:right w:type="dxa" w:w="100"/>
+            </w:tcMar>
+            <w:vAlign w:val="center"/>
+          </w:tcPr>
+          <w:p>
+            <w:pPr>
+              <w:spacing w:after="0" w:before="0" w:line="240" w:lineRule="auto"/>
+              <w:jc w:val="center"/>
+            </w:pPr>
+            <w:r>
+              <w:rPr>
+                <w:rFonts w:ascii="Times New Roman" w:cs="Times New Roman" w:eastAsia="Times New Roman" w:hAnsi="Times New Roman"/>
+                <w:b w:val="false"/>
+                <w:bCs w:val="false"/>
+                <w:sz w:val="20"/>
+                <w:szCs w:val="20"/>
+              </w:rPr>
+              <w:t xml:space="preserve">2.57
+(Agree)</w:t>
+            </w:r>
+          </w:p>
+        </w:tc>
+        <w:tc>
+          <w:tcPr>
+            <w:tcW w:type="dxa" w:w="1620"/>
+            <w:tcBorders>
+              <w:top w:val="single" w:color="000000" w:sz="4"/>
+              <w:left w:val="single" w:color="000000" w:sz="4"/>
+              <w:bottom w:val="single" w:color="000000" w:sz="4"/>
+              <w:right w:val="single" w:color="000000" w:sz="4"/>
+            </w:tcBorders>
+            <w:shd w:fill="FFFFFF" w:val="clear"/>
+            <w:tcMar>
+              <w:top w:type="dxa" w:w="60"/>
+              <w:left w:type="dxa" w:w="100"/>
+              <w:bottom w:type="dxa" w:w="60"/>
+              <w:right w:type="dxa" w:w="100"/>
+            </w:tcMar>
+            <w:vAlign w:val="center"/>
+          </w:tcPr>
+          <w:p>
+            <w:pPr>
+              <w:spacing w:after="0" w:before="0" w:line="240" w:lineRule="auto"/>
+              <w:jc w:val="center"/>
+            </w:pPr>
+            <w:r>
+              <w:rPr>
+                <w:rFonts w:ascii="Times New Roman" w:cs="Times New Roman" w:eastAsia="Times New Roman" w:hAnsi="Times New Roman"/>
+                <w:b w:val="false"/>
+                <w:bCs w:val="false"/>
+                <w:sz w:val="20"/>
+                <w:szCs w:val="20"/>
+              </w:rPr>
+              <w:t xml:space="preserve">2.71
+(Neutral)</w:t>
+            </w:r>
+          </w:p>
+        </w:tc>
+        <w:tc>
+          <w:tcPr>
+            <w:tcW w:type="dxa" w:w="1620"/>
+            <w:tcBorders>
+              <w:top w:val="single" w:color="000000" w:sz="4"/>
+              <w:left w:val="single" w:color="000000" w:sz="4"/>
+              <w:bottom w:val="single" w:color="000000" w:sz="4"/>
+              <w:right w:val="single" w:color="000000" w:sz="4"/>
+            </w:tcBorders>
+            <w:shd w:fill="FFFFFF" w:val="clear"/>
+            <w:tcMar>
+              <w:top w:type="dxa" w:w="60"/>
+              <w:left w:type="dxa" w:w="100"/>
+              <w:bottom w:type="dxa" w:w="60"/>
+              <w:right w:type="dxa" w:w="100"/>
+            </w:tcMar>
+            <w:vAlign w:val="center"/>
+          </w:tcPr>
+          <w:p>
+            <w:pPr>
+              <w:spacing w:after="0" w:before="0" w:line="240" w:lineRule="auto"/>
+              <w:jc w:val="center"/>
+            </w:pPr>
+            <w:r>
+              <w:rPr>
+                <w:rFonts w:ascii="Times New Roman" w:cs="Times New Roman" w:eastAsia="Times New Roman" w:hAnsi="Times New Roman"/>
+                <w:b w:val="false"/>
+                <w:bCs w:val="false"/>
+                <w:sz w:val="20"/>
+                <w:szCs w:val="20"/>
+              </w:rPr>
+              <w:t xml:space="preserve">2.14
+(Agree)</w:t>
+            </w:r>
+          </w:p>
+        </w:tc>
+        <w:tc>
+          <w:tcPr>
+            <w:tcW w:type="dxa" w:w="2430"/>
+            <w:tcBorders>
+              <w:top w:val="single" w:color="000000" w:sz="4"/>
+              <w:left w:val="single" w:color="000000" w:sz="4"/>
+              <w:bottom w:val="single" w:color="000000" w:sz="4"/>
+              <w:right w:val="single" w:color="000000" w:sz="4"/>
+            </w:tcBorders>
+            <w:shd w:fill="FFFFFF" w:val="clear"/>
+            <w:tcMar>
+              <w:top w:type="dxa" w:w="60"/>
+              <w:left w:type="dxa" w:w="100"/>
+              <w:bottom w:type="dxa" w:w="60"/>
+              <w:right w:type="dxa" w:w="100"/>
+            </w:tcMar>
+            <w:vAlign w:val="center"/>
+          </w:tcPr>
+          <w:p>
+            <w:pPr>
+              <w:spacing w:after="0" w:before="0" w:line="240" w:lineRule="auto"/>
+              <w:jc w:val="center"/>
+            </w:pPr>
+            <w:r>
+              <w:rPr>
+                <w:rFonts w:ascii="Times New Roman" w:cs="Times New Roman" w:eastAsia="Times New Roman" w:hAnsi="Times New Roman"/>
+                <w:b w:val="false"/>
+                <w:bCs w:val="false"/>
+                <w:sz w:val="20"/>
+                <w:szCs w:val="20"/>
+              </w:rPr>
+              <w:t xml:space="preserve">2.47
+(Agree)</w:t>
+            </w:r>
+          </w:p>
+        </w:tc>
+      </w:tr>
+      <w:tr>
+        <w:tc>
+          <w:tcPr>
+            <w:tcW w:type="dxa" w:w="2430"/>
+            <w:tcBorders>
+              <w:top w:val="single" w:color="000000" w:sz="4"/>
+              <w:left w:val="single" w:color="000000" w:sz="4"/>
+              <w:bottom w:val="single" w:color="000000" w:sz="4"/>
+              <w:right w:val="single" w:color="000000" w:sz="4"/>
+            </w:tcBorders>
+            <w:shd w:fill="FFFFFF" w:val="clear"/>
+            <w:tcMar>
+              <w:top w:type="dxa" w:w="60"/>
+              <w:left w:type="dxa" w:w="100"/>
+              <w:bottom w:type="dxa" w:w="60"/>
+              <w:right w:type="dxa" w:w="100"/>
+            </w:tcMar>
+            <w:vAlign w:val="center"/>
+          </w:tcPr>
+          <w:p>
+            <w:pPr>
+              <w:spacing w:after="0" w:before="0" w:line="240" w:lineRule="auto"/>
+              <w:jc w:val="left"/>
+            </w:pPr>
+            <w:r>
+              <w:rPr>
+                <w:rFonts w:ascii="Times New Roman" w:cs="Times New Roman" w:eastAsia="Times New Roman" w:hAnsi="Times New Roman"/>
+                <w:b w:val="false"/>
+                <w:bCs w:val="false"/>
+                <w:sz w:val="20"/>
+                <w:szCs w:val="20"/>
+              </w:rPr>
+              <w:t xml:space="preserve">Minimized Leaf Damage</w:t>
+            </w:r>
+          </w:p>
+        </w:tc>
+        <w:tc>
+          <w:tcPr>
+            <w:tcW w:type="dxa" w:w="1620"/>
+            <w:tcBorders>
+              <w:top w:val="single" w:color="000000" w:sz="4"/>
+              <w:left w:val="single" w:color="000000" w:sz="4"/>
+              <w:bottom w:val="single" w:color="000000" w:sz="4"/>
+              <w:right w:val="single" w:color="000000" w:sz="4"/>
+            </w:tcBorders>
+            <w:shd w:fill="FFFFFF" w:val="clear"/>
+            <w:tcMar>
+              <w:top w:type="dxa" w:w="60"/>
+              <w:left w:type="dxa" w:w="100"/>
+              <w:bottom w:type="dxa" w:w="60"/>
+              <w:right w:type="dxa" w:w="100"/>
+            </w:tcMar>
+            <w:vAlign w:val="center"/>
+          </w:tcPr>
+          <w:p>
+            <w:pPr>
+              <w:spacing w:after="0" w:before="0" w:line="240" w:lineRule="auto"/>
+              <w:jc w:val="center"/>
+            </w:pPr>
+            <w:r>
+              <w:rPr>
+                <w:rFonts w:ascii="Times New Roman" w:cs="Times New Roman" w:eastAsia="Times New Roman" w:hAnsi="Times New Roman"/>
+                <w:b w:val="false"/>
+                <w:bCs w:val="false"/>
+                <w:sz w:val="20"/>
+                <w:szCs w:val="20"/>
+              </w:rPr>
+              <w:t xml:space="preserve">2.55
+(Agree)</w:t>
+            </w:r>
+          </w:p>
+        </w:tc>
+        <w:tc>
+          <w:tcPr>
+            <w:tcW w:type="dxa" w:w="1620"/>
+            <w:tcBorders>
+              <w:top w:val="single" w:color="000000" w:sz="4"/>
+              <w:left w:val="single" w:color="000000" w:sz="4"/>
+              <w:bottom w:val="single" w:color="000000" w:sz="4"/>
+              <w:right w:val="single" w:color="000000" w:sz="4"/>
+            </w:tcBorders>
+            <w:shd w:fill="FFFFFF" w:val="clear"/>
+            <w:tcMar>
+              <w:top w:type="dxa" w:w="60"/>
+              <w:left w:type="dxa" w:w="100"/>
+              <w:bottom w:type="dxa" w:w="60"/>
+              <w:right w:type="dxa" w:w="100"/>
+            </w:tcMar>
+            <w:vAlign w:val="center"/>
+          </w:tcPr>
+          <w:p>
+            <w:pPr>
+              <w:spacing w:after="0" w:before="0" w:line="240" w:lineRule="auto"/>
+              <w:jc w:val="center"/>
+            </w:pPr>
+            <w:r>
+              <w:rPr>
+                <w:rFonts w:ascii="Times New Roman" w:cs="Times New Roman" w:eastAsia="Times New Roman" w:hAnsi="Times New Roman"/>
+                <w:b w:val="false"/>
+                <w:bCs w:val="false"/>
+                <w:sz w:val="20"/>
+                <w:szCs w:val="20"/>
+              </w:rPr>
+              <w:t xml:space="preserve">2.62
+(Agree)</w:t>
+            </w:r>
+          </w:p>
+        </w:tc>
+        <w:tc>
+          <w:tcPr>
+            <w:tcW w:type="dxa" w:w="1620"/>
+            <w:tcBorders>
+              <w:top w:val="single" w:color="000000" w:sz="4"/>
+              <w:left w:val="single" w:color="000000" w:sz="4"/>
+              <w:bottom w:val="single" w:color="000000" w:sz="4"/>
+              <w:right w:val="single" w:color="000000" w:sz="4"/>
+            </w:tcBorders>
+            <w:shd w:fill="FFFFFF" w:val="clear"/>
+            <w:tcMar>
+              <w:top w:type="dxa" w:w="60"/>
+              <w:left w:type="dxa" w:w="100"/>
+              <w:bottom w:type="dxa" w:w="60"/>
+              <w:right w:type="dxa" w:w="100"/>
+            </w:tcMar>
+            <w:vAlign w:val="center"/>
+          </w:tcPr>
+          <w:p>
+            <w:pPr>
+              <w:spacing w:after="0" w:before="0" w:line="240" w:lineRule="auto"/>
+              <w:jc w:val="center"/>
+            </w:pPr>
+            <w:r>
+              <w:rPr>
+                <w:rFonts w:ascii="Times New Roman" w:cs="Times New Roman" w:eastAsia="Times New Roman" w:hAnsi="Times New Roman"/>
+                <w:b w:val="false"/>
+                <w:bCs w:val="false"/>
+                <w:sz w:val="20"/>
+                <w:szCs w:val="20"/>
+              </w:rPr>
+              <w:t xml:space="preserve">2.10
+(Agree)</w:t>
+            </w:r>
+          </w:p>
+        </w:tc>
+        <w:tc>
+          <w:tcPr>
+            <w:tcW w:type="dxa" w:w="2430"/>
+            <w:tcBorders>
+              <w:top w:val="single" w:color="000000" w:sz="4"/>
+              <w:left w:val="single" w:color="000000" w:sz="4"/>
+              <w:bottom w:val="single" w:color="000000" w:sz="4"/>
+              <w:right w:val="single" w:color="000000" w:sz="4"/>
+            </w:tcBorders>
+            <w:shd w:fill="FFFFFF" w:val="clear"/>
+            <w:tcMar>
+              <w:top w:type="dxa" w:w="60"/>
+              <w:left w:type="dxa" w:w="100"/>
+              <w:bottom w:type="dxa" w:w="60"/>
+              <w:right w:type="dxa" w:w="100"/>
+            </w:tcMar>
+            <w:vAlign w:val="center"/>
+          </w:tcPr>
+          <w:p>
+            <w:pPr>
+              <w:spacing w:after="0" w:before="0" w:line="240" w:lineRule="auto"/>
+              <w:jc w:val="center"/>
+            </w:pPr>
+            <w:r>
+              <w:rPr>
+                <w:rFonts w:ascii="Times New Roman" w:cs="Times New Roman" w:eastAsia="Times New Roman" w:hAnsi="Times New Roman"/>
+                <w:b w:val="false"/>
+                <w:bCs w:val="false"/>
+                <w:sz w:val="20"/>
+                <w:szCs w:val="20"/>
+              </w:rPr>
+              <w:t xml:space="preserve">2.42
+(Agree)</w:t>
+            </w:r>
+          </w:p>
+        </w:tc>
+      </w:tr>
+      <w:tr>
+        <w:tc>
+          <w:tcPr>
+            <w:tcW w:type="dxa" w:w="2430"/>
+            <w:tcBorders>
+              <w:top w:val="single" w:color="000000" w:sz="4"/>
+              <w:left w:val="single" w:color="000000" w:sz="4"/>
+              <w:bottom w:val="single" w:color="000000" w:sz="4"/>
+              <w:right w:val="single" w:color="000000" w:sz="4"/>
+            </w:tcBorders>
+            <w:shd w:fill="FFFFFF" w:val="clear"/>
+            <w:tcMar>
+              <w:top w:type="dxa" w:w="60"/>
+              <w:left w:type="dxa" w:w="100"/>
+              <w:bottom w:type="dxa" w:w="60"/>
+              <w:right w:type="dxa" w:w="100"/>
+            </w:tcMar>
+            <w:vAlign w:val="center"/>
+          </w:tcPr>
+          <w:p>
+            <w:pPr>
+              <w:spacing w:after="0" w:before="0" w:line="240" w:lineRule="auto"/>
+              <w:jc w:val="left"/>
+            </w:pPr>
+            <w:r>
+              <w:rPr>
+                <w:rFonts w:ascii="Times New Roman" w:cs="Times New Roman" w:eastAsia="Times New Roman" w:hAnsi="Times New Roman"/>
+                <w:b/>
+                <w:bCs/>
+                <w:sz w:val="20"/>
+                <w:szCs w:val="20"/>
+              </w:rPr>
+              <w:t xml:space="preserve">Overall Weighted Mean</w:t>
+            </w:r>
+          </w:p>
+        </w:tc>
+        <w:tc>
+          <w:tcPr>
+            <w:tcW w:type="dxa" w:w="1620"/>
+            <w:tcBorders>
+              <w:top w:val="single" w:color="000000" w:sz="4"/>
+              <w:left w:val="single" w:color="000000" w:sz="4"/>
+              <w:bottom w:val="single" w:color="000000" w:sz="4"/>
+              <w:right w:val="single" w:color="000000" w:sz="4"/>
+            </w:tcBorders>
+            <w:shd w:fill="FFFFFF" w:val="clear"/>
+            <w:tcMar>
+              <w:top w:type="dxa" w:w="60"/>
+              <w:left w:type="dxa" w:w="100"/>
+              <w:bottom w:type="dxa" w:w="60"/>
+              <w:right w:type="dxa" w:w="100"/>
+            </w:tcMar>
+            <w:vAlign w:val="center"/>
+          </w:tcPr>
+          <w:p>
+            <w:pPr>
+              <w:spacing w:after="0" w:before="0" w:line="240" w:lineRule="auto"/>
+              <w:jc w:val="center"/>
+            </w:pPr>
+            <w:r>
+              <w:rPr>
+                <w:rFonts w:ascii="Times New Roman" w:cs="Times New Roman" w:eastAsia="Times New Roman" w:hAnsi="Times New Roman"/>
+                <w:b/>
+                <w:bCs/>
+                <w:sz w:val="20"/>
+                <w:szCs w:val="20"/>
+              </w:rPr>
+              <w:t xml:space="preserve">2.67
+(Neutral)</w:t>
+            </w:r>
+          </w:p>
+        </w:tc>
+        <w:tc>
+          <w:tcPr>
+            <w:tcW w:type="dxa" w:w="1620"/>
+            <w:tcBorders>
+              <w:top w:val="single" w:color="000000" w:sz="4"/>
+              <w:left w:val="single" w:color="000000" w:sz="4"/>
+              <w:bottom w:val="single" w:color="000000" w:sz="4"/>
+              <w:right w:val="single" w:color="000000" w:sz="4"/>
+            </w:tcBorders>
+            <w:shd w:fill="FFFFFF" w:val="clear"/>
+            <w:tcMar>
+              <w:top w:type="dxa" w:w="60"/>
+              <w:left w:type="dxa" w:w="100"/>
+              <w:bottom w:type="dxa" w:w="60"/>
+              <w:right w:type="dxa" w:w="100"/>
+            </w:tcMar>
+            <w:vAlign w:val="center"/>
+          </w:tcPr>
+          <w:p>
+            <w:pPr>
+              <w:spacing w:after="0" w:before="0" w:line="240" w:lineRule="auto"/>
+              <w:jc w:val="center"/>
+            </w:pPr>
+            <w:r>
+              <w:rPr>
+                <w:rFonts w:ascii="Times New Roman" w:cs="Times New Roman" w:eastAsia="Times New Roman" w:hAnsi="Times New Roman"/>
+                <w:b/>
+                <w:bCs/>
+                <w:sz w:val="20"/>
+                <w:szCs w:val="20"/>
+              </w:rPr>
+              <w:t xml:space="preserve">2.66
+(Neutral)</w:t>
+            </w:r>
+          </w:p>
+        </w:tc>
+        <w:tc>
+          <w:tcPr>
+            <w:tcW w:type="dxa" w:w="1620"/>
+            <w:tcBorders>
+              <w:top w:val="single" w:color="000000" w:sz="4"/>
+              <w:left w:val="single" w:color="000000" w:sz="4"/>
+              <w:bottom w:val="single" w:color="000000" w:sz="4"/>
+              <w:right w:val="single" w:color="000000" w:sz="4"/>
+            </w:tcBorders>
+            <w:shd w:fill="FFFFFF" w:val="clear"/>
+            <w:tcMar>
+              <w:top w:type="dxa" w:w="60"/>
+              <w:left w:type="dxa" w:w="100"/>
+              <w:bottom w:type="dxa" w:w="60"/>
+              <w:right w:type="dxa" w:w="100"/>
+            </w:tcMar>
+            <w:vAlign w:val="center"/>
+          </w:tcPr>
+          <w:p>
+            <w:pPr>
+              <w:spacing w:after="0" w:before="0" w:line="240" w:lineRule="auto"/>
+              <w:jc w:val="center"/>
+            </w:pPr>
+            <w:r>
+              <w:rPr>
+                <w:rFonts w:ascii="Times New Roman" w:cs="Times New Roman" w:eastAsia="Times New Roman" w:hAnsi="Times New Roman"/>
+                <w:b/>
+                <w:bCs/>
+                <w:sz w:val="20"/>
+                <w:szCs w:val="20"/>
+              </w:rPr>
+              <w:t xml:space="preserve">2.11
+(Agree)</w:t>
+            </w:r>
+          </w:p>
+        </w:tc>
+        <w:tc>
+          <w:tcPr>
+            <w:tcW w:type="dxa" w:w="2430"/>
+            <w:tcBorders>
+              <w:top w:val="single" w:color="000000" w:sz="4"/>
+              <w:left w:val="single" w:color="000000" w:sz="4"/>
+              <w:bottom w:val="single" w:color="000000" w:sz="4"/>
+              <w:right w:val="single" w:color="000000" w:sz="4"/>
+            </w:tcBorders>
+            <w:shd w:fill="FFFFFF" w:val="clear"/>
+            <w:tcMar>
+              <w:top w:type="dxa" w:w="60"/>
+              <w:left w:type="dxa" w:w="100"/>
+              <w:bottom w:type="dxa" w:w="60"/>
+              <w:right w:type="dxa" w:w="100"/>
+            </w:tcMar>
+            <w:vAlign w:val="center"/>
+          </w:tcPr>
+          <w:p>
+            <w:pPr>
+              <w:spacing w:after="0" w:before="0" w:line="240" w:lineRule="auto"/>
+              <w:jc w:val="center"/>
+            </w:pPr>
+            <w:r>
+              <w:rPr>
+                <w:rFonts w:ascii="Times New Roman" w:cs="Times New Roman" w:eastAsia="Times New Roman" w:hAnsi="Times New Roman"/>
+                <w:b/>
+                <w:bCs/>
+                <w:sz w:val="20"/>
+                <w:szCs w:val="20"/>
+              </w:rPr>
+              <w:t xml:space="preserve">2.48
+(Agree)</w:t>
+            </w:r>
+          </w:p>
+        </w:tc>
+      </w:tr>
+    </w:tbl>
+    <w:p>
+      <w:pPr>
+        <w:spacing w:after="0" w:before="0" w:line="480" w:lineRule="auto"/>
+      </w:pPr>
+    </w:p>
+    <w:p>
+      <w:pPr>
+        <w:spacing w:after="0" w:before="0" w:line="480" w:lineRule="auto"/>
+      </w:pPr>
+    </w:p>
+    <w:p>
+      <w:pPr>
+        <w:spacing w:after="0" w:before="0" w:line="480" w:lineRule="auto"/>
         <w:jc w:val="both"/>
       </w:pPr>
       <w:r>
@@ -28650,7 +32245,7 @@
           <w:sz w:val="24"/>
           <w:szCs w:val="24"/>
         </w:rPr>
-        <w:t xml:space="preserve">With respect to qualitative integrity, the traditional method was reported by interviewed farmers to consistently produce skewered tobacco leaves of near-perfect quality. Farmers noted that visible damage, leaf misalignment, and post-skewering detachment are extremely rare in manual skewering, as the process affords the worker continuous tactile control and the ability to make real-time adjustments throughout each operation. The qualitative performance of the semi-automated machine is compared against this standard across all three batches.</w:t>
+        <w:t xml:space="preserve">With respect to qualitative integrity, the traditional method was reported by interviewed farmers to consistently produce skewered tobacco leaves of near-perfect quality. Farmers noted that visible damage, leaf misalignment, and post-skewering detachment are extremely rare in manual skewering, as the process affords the worker continuous tactile control and the ability to make real-time adjustments throughout each operation. As presented in Table 3.11, the qualitative performance of the semi-automated machine is compared against this standard across all three batches, showing a consistent improvement trend from Batch 1 to Batch 3.</w:t>
       </w:r>
     </w:p>
     <w:p>

</xml_diff>

<commit_message>
Remove qualitative comparison, fix Chapter 4 outlier/anomalous language
</commit_message>
<xml_diff>
--- a/Chapter_3_and_4_Revised.docx
+++ b/Chapter_3_and_4_Revised.docx
@@ -28149,148 +28149,6 @@
           </w:p>
         </w:tc>
       </w:tr>
-      <w:tr>
-        <w:tc>
-          <w:tcPr>
-            <w:tcW w:type="dxa" w:w="3240"/>
-            <w:tcBorders>
-              <w:top w:val="single" w:color="000000" w:sz="4"/>
-              <w:left w:val="single" w:color="000000" w:sz="4"/>
-              <w:bottom w:val="single" w:color="000000" w:sz="4"/>
-              <w:right w:val="single" w:color="000000" w:sz="4"/>
-            </w:tcBorders>
-            <w:shd w:fill="FFFFFF" w:val="clear"/>
-            <w:tcMar>
-              <w:top w:type="dxa" w:w="60"/>
-              <w:left w:type="dxa" w:w="100"/>
-              <w:bottom w:type="dxa" w:w="60"/>
-              <w:right w:type="dxa" w:w="100"/>
-            </w:tcMar>
-            <w:vAlign w:val="center"/>
-          </w:tcPr>
-          <w:p>
-            <w:pPr>
-              <w:spacing w:after="0" w:before="0" w:line="240" w:lineRule="auto"/>
-              <w:jc w:val="left"/>
-            </w:pPr>
-            <w:r>
-              <w:rPr>
-                <w:rFonts w:ascii="Times New Roman" w:cs="Times New Roman" w:eastAsia="Times New Roman" w:hAnsi="Times New Roman"/>
-                <w:b w:val="false"/>
-                <w:bCs w:val="false"/>
-                <w:sz w:val="20"/>
-                <w:szCs w:val="20"/>
-              </w:rPr>
-              <w:t xml:space="preserve">Qualitative Integrity</w:t>
-            </w:r>
-          </w:p>
-        </w:tc>
-        <w:tc>
-          <w:tcPr>
-            <w:tcW w:type="dxa" w:w="2160"/>
-            <w:tcBorders>
-              <w:top w:val="single" w:color="000000" w:sz="4"/>
-              <w:left w:val="single" w:color="000000" w:sz="4"/>
-              <w:bottom w:val="single" w:color="000000" w:sz="4"/>
-              <w:right w:val="single" w:color="000000" w:sz="4"/>
-            </w:tcBorders>
-            <w:shd w:fill="FFFFFF" w:val="clear"/>
-            <w:tcMar>
-              <w:top w:type="dxa" w:w="60"/>
-              <w:left w:type="dxa" w:w="100"/>
-              <w:bottom w:type="dxa" w:w="60"/>
-              <w:right w:type="dxa" w:w="100"/>
-            </w:tcMar>
-            <w:vAlign w:val="center"/>
-          </w:tcPr>
-          <w:p>
-            <w:pPr>
-              <w:spacing w:after="0" w:before="0" w:line="240" w:lineRule="auto"/>
-              <w:jc w:val="center"/>
-            </w:pPr>
-            <w:r>
-              <w:rPr>
-                <w:rFonts w:ascii="Times New Roman" w:cs="Times New Roman" w:eastAsia="Times New Roman" w:hAnsi="Times New Roman"/>
-                <w:b w:val="false"/>
-                <w:bCs w:val="false"/>
-                <w:sz w:val="20"/>
-                <w:szCs w:val="20"/>
-              </w:rPr>
-              <w:t xml:space="preserve">Near Perfect (interview)</w:t>
-            </w:r>
-          </w:p>
-        </w:tc>
-        <w:tc>
-          <w:tcPr>
-            <w:tcW w:type="dxa" w:w="2160"/>
-            <w:tcBorders>
-              <w:top w:val="single" w:color="000000" w:sz="4"/>
-              <w:left w:val="single" w:color="000000" w:sz="4"/>
-              <w:bottom w:val="single" w:color="000000" w:sz="4"/>
-              <w:right w:val="single" w:color="000000" w:sz="4"/>
-            </w:tcBorders>
-            <w:shd w:fill="FFFFFF" w:val="clear"/>
-            <w:tcMar>
-              <w:top w:type="dxa" w:w="60"/>
-              <w:left w:type="dxa" w:w="100"/>
-              <w:bottom w:type="dxa" w:w="60"/>
-              <w:right w:type="dxa" w:w="100"/>
-            </w:tcMar>
-            <w:vAlign w:val="center"/>
-          </w:tcPr>
-          <w:p>
-            <w:pPr>
-              <w:spacing w:after="0" w:before="0" w:line="240" w:lineRule="auto"/>
-              <w:jc w:val="center"/>
-            </w:pPr>
-            <w:r>
-              <w:rPr>
-                <w:rFonts w:ascii="Times New Roman" w:cs="Times New Roman" w:eastAsia="Times New Roman" w:hAnsi="Times New Roman"/>
-                <w:b w:val="false"/>
-                <w:bCs w:val="false"/>
-                <w:sz w:val="20"/>
-                <w:szCs w:val="20"/>
-              </w:rPr>
-              <w:t xml:space="preserve">Near Perfect (interview)</w:t>
-            </w:r>
-          </w:p>
-        </w:tc>
-        <w:tc>
-          <w:tcPr>
-            <w:tcW w:type="dxa" w:w="2160"/>
-            <w:tcBorders>
-              <w:top w:val="single" w:color="000000" w:sz="4"/>
-              <w:left w:val="single" w:color="000000" w:sz="4"/>
-              <w:bottom w:val="single" w:color="000000" w:sz="4"/>
-              <w:right w:val="single" w:color="000000" w:sz="4"/>
-            </w:tcBorders>
-            <w:shd w:fill="FFFFFF" w:val="clear"/>
-            <w:tcMar>
-              <w:top w:type="dxa" w:w="60"/>
-              <w:left w:type="dxa" w:w="100"/>
-              <w:bottom w:type="dxa" w:w="60"/>
-              <w:right w:type="dxa" w:w="100"/>
-            </w:tcMar>
-            <w:vAlign w:val="center"/>
-          </w:tcPr>
-          <w:p>
-            <w:pPr>
-              <w:spacing w:after="0" w:before="0" w:line="240" w:lineRule="auto"/>
-              <w:jc w:val="center"/>
-            </w:pPr>
-            <w:r>
-              <w:rPr>
-                <w:rFonts w:ascii="Times New Roman" w:cs="Times New Roman" w:eastAsia="Times New Roman" w:hAnsi="Times New Roman"/>
-                <w:b w:val="false"/>
-                <w:bCs w:val="false"/>
-                <w:sz w:val="20"/>
-                <w:szCs w:val="20"/>
-              </w:rPr>
-              <w:t xml:space="preserve">Avg. Mean: 2.79 (Neutral)</w:t>
-            </w:r>
-          </w:p>
-        </w:tc>
-      </w:tr>
     </w:tbl>
     <w:p>
       <w:pPr>
@@ -29473,148 +29331,6 @@
                 <w:szCs w:val="20"/>
               </w:rPr>
               <w:t xml:space="preserve">6.7%</w:t>
-            </w:r>
-          </w:p>
-        </w:tc>
-      </w:tr>
-      <w:tr>
-        <w:tc>
-          <w:tcPr>
-            <w:tcW w:type="dxa" w:w="3240"/>
-            <w:tcBorders>
-              <w:top w:val="single" w:color="000000" w:sz="4"/>
-              <w:left w:val="single" w:color="000000" w:sz="4"/>
-              <w:bottom w:val="single" w:color="000000" w:sz="4"/>
-              <w:right w:val="single" w:color="000000" w:sz="4"/>
-            </w:tcBorders>
-            <w:shd w:fill="FFFFFF" w:val="clear"/>
-            <w:tcMar>
-              <w:top w:type="dxa" w:w="60"/>
-              <w:left w:type="dxa" w:w="100"/>
-              <w:bottom w:type="dxa" w:w="60"/>
-              <w:right w:type="dxa" w:w="100"/>
-            </w:tcMar>
-            <w:vAlign w:val="center"/>
-          </w:tcPr>
-          <w:p>
-            <w:pPr>
-              <w:spacing w:after="0" w:before="0" w:line="240" w:lineRule="auto"/>
-              <w:jc w:val="left"/>
-            </w:pPr>
-            <w:r>
-              <w:rPr>
-                <w:rFonts w:ascii="Times New Roman" w:cs="Times New Roman" w:eastAsia="Times New Roman" w:hAnsi="Times New Roman"/>
-                <w:b w:val="false"/>
-                <w:bCs w:val="false"/>
-                <w:sz w:val="20"/>
-                <w:szCs w:val="20"/>
-              </w:rPr>
-              <w:t xml:space="preserve">Qualitative Integrity</w:t>
-            </w:r>
-          </w:p>
-        </w:tc>
-        <w:tc>
-          <w:tcPr>
-            <w:tcW w:type="dxa" w:w="2160"/>
-            <w:tcBorders>
-              <w:top w:val="single" w:color="000000" w:sz="4"/>
-              <w:left w:val="single" w:color="000000" w:sz="4"/>
-              <w:bottom w:val="single" w:color="000000" w:sz="4"/>
-              <w:right w:val="single" w:color="000000" w:sz="4"/>
-            </w:tcBorders>
-            <w:shd w:fill="FFFFFF" w:val="clear"/>
-            <w:tcMar>
-              <w:top w:type="dxa" w:w="60"/>
-              <w:left w:type="dxa" w:w="100"/>
-              <w:bottom w:type="dxa" w:w="60"/>
-              <w:right w:type="dxa" w:w="100"/>
-            </w:tcMar>
-            <w:vAlign w:val="center"/>
-          </w:tcPr>
-          <w:p>
-            <w:pPr>
-              <w:spacing w:after="0" w:before="0" w:line="240" w:lineRule="auto"/>
-              <w:jc w:val="center"/>
-            </w:pPr>
-            <w:r>
-              <w:rPr>
-                <w:rFonts w:ascii="Times New Roman" w:cs="Times New Roman" w:eastAsia="Times New Roman" w:hAnsi="Times New Roman"/>
-                <w:b w:val="false"/>
-                <w:bCs w:val="false"/>
-                <w:sz w:val="20"/>
-                <w:szCs w:val="20"/>
-              </w:rPr>
-              <w:t xml:space="preserve">Near Perfect (interview)</w:t>
-            </w:r>
-          </w:p>
-        </w:tc>
-        <w:tc>
-          <w:tcPr>
-            <w:tcW w:type="dxa" w:w="2160"/>
-            <w:tcBorders>
-              <w:top w:val="single" w:color="000000" w:sz="4"/>
-              <w:left w:val="single" w:color="000000" w:sz="4"/>
-              <w:bottom w:val="single" w:color="000000" w:sz="4"/>
-              <w:right w:val="single" w:color="000000" w:sz="4"/>
-            </w:tcBorders>
-            <w:shd w:fill="FFFFFF" w:val="clear"/>
-            <w:tcMar>
-              <w:top w:type="dxa" w:w="60"/>
-              <w:left w:type="dxa" w:w="100"/>
-              <w:bottom w:type="dxa" w:w="60"/>
-              <w:right w:type="dxa" w:w="100"/>
-            </w:tcMar>
-            <w:vAlign w:val="center"/>
-          </w:tcPr>
-          <w:p>
-            <w:pPr>
-              <w:spacing w:after="0" w:before="0" w:line="240" w:lineRule="auto"/>
-              <w:jc w:val="center"/>
-            </w:pPr>
-            <w:r>
-              <w:rPr>
-                <w:rFonts w:ascii="Times New Roman" w:cs="Times New Roman" w:eastAsia="Times New Roman" w:hAnsi="Times New Roman"/>
-                <w:b w:val="false"/>
-                <w:bCs w:val="false"/>
-                <w:sz w:val="20"/>
-                <w:szCs w:val="20"/>
-              </w:rPr>
-              <w:t xml:space="preserve">Near Perfect (interview)</w:t>
-            </w:r>
-          </w:p>
-        </w:tc>
-        <w:tc>
-          <w:tcPr>
-            <w:tcW w:type="dxa" w:w="2160"/>
-            <w:tcBorders>
-              <w:top w:val="single" w:color="000000" w:sz="4"/>
-              <w:left w:val="single" w:color="000000" w:sz="4"/>
-              <w:bottom w:val="single" w:color="000000" w:sz="4"/>
-              <w:right w:val="single" w:color="000000" w:sz="4"/>
-            </w:tcBorders>
-            <w:shd w:fill="FFFFFF" w:val="clear"/>
-            <w:tcMar>
-              <w:top w:type="dxa" w:w="60"/>
-              <w:left w:type="dxa" w:w="100"/>
-              <w:bottom w:type="dxa" w:w="60"/>
-              <w:right w:type="dxa" w:w="100"/>
-            </w:tcMar>
-            <w:vAlign w:val="center"/>
-          </w:tcPr>
-          <w:p>
-            <w:pPr>
-              <w:spacing w:after="0" w:before="0" w:line="240" w:lineRule="auto"/>
-              <w:jc w:val="center"/>
-            </w:pPr>
-            <w:r>
-              <w:rPr>
-                <w:rFonts w:ascii="Times New Roman" w:cs="Times New Roman" w:eastAsia="Times New Roman" w:hAnsi="Times New Roman"/>
-                <w:b w:val="false"/>
-                <w:bCs w:val="false"/>
-                <w:sz w:val="20"/>
-                <w:szCs w:val="20"/>
-              </w:rPr>
-              <w:t xml:space="preserve">Avg. Mean: 2.72 (Neutral)</w:t>
             </w:r>
           </w:p>
         </w:tc>
@@ -30801,148 +30517,6 @@
                 <w:szCs w:val="20"/>
               </w:rPr>
               <w:t xml:space="preserve">8.9%</w:t>
-            </w:r>
-          </w:p>
-        </w:tc>
-      </w:tr>
-      <w:tr>
-        <w:tc>
-          <w:tcPr>
-            <w:tcW w:type="dxa" w:w="3240"/>
-            <w:tcBorders>
-              <w:top w:val="single" w:color="000000" w:sz="4"/>
-              <w:left w:val="single" w:color="000000" w:sz="4"/>
-              <w:bottom w:val="single" w:color="000000" w:sz="4"/>
-              <w:right w:val="single" w:color="000000" w:sz="4"/>
-            </w:tcBorders>
-            <w:shd w:fill="FFFFFF" w:val="clear"/>
-            <w:tcMar>
-              <w:top w:type="dxa" w:w="60"/>
-              <w:left w:type="dxa" w:w="100"/>
-              <w:bottom w:type="dxa" w:w="60"/>
-              <w:right w:type="dxa" w:w="100"/>
-            </w:tcMar>
-            <w:vAlign w:val="center"/>
-          </w:tcPr>
-          <w:p>
-            <w:pPr>
-              <w:spacing w:after="0" w:before="0" w:line="240" w:lineRule="auto"/>
-              <w:jc w:val="left"/>
-            </w:pPr>
-            <w:r>
-              <w:rPr>
-                <w:rFonts w:ascii="Times New Roman" w:cs="Times New Roman" w:eastAsia="Times New Roman" w:hAnsi="Times New Roman"/>
-                <w:b w:val="false"/>
-                <w:bCs w:val="false"/>
-                <w:sz w:val="20"/>
-                <w:szCs w:val="20"/>
-              </w:rPr>
-              <w:t xml:space="preserve">Qualitative Integrity</w:t>
-            </w:r>
-          </w:p>
-        </w:tc>
-        <w:tc>
-          <w:tcPr>
-            <w:tcW w:type="dxa" w:w="2160"/>
-            <w:tcBorders>
-              <w:top w:val="single" w:color="000000" w:sz="4"/>
-              <w:left w:val="single" w:color="000000" w:sz="4"/>
-              <w:bottom w:val="single" w:color="000000" w:sz="4"/>
-              <w:right w:val="single" w:color="000000" w:sz="4"/>
-            </w:tcBorders>
-            <w:shd w:fill="FFFFFF" w:val="clear"/>
-            <w:tcMar>
-              <w:top w:type="dxa" w:w="60"/>
-              <w:left w:type="dxa" w:w="100"/>
-              <w:bottom w:type="dxa" w:w="60"/>
-              <w:right w:type="dxa" w:w="100"/>
-            </w:tcMar>
-            <w:vAlign w:val="center"/>
-          </w:tcPr>
-          <w:p>
-            <w:pPr>
-              <w:spacing w:after="0" w:before="0" w:line="240" w:lineRule="auto"/>
-              <w:jc w:val="center"/>
-            </w:pPr>
-            <w:r>
-              <w:rPr>
-                <w:rFonts w:ascii="Times New Roman" w:cs="Times New Roman" w:eastAsia="Times New Roman" w:hAnsi="Times New Roman"/>
-                <w:b w:val="false"/>
-                <w:bCs w:val="false"/>
-                <w:sz w:val="20"/>
-                <w:szCs w:val="20"/>
-              </w:rPr>
-              <w:t xml:space="preserve">Near Perfect (interview)</w:t>
-            </w:r>
-          </w:p>
-        </w:tc>
-        <w:tc>
-          <w:tcPr>
-            <w:tcW w:type="dxa" w:w="2160"/>
-            <w:tcBorders>
-              <w:top w:val="single" w:color="000000" w:sz="4"/>
-              <w:left w:val="single" w:color="000000" w:sz="4"/>
-              <w:bottom w:val="single" w:color="000000" w:sz="4"/>
-              <w:right w:val="single" w:color="000000" w:sz="4"/>
-            </w:tcBorders>
-            <w:shd w:fill="FFFFFF" w:val="clear"/>
-            <w:tcMar>
-              <w:top w:type="dxa" w:w="60"/>
-              <w:left w:type="dxa" w:w="100"/>
-              <w:bottom w:type="dxa" w:w="60"/>
-              <w:right w:type="dxa" w:w="100"/>
-            </w:tcMar>
-            <w:vAlign w:val="center"/>
-          </w:tcPr>
-          <w:p>
-            <w:pPr>
-              <w:spacing w:after="0" w:before="0" w:line="240" w:lineRule="auto"/>
-              <w:jc w:val="center"/>
-            </w:pPr>
-            <w:r>
-              <w:rPr>
-                <w:rFonts w:ascii="Times New Roman" w:cs="Times New Roman" w:eastAsia="Times New Roman" w:hAnsi="Times New Roman"/>
-                <w:b w:val="false"/>
-                <w:bCs w:val="false"/>
-                <w:sz w:val="20"/>
-                <w:szCs w:val="20"/>
-              </w:rPr>
-              <w:t xml:space="preserve">Near Perfect (interview)</w:t>
-            </w:r>
-          </w:p>
-        </w:tc>
-        <w:tc>
-          <w:tcPr>
-            <w:tcW w:type="dxa" w:w="2160"/>
-            <w:tcBorders>
-              <w:top w:val="single" w:color="000000" w:sz="4"/>
-              <w:left w:val="single" w:color="000000" w:sz="4"/>
-              <w:bottom w:val="single" w:color="000000" w:sz="4"/>
-              <w:right w:val="single" w:color="000000" w:sz="4"/>
-            </w:tcBorders>
-            <w:shd w:fill="FFFFFF" w:val="clear"/>
-            <w:tcMar>
-              <w:top w:type="dxa" w:w="60"/>
-              <w:left w:type="dxa" w:w="100"/>
-              <w:bottom w:type="dxa" w:w="60"/>
-              <w:right w:type="dxa" w:w="100"/>
-            </w:tcMar>
-            <w:vAlign w:val="center"/>
-          </w:tcPr>
-          <w:p>
-            <w:pPr>
-              <w:spacing w:after="0" w:before="0" w:line="240" w:lineRule="auto"/>
-              <w:jc w:val="center"/>
-            </w:pPr>
-            <w:r>
-              <w:rPr>
-                <w:rFonts w:ascii="Times New Roman" w:cs="Times New Roman" w:eastAsia="Times New Roman" w:hAnsi="Times New Roman"/>
-                <w:b w:val="false"/>
-                <w:bCs w:val="false"/>
-                <w:sz w:val="20"/>
-                <w:szCs w:val="20"/>
-              </w:rPr>
-              <w:t xml:space="preserve">Avg. Mean: 2.11 (Agree)</w:t>
             </w:r>
           </w:p>
         </w:tc>
@@ -31248,1108 +30822,6 @@
       </w:r>
     </w:p>
     <w:p>
-      <w:pPr>
-        <w:spacing w:after="0" w:before="0" w:line="480" w:lineRule="auto"/>
-        <w:jc w:val="center"/>
-      </w:pPr>
-      <w:r>
-        <w:rPr>
-          <w:rFonts w:ascii="Times New Roman" w:cs="Times New Roman" w:eastAsia="Times New Roman" w:hAnsi="Times New Roman"/>
-          <w:b/>
-          <w:bCs/>
-          <w:sz w:val="24"/>
-          <w:szCs w:val="24"/>
-        </w:rPr>
-        <w:t xml:space="preserve">Table 3.11. Qualitative Integrity Comparison by Batch vs. Traditional Method</w:t>
-      </w:r>
-    </w:p>
-    <w:p>
-      <w:pPr>
-        <w:spacing w:after="0" w:before="0" w:line="480" w:lineRule="auto"/>
-      </w:pPr>
-    </w:p>
-    <w:tbl>
-      <w:tblPr>
-        <w:tblW w:type="dxa" w:w="9720"/>
-        <w:tblBorders>
-          <w:top w:val="single" w:color="auto" w:sz="4"/>
-          <w:left w:val="single" w:color="auto" w:sz="4"/>
-          <w:bottom w:val="single" w:color="auto" w:sz="4"/>
-          <w:right w:val="single" w:color="auto" w:sz="4"/>
-          <w:insideH w:val="single" w:color="auto" w:sz="4"/>
-          <w:insideV w:val="single" w:color="auto" w:sz="4"/>
-        </w:tblBorders>
-      </w:tblPr>
-      <w:tblGrid>
-        <w:gridCol w:w="2430"/>
-        <w:gridCol w:w="1620"/>
-        <w:gridCol w:w="1620"/>
-        <w:gridCol w:w="1620"/>
-        <w:gridCol w:w="2430"/>
-      </w:tblGrid>
-      <w:tr>
-        <w:tc>
-          <w:tcPr>
-            <w:tcW w:type="dxa" w:w="2430"/>
-            <w:tcBorders>
-              <w:top w:val="single" w:color="000000" w:sz="4"/>
-              <w:left w:val="single" w:color="000000" w:sz="4"/>
-              <w:bottom w:val="single" w:color="000000" w:sz="4"/>
-              <w:right w:val="single" w:color="000000" w:sz="4"/>
-            </w:tcBorders>
-            <w:shd w:fill="FFFFFF" w:val="clear"/>
-            <w:tcMar>
-              <w:top w:type="dxa" w:w="60"/>
-              <w:left w:type="dxa" w:w="100"/>
-              <w:bottom w:type="dxa" w:w="60"/>
-              <w:right w:type="dxa" w:w="100"/>
-            </w:tcMar>
-            <w:vAlign w:val="center"/>
-          </w:tcPr>
-          <w:p>
-            <w:pPr>
-              <w:spacing w:after="0" w:before="0" w:line="240" w:lineRule="auto"/>
-              <w:jc w:val="left"/>
-            </w:pPr>
-            <w:r>
-              <w:rPr>
-                <w:rFonts w:ascii="Times New Roman" w:cs="Times New Roman" w:eastAsia="Times New Roman" w:hAnsi="Times New Roman"/>
-                <w:b/>
-                <w:bCs/>
-                <w:sz w:val="20"/>
-                <w:szCs w:val="20"/>
-              </w:rPr>
-              <w:t xml:space="preserve">Criteria</w:t>
-            </w:r>
-          </w:p>
-        </w:tc>
-        <w:tc>
-          <w:tcPr>
-            <w:tcW w:type="dxa" w:w="1620"/>
-            <w:tcBorders>
-              <w:top w:val="single" w:color="000000" w:sz="4"/>
-              <w:left w:val="single" w:color="000000" w:sz="4"/>
-              <w:bottom w:val="single" w:color="000000" w:sz="4"/>
-              <w:right w:val="single" w:color="000000" w:sz="4"/>
-            </w:tcBorders>
-            <w:shd w:fill="FFFFFF" w:val="clear"/>
-            <w:tcMar>
-              <w:top w:type="dxa" w:w="60"/>
-              <w:left w:type="dxa" w:w="100"/>
-              <w:bottom w:type="dxa" w:w="60"/>
-              <w:right w:type="dxa" w:w="100"/>
-            </w:tcMar>
-            <w:vAlign w:val="center"/>
-          </w:tcPr>
-          <w:p>
-            <w:pPr>
-              <w:spacing w:after="0" w:before="0" w:line="240" w:lineRule="auto"/>
-              <w:jc w:val="center"/>
-            </w:pPr>
-            <w:r>
-              <w:rPr>
-                <w:rFonts w:ascii="Times New Roman" w:cs="Times New Roman" w:eastAsia="Times New Roman" w:hAnsi="Times New Roman"/>
-                <w:b/>
-                <w:bCs/>
-                <w:sz w:val="20"/>
-                <w:szCs w:val="20"/>
-              </w:rPr>
-              <w:t xml:space="preserve">Batch 1 Avg
-(T1–3)</w:t>
-            </w:r>
-          </w:p>
-        </w:tc>
-        <w:tc>
-          <w:tcPr>
-            <w:tcW w:type="dxa" w:w="1620"/>
-            <w:tcBorders>
-              <w:top w:val="single" w:color="000000" w:sz="4"/>
-              <w:left w:val="single" w:color="000000" w:sz="4"/>
-              <w:bottom w:val="single" w:color="000000" w:sz="4"/>
-              <w:right w:val="single" w:color="000000" w:sz="4"/>
-            </w:tcBorders>
-            <w:shd w:fill="FFFFFF" w:val="clear"/>
-            <w:tcMar>
-              <w:top w:type="dxa" w:w="60"/>
-              <w:left w:type="dxa" w:w="100"/>
-              <w:bottom w:type="dxa" w:w="60"/>
-              <w:right w:type="dxa" w:w="100"/>
-            </w:tcMar>
-            <w:vAlign w:val="center"/>
-          </w:tcPr>
-          <w:p>
-            <w:pPr>
-              <w:spacing w:after="0" w:before="0" w:line="240" w:lineRule="auto"/>
-              <w:jc w:val="center"/>
-            </w:pPr>
-            <w:r>
-              <w:rPr>
-                <w:rFonts w:ascii="Times New Roman" w:cs="Times New Roman" w:eastAsia="Times New Roman" w:hAnsi="Times New Roman"/>
-                <w:b/>
-                <w:bCs/>
-                <w:sz w:val="20"/>
-                <w:szCs w:val="20"/>
-              </w:rPr>
-              <w:t xml:space="preserve">Batch 2 Avg
-(T4–6)</w:t>
-            </w:r>
-          </w:p>
-        </w:tc>
-        <w:tc>
-          <w:tcPr>
-            <w:tcW w:type="dxa" w:w="1620"/>
-            <w:tcBorders>
-              <w:top w:val="single" w:color="000000" w:sz="4"/>
-              <w:left w:val="single" w:color="000000" w:sz="4"/>
-              <w:bottom w:val="single" w:color="000000" w:sz="4"/>
-              <w:right w:val="single" w:color="000000" w:sz="4"/>
-            </w:tcBorders>
-            <w:shd w:fill="FFFFFF" w:val="clear"/>
-            <w:tcMar>
-              <w:top w:type="dxa" w:w="60"/>
-              <w:left w:type="dxa" w:w="100"/>
-              <w:bottom w:type="dxa" w:w="60"/>
-              <w:right w:type="dxa" w:w="100"/>
-            </w:tcMar>
-            <w:vAlign w:val="center"/>
-          </w:tcPr>
-          <w:p>
-            <w:pPr>
-              <w:spacing w:after="0" w:before="0" w:line="240" w:lineRule="auto"/>
-              <w:jc w:val="center"/>
-            </w:pPr>
-            <w:r>
-              <w:rPr>
-                <w:rFonts w:ascii="Times New Roman" w:cs="Times New Roman" w:eastAsia="Times New Roman" w:hAnsi="Times New Roman"/>
-                <w:b/>
-                <w:bCs/>
-                <w:sz w:val="20"/>
-                <w:szCs w:val="20"/>
-              </w:rPr>
-              <w:t xml:space="preserve">Batch 3 Avg
-(T7–9)</w:t>
-            </w:r>
-          </w:p>
-        </w:tc>
-        <w:tc>
-          <w:tcPr>
-            <w:tcW w:type="dxa" w:w="2430"/>
-            <w:tcBorders>
-              <w:top w:val="single" w:color="000000" w:sz="4"/>
-              <w:left w:val="single" w:color="000000" w:sz="4"/>
-              <w:bottom w:val="single" w:color="000000" w:sz="4"/>
-              <w:right w:val="single" w:color="000000" w:sz="4"/>
-            </w:tcBorders>
-            <w:shd w:fill="FFFFFF" w:val="clear"/>
-            <w:tcMar>
-              <w:top w:type="dxa" w:w="60"/>
-              <w:left w:type="dxa" w:w="100"/>
-              <w:bottom w:type="dxa" w:w="60"/>
-              <w:right w:type="dxa" w:w="100"/>
-            </w:tcMar>
-            <w:vAlign w:val="center"/>
-          </w:tcPr>
-          <w:p>
-            <w:pPr>
-              <w:spacing w:after="0" w:before="0" w:line="240" w:lineRule="auto"/>
-              <w:jc w:val="center"/>
-            </w:pPr>
-            <w:r>
-              <w:rPr>
-                <w:rFonts w:ascii="Times New Roman" w:cs="Times New Roman" w:eastAsia="Times New Roman" w:hAnsi="Times New Roman"/>
-                <w:b/>
-                <w:bCs/>
-                <w:sz w:val="20"/>
-                <w:szCs w:val="20"/>
-              </w:rPr>
-              <w:t xml:space="preserve">Grand Mean</w:t>
-            </w:r>
-          </w:p>
-        </w:tc>
-      </w:tr>
-      <w:tr>
-        <w:tc>
-          <w:tcPr>
-            <w:tcW w:type="dxa" w:w="2430"/>
-            <w:tcBorders>
-              <w:top w:val="single" w:color="000000" w:sz="4"/>
-              <w:left w:val="single" w:color="000000" w:sz="4"/>
-              <w:bottom w:val="single" w:color="000000" w:sz="4"/>
-              <w:right w:val="single" w:color="000000" w:sz="4"/>
-            </w:tcBorders>
-            <w:shd w:fill="FFFFFF" w:val="clear"/>
-            <w:tcMar>
-              <w:top w:type="dxa" w:w="60"/>
-              <w:left w:type="dxa" w:w="100"/>
-              <w:bottom w:type="dxa" w:w="60"/>
-              <w:right w:type="dxa" w:w="100"/>
-            </w:tcMar>
-            <w:vAlign w:val="center"/>
-          </w:tcPr>
-          <w:p>
-            <w:pPr>
-              <w:spacing w:after="0" w:before="0" w:line="240" w:lineRule="auto"/>
-              <w:jc w:val="left"/>
-            </w:pPr>
-            <w:r>
-              <w:rPr>
-                <w:rFonts w:ascii="Times New Roman" w:cs="Times New Roman" w:eastAsia="Times New Roman" w:hAnsi="Times New Roman"/>
-                <w:b w:val="false"/>
-                <w:bCs w:val="false"/>
-                <w:sz w:val="20"/>
-                <w:szCs w:val="20"/>
-              </w:rPr>
-              <w:t xml:space="preserve">Alignment</w:t>
-            </w:r>
-          </w:p>
-        </w:tc>
-        <w:tc>
-          <w:tcPr>
-            <w:tcW w:type="dxa" w:w="1620"/>
-            <w:tcBorders>
-              <w:top w:val="single" w:color="000000" w:sz="4"/>
-              <w:left w:val="single" w:color="000000" w:sz="4"/>
-              <w:bottom w:val="single" w:color="000000" w:sz="4"/>
-              <w:right w:val="single" w:color="000000" w:sz="4"/>
-            </w:tcBorders>
-            <w:shd w:fill="FFFFFF" w:val="clear"/>
-            <w:tcMar>
-              <w:top w:type="dxa" w:w="60"/>
-              <w:left w:type="dxa" w:w="100"/>
-              <w:bottom w:type="dxa" w:w="60"/>
-              <w:right w:type="dxa" w:w="100"/>
-            </w:tcMar>
-            <w:vAlign w:val="center"/>
-          </w:tcPr>
-          <w:p>
-            <w:pPr>
-              <w:spacing w:after="0" w:before="0" w:line="240" w:lineRule="auto"/>
-              <w:jc w:val="center"/>
-            </w:pPr>
-            <w:r>
-              <w:rPr>
-                <w:rFonts w:ascii="Times New Roman" w:cs="Times New Roman" w:eastAsia="Times New Roman" w:hAnsi="Times New Roman"/>
-                <w:b w:val="false"/>
-                <w:bCs w:val="false"/>
-                <w:sz w:val="20"/>
-                <w:szCs w:val="20"/>
-              </w:rPr>
-              <w:t xml:space="preserve">2.88
-(Neutral)</w:t>
-            </w:r>
-          </w:p>
-        </w:tc>
-        <w:tc>
-          <w:tcPr>
-            <w:tcW w:type="dxa" w:w="1620"/>
-            <w:tcBorders>
-              <w:top w:val="single" w:color="000000" w:sz="4"/>
-              <w:left w:val="single" w:color="000000" w:sz="4"/>
-              <w:bottom w:val="single" w:color="000000" w:sz="4"/>
-              <w:right w:val="single" w:color="000000" w:sz="4"/>
-            </w:tcBorders>
-            <w:shd w:fill="FFFFFF" w:val="clear"/>
-            <w:tcMar>
-              <w:top w:type="dxa" w:w="60"/>
-              <w:left w:type="dxa" w:w="100"/>
-              <w:bottom w:type="dxa" w:w="60"/>
-              <w:right w:type="dxa" w:w="100"/>
-            </w:tcMar>
-            <w:vAlign w:val="center"/>
-          </w:tcPr>
-          <w:p>
-            <w:pPr>
-              <w:spacing w:after="0" w:before="0" w:line="240" w:lineRule="auto"/>
-              <w:jc w:val="center"/>
-            </w:pPr>
-            <w:r>
-              <w:rPr>
-                <w:rFonts w:ascii="Times New Roman" w:cs="Times New Roman" w:eastAsia="Times New Roman" w:hAnsi="Times New Roman"/>
-                <w:b w:val="false"/>
-                <w:bCs w:val="false"/>
-                <w:sz w:val="20"/>
-                <w:szCs w:val="20"/>
-              </w:rPr>
-              <w:t xml:space="preserve">2.65
-(Neutral)</w:t>
-            </w:r>
-          </w:p>
-        </w:tc>
-        <w:tc>
-          <w:tcPr>
-            <w:tcW w:type="dxa" w:w="1620"/>
-            <w:tcBorders>
-              <w:top w:val="single" w:color="000000" w:sz="4"/>
-              <w:left w:val="single" w:color="000000" w:sz="4"/>
-              <w:bottom w:val="single" w:color="000000" w:sz="4"/>
-              <w:right w:val="single" w:color="000000" w:sz="4"/>
-            </w:tcBorders>
-            <w:shd w:fill="FFFFFF" w:val="clear"/>
-            <w:tcMar>
-              <w:top w:type="dxa" w:w="60"/>
-              <w:left w:type="dxa" w:w="100"/>
-              <w:bottom w:type="dxa" w:w="60"/>
-              <w:right w:type="dxa" w:w="100"/>
-            </w:tcMar>
-            <w:vAlign w:val="center"/>
-          </w:tcPr>
-          <w:p>
-            <w:pPr>
-              <w:spacing w:after="0" w:before="0" w:line="240" w:lineRule="auto"/>
-              <w:jc w:val="center"/>
-            </w:pPr>
-            <w:r>
-              <w:rPr>
-                <w:rFonts w:ascii="Times New Roman" w:cs="Times New Roman" w:eastAsia="Times New Roman" w:hAnsi="Times New Roman"/>
-                <w:b w:val="false"/>
-                <w:bCs w:val="false"/>
-                <w:sz w:val="20"/>
-                <w:szCs w:val="20"/>
-              </w:rPr>
-              <w:t xml:space="preserve">2.10
-(Agree)</w:t>
-            </w:r>
-          </w:p>
-        </w:tc>
-        <w:tc>
-          <w:tcPr>
-            <w:tcW w:type="dxa" w:w="2430"/>
-            <w:tcBorders>
-              <w:top w:val="single" w:color="000000" w:sz="4"/>
-              <w:left w:val="single" w:color="000000" w:sz="4"/>
-              <w:bottom w:val="single" w:color="000000" w:sz="4"/>
-              <w:right w:val="single" w:color="000000" w:sz="4"/>
-            </w:tcBorders>
-            <w:shd w:fill="FFFFFF" w:val="clear"/>
-            <w:tcMar>
-              <w:top w:type="dxa" w:w="60"/>
-              <w:left w:type="dxa" w:w="100"/>
-              <w:bottom w:type="dxa" w:w="60"/>
-              <w:right w:type="dxa" w:w="100"/>
-            </w:tcMar>
-            <w:vAlign w:val="center"/>
-          </w:tcPr>
-          <w:p>
-            <w:pPr>
-              <w:spacing w:after="0" w:before="0" w:line="240" w:lineRule="auto"/>
-              <w:jc w:val="center"/>
-            </w:pPr>
-            <w:r>
-              <w:rPr>
-                <w:rFonts w:ascii="Times New Roman" w:cs="Times New Roman" w:eastAsia="Times New Roman" w:hAnsi="Times New Roman"/>
-                <w:b w:val="false"/>
-                <w:bCs w:val="false"/>
-                <w:sz w:val="20"/>
-                <w:szCs w:val="20"/>
-              </w:rPr>
-              <w:t xml:space="preserve">2.55
-(Neutral)</w:t>
-            </w:r>
-          </w:p>
-        </w:tc>
-      </w:tr>
-      <w:tr>
-        <w:tc>
-          <w:tcPr>
-            <w:tcW w:type="dxa" w:w="2430"/>
-            <w:tcBorders>
-              <w:top w:val="single" w:color="000000" w:sz="4"/>
-              <w:left w:val="single" w:color="000000" w:sz="4"/>
-              <w:bottom w:val="single" w:color="000000" w:sz="4"/>
-              <w:right w:val="single" w:color="000000" w:sz="4"/>
-            </w:tcBorders>
-            <w:shd w:fill="FFFFFF" w:val="clear"/>
-            <w:tcMar>
-              <w:top w:type="dxa" w:w="60"/>
-              <w:left w:type="dxa" w:w="100"/>
-              <w:bottom w:type="dxa" w:w="60"/>
-              <w:right w:type="dxa" w:w="100"/>
-            </w:tcMar>
-            <w:vAlign w:val="center"/>
-          </w:tcPr>
-          <w:p>
-            <w:pPr>
-              <w:spacing w:after="0" w:before="0" w:line="240" w:lineRule="auto"/>
-              <w:jc w:val="left"/>
-            </w:pPr>
-            <w:r>
-              <w:rPr>
-                <w:rFonts w:ascii="Times New Roman" w:cs="Times New Roman" w:eastAsia="Times New Roman" w:hAnsi="Times New Roman"/>
-                <w:b w:val="false"/>
-                <w:bCs w:val="false"/>
-                <w:sz w:val="20"/>
-                <w:szCs w:val="20"/>
-              </w:rPr>
-              <w:t xml:space="preserve">Attachment Security</w:t>
-            </w:r>
-          </w:p>
-        </w:tc>
-        <w:tc>
-          <w:tcPr>
-            <w:tcW w:type="dxa" w:w="1620"/>
-            <w:tcBorders>
-              <w:top w:val="single" w:color="000000" w:sz="4"/>
-              <w:left w:val="single" w:color="000000" w:sz="4"/>
-              <w:bottom w:val="single" w:color="000000" w:sz="4"/>
-              <w:right w:val="single" w:color="000000" w:sz="4"/>
-            </w:tcBorders>
-            <w:shd w:fill="FFFFFF" w:val="clear"/>
-            <w:tcMar>
-              <w:top w:type="dxa" w:w="60"/>
-              <w:left w:type="dxa" w:w="100"/>
-              <w:bottom w:type="dxa" w:w="60"/>
-              <w:right w:type="dxa" w:w="100"/>
-            </w:tcMar>
-            <w:vAlign w:val="center"/>
-          </w:tcPr>
-          <w:p>
-            <w:pPr>
-              <w:spacing w:after="0" w:before="0" w:line="240" w:lineRule="auto"/>
-              <w:jc w:val="center"/>
-            </w:pPr>
-            <w:r>
-              <w:rPr>
-                <w:rFonts w:ascii="Times New Roman" w:cs="Times New Roman" w:eastAsia="Times New Roman" w:hAnsi="Times New Roman"/>
-                <w:b w:val="false"/>
-                <w:bCs w:val="false"/>
-                <w:sz w:val="20"/>
-                <w:szCs w:val="20"/>
-              </w:rPr>
-              <w:t xml:space="preserve">2.57
-(Agree)</w:t>
-            </w:r>
-          </w:p>
-        </w:tc>
-        <w:tc>
-          <w:tcPr>
-            <w:tcW w:type="dxa" w:w="1620"/>
-            <w:tcBorders>
-              <w:top w:val="single" w:color="000000" w:sz="4"/>
-              <w:left w:val="single" w:color="000000" w:sz="4"/>
-              <w:bottom w:val="single" w:color="000000" w:sz="4"/>
-              <w:right w:val="single" w:color="000000" w:sz="4"/>
-            </w:tcBorders>
-            <w:shd w:fill="FFFFFF" w:val="clear"/>
-            <w:tcMar>
-              <w:top w:type="dxa" w:w="60"/>
-              <w:left w:type="dxa" w:w="100"/>
-              <w:bottom w:type="dxa" w:w="60"/>
-              <w:right w:type="dxa" w:w="100"/>
-            </w:tcMar>
-            <w:vAlign w:val="center"/>
-          </w:tcPr>
-          <w:p>
-            <w:pPr>
-              <w:spacing w:after="0" w:before="0" w:line="240" w:lineRule="auto"/>
-              <w:jc w:val="center"/>
-            </w:pPr>
-            <w:r>
-              <w:rPr>
-                <w:rFonts w:ascii="Times New Roman" w:cs="Times New Roman" w:eastAsia="Times New Roman" w:hAnsi="Times New Roman"/>
-                <w:b w:val="false"/>
-                <w:bCs w:val="false"/>
-                <w:sz w:val="20"/>
-                <w:szCs w:val="20"/>
-              </w:rPr>
-              <w:t xml:space="preserve">2.71
-(Neutral)</w:t>
-            </w:r>
-          </w:p>
-        </w:tc>
-        <w:tc>
-          <w:tcPr>
-            <w:tcW w:type="dxa" w:w="1620"/>
-            <w:tcBorders>
-              <w:top w:val="single" w:color="000000" w:sz="4"/>
-              <w:left w:val="single" w:color="000000" w:sz="4"/>
-              <w:bottom w:val="single" w:color="000000" w:sz="4"/>
-              <w:right w:val="single" w:color="000000" w:sz="4"/>
-            </w:tcBorders>
-            <w:shd w:fill="FFFFFF" w:val="clear"/>
-            <w:tcMar>
-              <w:top w:type="dxa" w:w="60"/>
-              <w:left w:type="dxa" w:w="100"/>
-              <w:bottom w:type="dxa" w:w="60"/>
-              <w:right w:type="dxa" w:w="100"/>
-            </w:tcMar>
-            <w:vAlign w:val="center"/>
-          </w:tcPr>
-          <w:p>
-            <w:pPr>
-              <w:spacing w:after="0" w:before="0" w:line="240" w:lineRule="auto"/>
-              <w:jc w:val="center"/>
-            </w:pPr>
-            <w:r>
-              <w:rPr>
-                <w:rFonts w:ascii="Times New Roman" w:cs="Times New Roman" w:eastAsia="Times New Roman" w:hAnsi="Times New Roman"/>
-                <w:b w:val="false"/>
-                <w:bCs w:val="false"/>
-                <w:sz w:val="20"/>
-                <w:szCs w:val="20"/>
-              </w:rPr>
-              <w:t xml:space="preserve">2.14
-(Agree)</w:t>
-            </w:r>
-          </w:p>
-        </w:tc>
-        <w:tc>
-          <w:tcPr>
-            <w:tcW w:type="dxa" w:w="2430"/>
-            <w:tcBorders>
-              <w:top w:val="single" w:color="000000" w:sz="4"/>
-              <w:left w:val="single" w:color="000000" w:sz="4"/>
-              <w:bottom w:val="single" w:color="000000" w:sz="4"/>
-              <w:right w:val="single" w:color="000000" w:sz="4"/>
-            </w:tcBorders>
-            <w:shd w:fill="FFFFFF" w:val="clear"/>
-            <w:tcMar>
-              <w:top w:type="dxa" w:w="60"/>
-              <w:left w:type="dxa" w:w="100"/>
-              <w:bottom w:type="dxa" w:w="60"/>
-              <w:right w:type="dxa" w:w="100"/>
-            </w:tcMar>
-            <w:vAlign w:val="center"/>
-          </w:tcPr>
-          <w:p>
-            <w:pPr>
-              <w:spacing w:after="0" w:before="0" w:line="240" w:lineRule="auto"/>
-              <w:jc w:val="center"/>
-            </w:pPr>
-            <w:r>
-              <w:rPr>
-                <w:rFonts w:ascii="Times New Roman" w:cs="Times New Roman" w:eastAsia="Times New Roman" w:hAnsi="Times New Roman"/>
-                <w:b w:val="false"/>
-                <w:bCs w:val="false"/>
-                <w:sz w:val="20"/>
-                <w:szCs w:val="20"/>
-              </w:rPr>
-              <w:t xml:space="preserve">2.47
-(Agree)</w:t>
-            </w:r>
-          </w:p>
-        </w:tc>
-      </w:tr>
-      <w:tr>
-        <w:tc>
-          <w:tcPr>
-            <w:tcW w:type="dxa" w:w="2430"/>
-            <w:tcBorders>
-              <w:top w:val="single" w:color="000000" w:sz="4"/>
-              <w:left w:val="single" w:color="000000" w:sz="4"/>
-              <w:bottom w:val="single" w:color="000000" w:sz="4"/>
-              <w:right w:val="single" w:color="000000" w:sz="4"/>
-            </w:tcBorders>
-            <w:shd w:fill="FFFFFF" w:val="clear"/>
-            <w:tcMar>
-              <w:top w:type="dxa" w:w="60"/>
-              <w:left w:type="dxa" w:w="100"/>
-              <w:bottom w:type="dxa" w:w="60"/>
-              <w:right w:type="dxa" w:w="100"/>
-            </w:tcMar>
-            <w:vAlign w:val="center"/>
-          </w:tcPr>
-          <w:p>
-            <w:pPr>
-              <w:spacing w:after="0" w:before="0" w:line="240" w:lineRule="auto"/>
-              <w:jc w:val="left"/>
-            </w:pPr>
-            <w:r>
-              <w:rPr>
-                <w:rFonts w:ascii="Times New Roman" w:cs="Times New Roman" w:eastAsia="Times New Roman" w:hAnsi="Times New Roman"/>
-                <w:b w:val="false"/>
-                <w:bCs w:val="false"/>
-                <w:sz w:val="20"/>
-                <w:szCs w:val="20"/>
-              </w:rPr>
-              <w:t xml:space="preserve">Minimized Leaf Damage</w:t>
-            </w:r>
-          </w:p>
-        </w:tc>
-        <w:tc>
-          <w:tcPr>
-            <w:tcW w:type="dxa" w:w="1620"/>
-            <w:tcBorders>
-              <w:top w:val="single" w:color="000000" w:sz="4"/>
-              <w:left w:val="single" w:color="000000" w:sz="4"/>
-              <w:bottom w:val="single" w:color="000000" w:sz="4"/>
-              <w:right w:val="single" w:color="000000" w:sz="4"/>
-            </w:tcBorders>
-            <w:shd w:fill="FFFFFF" w:val="clear"/>
-            <w:tcMar>
-              <w:top w:type="dxa" w:w="60"/>
-              <w:left w:type="dxa" w:w="100"/>
-              <w:bottom w:type="dxa" w:w="60"/>
-              <w:right w:type="dxa" w:w="100"/>
-            </w:tcMar>
-            <w:vAlign w:val="center"/>
-          </w:tcPr>
-          <w:p>
-            <w:pPr>
-              <w:spacing w:after="0" w:before="0" w:line="240" w:lineRule="auto"/>
-              <w:jc w:val="center"/>
-            </w:pPr>
-            <w:r>
-              <w:rPr>
-                <w:rFonts w:ascii="Times New Roman" w:cs="Times New Roman" w:eastAsia="Times New Roman" w:hAnsi="Times New Roman"/>
-                <w:b w:val="false"/>
-                <w:bCs w:val="false"/>
-                <w:sz w:val="20"/>
-                <w:szCs w:val="20"/>
-              </w:rPr>
-              <w:t xml:space="preserve">2.55
-(Agree)</w:t>
-            </w:r>
-          </w:p>
-        </w:tc>
-        <w:tc>
-          <w:tcPr>
-            <w:tcW w:type="dxa" w:w="1620"/>
-            <w:tcBorders>
-              <w:top w:val="single" w:color="000000" w:sz="4"/>
-              <w:left w:val="single" w:color="000000" w:sz="4"/>
-              <w:bottom w:val="single" w:color="000000" w:sz="4"/>
-              <w:right w:val="single" w:color="000000" w:sz="4"/>
-            </w:tcBorders>
-            <w:shd w:fill="FFFFFF" w:val="clear"/>
-            <w:tcMar>
-              <w:top w:type="dxa" w:w="60"/>
-              <w:left w:type="dxa" w:w="100"/>
-              <w:bottom w:type="dxa" w:w="60"/>
-              <w:right w:type="dxa" w:w="100"/>
-            </w:tcMar>
-            <w:vAlign w:val="center"/>
-          </w:tcPr>
-          <w:p>
-            <w:pPr>
-              <w:spacing w:after="0" w:before="0" w:line="240" w:lineRule="auto"/>
-              <w:jc w:val="center"/>
-            </w:pPr>
-            <w:r>
-              <w:rPr>
-                <w:rFonts w:ascii="Times New Roman" w:cs="Times New Roman" w:eastAsia="Times New Roman" w:hAnsi="Times New Roman"/>
-                <w:b w:val="false"/>
-                <w:bCs w:val="false"/>
-                <w:sz w:val="20"/>
-                <w:szCs w:val="20"/>
-              </w:rPr>
-              <w:t xml:space="preserve">2.62
-(Agree)</w:t>
-            </w:r>
-          </w:p>
-        </w:tc>
-        <w:tc>
-          <w:tcPr>
-            <w:tcW w:type="dxa" w:w="1620"/>
-            <w:tcBorders>
-              <w:top w:val="single" w:color="000000" w:sz="4"/>
-              <w:left w:val="single" w:color="000000" w:sz="4"/>
-              <w:bottom w:val="single" w:color="000000" w:sz="4"/>
-              <w:right w:val="single" w:color="000000" w:sz="4"/>
-            </w:tcBorders>
-            <w:shd w:fill="FFFFFF" w:val="clear"/>
-            <w:tcMar>
-              <w:top w:type="dxa" w:w="60"/>
-              <w:left w:type="dxa" w:w="100"/>
-              <w:bottom w:type="dxa" w:w="60"/>
-              <w:right w:type="dxa" w:w="100"/>
-            </w:tcMar>
-            <w:vAlign w:val="center"/>
-          </w:tcPr>
-          <w:p>
-            <w:pPr>
-              <w:spacing w:after="0" w:before="0" w:line="240" w:lineRule="auto"/>
-              <w:jc w:val="center"/>
-            </w:pPr>
-            <w:r>
-              <w:rPr>
-                <w:rFonts w:ascii="Times New Roman" w:cs="Times New Roman" w:eastAsia="Times New Roman" w:hAnsi="Times New Roman"/>
-                <w:b w:val="false"/>
-                <w:bCs w:val="false"/>
-                <w:sz w:val="20"/>
-                <w:szCs w:val="20"/>
-              </w:rPr>
-              <w:t xml:space="preserve">2.10
-(Agree)</w:t>
-            </w:r>
-          </w:p>
-        </w:tc>
-        <w:tc>
-          <w:tcPr>
-            <w:tcW w:type="dxa" w:w="2430"/>
-            <w:tcBorders>
-              <w:top w:val="single" w:color="000000" w:sz="4"/>
-              <w:left w:val="single" w:color="000000" w:sz="4"/>
-              <w:bottom w:val="single" w:color="000000" w:sz="4"/>
-              <w:right w:val="single" w:color="000000" w:sz="4"/>
-            </w:tcBorders>
-            <w:shd w:fill="FFFFFF" w:val="clear"/>
-            <w:tcMar>
-              <w:top w:type="dxa" w:w="60"/>
-              <w:left w:type="dxa" w:w="100"/>
-              <w:bottom w:type="dxa" w:w="60"/>
-              <w:right w:type="dxa" w:w="100"/>
-            </w:tcMar>
-            <w:vAlign w:val="center"/>
-          </w:tcPr>
-          <w:p>
-            <w:pPr>
-              <w:spacing w:after="0" w:before="0" w:line="240" w:lineRule="auto"/>
-              <w:jc w:val="center"/>
-            </w:pPr>
-            <w:r>
-              <w:rPr>
-                <w:rFonts w:ascii="Times New Roman" w:cs="Times New Roman" w:eastAsia="Times New Roman" w:hAnsi="Times New Roman"/>
-                <w:b w:val="false"/>
-                <w:bCs w:val="false"/>
-                <w:sz w:val="20"/>
-                <w:szCs w:val="20"/>
-              </w:rPr>
-              <w:t xml:space="preserve">2.42
-(Agree)</w:t>
-            </w:r>
-          </w:p>
-        </w:tc>
-      </w:tr>
-      <w:tr>
-        <w:tc>
-          <w:tcPr>
-            <w:tcW w:type="dxa" w:w="2430"/>
-            <w:tcBorders>
-              <w:top w:val="single" w:color="000000" w:sz="4"/>
-              <w:left w:val="single" w:color="000000" w:sz="4"/>
-              <w:bottom w:val="single" w:color="000000" w:sz="4"/>
-              <w:right w:val="single" w:color="000000" w:sz="4"/>
-            </w:tcBorders>
-            <w:shd w:fill="FFFFFF" w:val="clear"/>
-            <w:tcMar>
-              <w:top w:type="dxa" w:w="60"/>
-              <w:left w:type="dxa" w:w="100"/>
-              <w:bottom w:type="dxa" w:w="60"/>
-              <w:right w:type="dxa" w:w="100"/>
-            </w:tcMar>
-            <w:vAlign w:val="center"/>
-          </w:tcPr>
-          <w:p>
-            <w:pPr>
-              <w:spacing w:after="0" w:before="0" w:line="240" w:lineRule="auto"/>
-              <w:jc w:val="left"/>
-            </w:pPr>
-            <w:r>
-              <w:rPr>
-                <w:rFonts w:ascii="Times New Roman" w:cs="Times New Roman" w:eastAsia="Times New Roman" w:hAnsi="Times New Roman"/>
-                <w:b/>
-                <w:bCs/>
-                <w:sz w:val="20"/>
-                <w:szCs w:val="20"/>
-              </w:rPr>
-              <w:t xml:space="preserve">Overall Weighted Mean</w:t>
-            </w:r>
-          </w:p>
-        </w:tc>
-        <w:tc>
-          <w:tcPr>
-            <w:tcW w:type="dxa" w:w="1620"/>
-            <w:tcBorders>
-              <w:top w:val="single" w:color="000000" w:sz="4"/>
-              <w:left w:val="single" w:color="000000" w:sz="4"/>
-              <w:bottom w:val="single" w:color="000000" w:sz="4"/>
-              <w:right w:val="single" w:color="000000" w:sz="4"/>
-            </w:tcBorders>
-            <w:shd w:fill="FFFFFF" w:val="clear"/>
-            <w:tcMar>
-              <w:top w:type="dxa" w:w="60"/>
-              <w:left w:type="dxa" w:w="100"/>
-              <w:bottom w:type="dxa" w:w="60"/>
-              <w:right w:type="dxa" w:w="100"/>
-            </w:tcMar>
-            <w:vAlign w:val="center"/>
-          </w:tcPr>
-          <w:p>
-            <w:pPr>
-              <w:spacing w:after="0" w:before="0" w:line="240" w:lineRule="auto"/>
-              <w:jc w:val="center"/>
-            </w:pPr>
-            <w:r>
-              <w:rPr>
-                <w:rFonts w:ascii="Times New Roman" w:cs="Times New Roman" w:eastAsia="Times New Roman" w:hAnsi="Times New Roman"/>
-                <w:b/>
-                <w:bCs/>
-                <w:sz w:val="20"/>
-                <w:szCs w:val="20"/>
-              </w:rPr>
-              <w:t xml:space="preserve">2.67
-(Neutral)</w:t>
-            </w:r>
-          </w:p>
-        </w:tc>
-        <w:tc>
-          <w:tcPr>
-            <w:tcW w:type="dxa" w:w="1620"/>
-            <w:tcBorders>
-              <w:top w:val="single" w:color="000000" w:sz="4"/>
-              <w:left w:val="single" w:color="000000" w:sz="4"/>
-              <w:bottom w:val="single" w:color="000000" w:sz="4"/>
-              <w:right w:val="single" w:color="000000" w:sz="4"/>
-            </w:tcBorders>
-            <w:shd w:fill="FFFFFF" w:val="clear"/>
-            <w:tcMar>
-              <w:top w:type="dxa" w:w="60"/>
-              <w:left w:type="dxa" w:w="100"/>
-              <w:bottom w:type="dxa" w:w="60"/>
-              <w:right w:type="dxa" w:w="100"/>
-            </w:tcMar>
-            <w:vAlign w:val="center"/>
-          </w:tcPr>
-          <w:p>
-            <w:pPr>
-              <w:spacing w:after="0" w:before="0" w:line="240" w:lineRule="auto"/>
-              <w:jc w:val="center"/>
-            </w:pPr>
-            <w:r>
-              <w:rPr>
-                <w:rFonts w:ascii="Times New Roman" w:cs="Times New Roman" w:eastAsia="Times New Roman" w:hAnsi="Times New Roman"/>
-                <w:b/>
-                <w:bCs/>
-                <w:sz w:val="20"/>
-                <w:szCs w:val="20"/>
-              </w:rPr>
-              <w:t xml:space="preserve">2.66
-(Neutral)</w:t>
-            </w:r>
-          </w:p>
-        </w:tc>
-        <w:tc>
-          <w:tcPr>
-            <w:tcW w:type="dxa" w:w="1620"/>
-            <w:tcBorders>
-              <w:top w:val="single" w:color="000000" w:sz="4"/>
-              <w:left w:val="single" w:color="000000" w:sz="4"/>
-              <w:bottom w:val="single" w:color="000000" w:sz="4"/>
-              <w:right w:val="single" w:color="000000" w:sz="4"/>
-            </w:tcBorders>
-            <w:shd w:fill="FFFFFF" w:val="clear"/>
-            <w:tcMar>
-              <w:top w:type="dxa" w:w="60"/>
-              <w:left w:type="dxa" w:w="100"/>
-              <w:bottom w:type="dxa" w:w="60"/>
-              <w:right w:type="dxa" w:w="100"/>
-            </w:tcMar>
-            <w:vAlign w:val="center"/>
-          </w:tcPr>
-          <w:p>
-            <w:pPr>
-              <w:spacing w:after="0" w:before="0" w:line="240" w:lineRule="auto"/>
-              <w:jc w:val="center"/>
-            </w:pPr>
-            <w:r>
-              <w:rPr>
-                <w:rFonts w:ascii="Times New Roman" w:cs="Times New Roman" w:eastAsia="Times New Roman" w:hAnsi="Times New Roman"/>
-                <w:b/>
-                <w:bCs/>
-                <w:sz w:val="20"/>
-                <w:szCs w:val="20"/>
-              </w:rPr>
-              <w:t xml:space="preserve">2.11
-(Agree)</w:t>
-            </w:r>
-          </w:p>
-        </w:tc>
-        <w:tc>
-          <w:tcPr>
-            <w:tcW w:type="dxa" w:w="2430"/>
-            <w:tcBorders>
-              <w:top w:val="single" w:color="000000" w:sz="4"/>
-              <w:left w:val="single" w:color="000000" w:sz="4"/>
-              <w:bottom w:val="single" w:color="000000" w:sz="4"/>
-              <w:right w:val="single" w:color="000000" w:sz="4"/>
-            </w:tcBorders>
-            <w:shd w:fill="FFFFFF" w:val="clear"/>
-            <w:tcMar>
-              <w:top w:type="dxa" w:w="60"/>
-              <w:left w:type="dxa" w:w="100"/>
-              <w:bottom w:type="dxa" w:w="60"/>
-              <w:right w:type="dxa" w:w="100"/>
-            </w:tcMar>
-            <w:vAlign w:val="center"/>
-          </w:tcPr>
-          <w:p>
-            <w:pPr>
-              <w:spacing w:after="0" w:before="0" w:line="240" w:lineRule="auto"/>
-              <w:jc w:val="center"/>
-            </w:pPr>
-            <w:r>
-              <w:rPr>
-                <w:rFonts w:ascii="Times New Roman" w:cs="Times New Roman" w:eastAsia="Times New Roman" w:hAnsi="Times New Roman"/>
-                <w:b/>
-                <w:bCs/>
-                <w:sz w:val="20"/>
-                <w:szCs w:val="20"/>
-              </w:rPr>
-              <w:t xml:space="preserve">2.48
-(Agree)</w:t>
-            </w:r>
-          </w:p>
-        </w:tc>
-      </w:tr>
-    </w:tbl>
-    <w:p>
-      <w:pPr>
-        <w:spacing w:after="0" w:before="0" w:line="480" w:lineRule="auto"/>
-      </w:pPr>
-    </w:p>
-    <w:p>
-      <w:pPr>
-        <w:spacing w:after="0" w:before="0" w:line="480" w:lineRule="auto"/>
-      </w:pPr>
-    </w:p>
-    <w:p>
-      <w:pPr>
-        <w:spacing w:after="0" w:before="0" w:line="480" w:lineRule="auto"/>
-        <w:jc w:val="both"/>
-      </w:pPr>
-      <w:r>
-        <w:rPr>
-          <w:rFonts w:ascii="Times New Roman" w:cs="Times New Roman" w:eastAsia="Times New Roman" w:hAnsi="Times New Roman"/>
-          <w:b/>
-          <w:bCs/>
-          <w:sz w:val="24"/>
-          <w:szCs w:val="24"/>
-        </w:rPr>
-        <w:t xml:space="preserve">Comparison on Qualitative Integrity</w:t>
-      </w:r>
-    </w:p>
-    <w:p>
-      <w:pPr>
-        <w:spacing w:after="0" w:before="0" w:line="480" w:lineRule="auto"/>
-      </w:pPr>
-      <w:r>
-        <w:rPr>
-          <w:rFonts w:ascii="Times New Roman" w:cs="Times New Roman" w:eastAsia="Times New Roman" w:hAnsi="Times New Roman"/>
-          <w:sz w:val="24"/>
-          <w:szCs w:val="24"/>
-        </w:rPr>
-        <w:t xml:space="preserve"/>
-      </w:r>
-    </w:p>
-    <w:p>
-      <w:pPr>
-        <w:spacing w:after="0" w:before="0" w:line="480" w:lineRule="auto"/>
-        <w:ind w:firstLine="720"/>
-        <w:jc w:val="both"/>
-      </w:pPr>
-      <w:r>
-        <w:rPr>
-          <w:rFonts w:ascii="Times New Roman" w:cs="Times New Roman" w:eastAsia="Times New Roman" w:hAnsi="Times New Roman"/>
-          <w:b w:val="false"/>
-          <w:bCs w:val="false"/>
-          <w:sz w:val="24"/>
-          <w:szCs w:val="24"/>
-        </w:rPr>
-        <w:t xml:space="preserve">With respect to qualitative integrity, the traditional method was reported by interviewed farmers to consistently produce skewered tobacco leaves of near-perfect quality. Farmers noted that visible damage, leaf misalignment, and post-skewering detachment are extremely rare in manual skewering, as the process affords the worker continuous tactile control and the ability to make real-time adjustments throughout each operation. As presented in Table 3.11, the qualitative performance of the semi-automated machine is compared against this standard across all three batches, showing a consistent improvement trend from Batch 1 to Batch 3.</w:t>
-      </w:r>
-    </w:p>
-    <w:p>
-      <w:pPr>
-        <w:spacing w:after="0" w:before="0" w:line="480" w:lineRule="auto"/>
-      </w:pPr>
-    </w:p>
-    <w:p>
-      <w:pPr>
-        <w:spacing w:after="0" w:before="0" w:line="480" w:lineRule="auto"/>
-        <w:ind w:firstLine="720"/>
-        <w:jc w:val="both"/>
-      </w:pPr>
-      <w:r>
-        <w:rPr>
-          <w:rFonts w:ascii="Times New Roman" w:cs="Times New Roman" w:eastAsia="Times New Roman" w:hAnsi="Times New Roman"/>
-          <w:b w:val="false"/>
-          <w:bCs w:val="false"/>
-          <w:sz w:val="24"/>
-          <w:szCs w:val="24"/>
-        </w:rPr>
-        <w:t xml:space="preserve">In Batch 1, the overall weighted qualitative mean across Trials 1 through 3 averaged 2.79, corresponding to a Neutral interpretation. This result reflects the initial calibration variance of the machine and the relatively lower leaf load, during which farmer-respondents expressed moderate satisfaction with alignment and attachment security.</w:t>
-      </w:r>
-    </w:p>
-    <w:p>
-      <w:pPr>
-        <w:spacing w:after="0" w:before="0" w:line="480" w:lineRule="auto"/>
-      </w:pPr>
-    </w:p>
-    <w:p>
-      <w:pPr>
-        <w:spacing w:after="0" w:before="0" w:line="480" w:lineRule="auto"/>
-        <w:ind w:firstLine="720"/>
-        <w:jc w:val="both"/>
-      </w:pPr>
-      <w:r>
-        <w:rPr>
-          <w:rFonts w:ascii="Times New Roman" w:cs="Times New Roman" w:eastAsia="Times New Roman" w:hAnsi="Times New Roman"/>
-          <w:b w:val="false"/>
-          <w:bCs w:val="false"/>
-          <w:sz w:val="24"/>
-          <w:szCs w:val="24"/>
-        </w:rPr>
-        <w:t xml:space="preserve">In Batch 2, the overall weighted means for Trials 4 and 5 were 2.47 and 2.43, respectively, both corresponding to Agree — indicating acceptable qualitative performance under increased leaf load. Trial 6 recorded the highest weighted mean of the entire study at 3.07, interpreted as Neutral, consistent with the operational difficulties identified in that trial. The elevated means for Trial 6 across all three qualitative criteria reflect the degraded clamping conditions caused by the missing rubber lining, which affected not only the success rate but also the alignment and attachment quality of the leaves that were skewered.</w:t>
-      </w:r>
-    </w:p>
-    <w:p>
-      <w:pPr>
-        <w:spacing w:after="0" w:before="0" w:line="480" w:lineRule="auto"/>
-      </w:pPr>
-    </w:p>
-    <w:p>
-      <w:pPr>
-        <w:spacing w:after="0" w:before="0" w:line="480" w:lineRule="auto"/>
-        <w:ind w:firstLine="720"/>
-        <w:jc w:val="both"/>
-      </w:pPr>
-      <w:r>
-        <w:rPr>
-          <w:rFonts w:ascii="Times New Roman" w:cs="Times New Roman" w:eastAsia="Times New Roman" w:hAnsi="Times New Roman"/>
-          <w:b w:val="false"/>
-          <w:bCs w:val="false"/>
-          <w:sz w:val="24"/>
-          <w:szCs w:val="24"/>
-        </w:rPr>
-        <w:t xml:space="preserve">In Batch 3, following the rubber lining corrective action, the qualitative performance improved markedly. Trials 7, 8, and 9 recorded overall weighted means of 2.00, 2.06, and 2.28, respectively — all corresponding to Agree and representing the most favorable qualitative ratings across the entire study. Trial 7 achieved the lowest overall weighted mean of 2.00, indicating the highest level of respondent agreement and the best qualitative output observed. The progressive improvement in qualitative ratings from Batch 1 through Batch 3 demonstrates that tray clamping integrity is a key determinant of qualitative output, and that corrective equipment maintenance directly improves the machine’s qualitative performance.</w:t>
-      </w:r>
-    </w:p>
-    <w:p>
-      <w:pPr>
-        <w:spacing w:after="0" w:before="0" w:line="480" w:lineRule="auto"/>
-      </w:pPr>
-    </w:p>
-    <w:p>
-      <w:pPr>
-        <w:spacing w:after="0" w:before="0" w:line="480" w:lineRule="auto"/>
-        <w:ind w:firstLine="720"/>
-        <w:jc w:val="both"/>
-      </w:pPr>
-      <w:r>
-        <w:rPr>
-          <w:rFonts w:ascii="Times New Roman" w:cs="Times New Roman" w:eastAsia="Times New Roman" w:hAnsi="Times New Roman"/>
-          <w:b w:val="false"/>
-          <w:bCs w:val="false"/>
-          <w:sz w:val="24"/>
-          <w:szCs w:val="24"/>
-        </w:rPr>
-        <w:t xml:space="preserve">While the semi-automated machine has not yet reached the near-perfect qualitative standard of the traditional method, the Batch 3 results indicate a meaningful upward trajectory. The grand overall weighted mean of 2.48 (Agree) across all nine trials indicates that farmer-respondents generally found the machine’s output to be qualitatively acceptable throughout the evaluation period.</w:t>
-      </w:r>
-    </w:p>
-    <w:p>
-      <w:pPr>
-        <w:spacing w:after="0" w:before="0" w:line="480" w:lineRule="auto"/>
-      </w:pPr>
-      <w:r>
-        <w:rPr>
-          <w:rFonts w:ascii="Times New Roman" w:cs="Times New Roman" w:eastAsia="Times New Roman" w:hAnsi="Times New Roman"/>
-          <w:sz w:val="24"/>
-          <w:szCs w:val="24"/>
-        </w:rPr>
-        <w:t xml:space="preserve"/>
-      </w:r>
-    </w:p>
-    <w:p>
       <w:r>
         <w:br w:type="page"/>
       </w:r>
@@ -32540,7 +31012,7 @@
           <w:sz w:val="24"/>
           <w:szCs w:val="24"/>
         </w:rPr>
-        <w:t xml:space="preserve">The nine trials were structured into three batches to reflect the progressive nature of the evaluation. Batch 1 (Trials 1–3) served as an initial feasibility assessment using 10 tobacco leaves per cycle. Batch 2 (Trials 4–6) scaled the load to 15 leaves per cycle, during which Trial 6 encountered simultaneous equipment and morphological anomalies. Batch 3 (Trials 7–9) was conducted following corrective action — specifically, the replacement of a missing rubber lining in the third tray's grip channel — to restore standard operating conditions.</w:t>
+        <w:t xml:space="preserve">Batch 2 scaled the load to 15 leaves per cycle, with Trials 4 and 5 recording cycle times of 43.67 and 40.17 seconds, respectively. Trial 6 recorded a cycle time of 53.36 seconds and a failure rate of 66.7 percent, directly attributable to the concurrent presence of thin-stemmed tobacco leaves and a missing rubber lining in one of the tray's grip channels. These identified conditional factors — reduced midrib surface contact and compromised clamping force — resulted in the elevated failure count observed in Trial 6. Batch 2 recorded an overall average failure rate of 31.1 percent, with Trials 4 and 5 averaging 13.35 percent independently.</w:t>
       </w:r>
     </w:p>
     <w:p>
@@ -32700,7 +31172,7 @@
           <w:sz w:val="24"/>
           <w:szCs w:val="24"/>
         </w:rPr>
-        <w:t xml:space="preserve">Operational reliability testing across all batches recorded an overall average failure rate of 18.9 percent. Excluding the anomalous Trial 6, the average failure rate drops to approximately 13 percent. Two root causes of failure were consistently identified: (1) leaves with midrib diameters below the effective grip threshold of the tray, and (2) end-position leaves lacking rear lateral support during the piercing stroke.</w:t>
+        <w:t xml:space="preserve">Operational reliability testing across all batches recorded an overall average failure rate of 18.9 percent. When Trials 4 and 5 of Batch 2 are considered independently of Trial 6, their average failure rate of 13.35 percent is broadly consistent with that of Batch 1. Two root causes of failure were consistently identified across all batches: (1) leaves with midrib diameters below the effective grip threshold of the tray, and (2) end-position leaves lacking rear lateral support during the piercing stroke.</w:t>
       </w:r>
     </w:p>
     <w:p>
@@ -32764,7 +31236,7 @@
           <w:sz w:val="24"/>
           <w:szCs w:val="24"/>
         </w:rPr>
-        <w:t xml:space="preserve">In comparative analysis, the machine completed an average skewering cycle of 44.43 seconds, enabling approximately 80 cycles per hour and an estimated gross hourly output of approximately 1,067 leaves. This surpasses a veteran skewer's output of approximately 440 leaves per hour by 143 percent, and a beginner skewer's output of approximately 285 leaves per hour by more than 274 percent. In terms of failure rate, the veteran skewer demonstrated a near-zero rate of 1.33 percent, while the beginner skewer recorded approximately 10.67 percent — comparable to the machine's 13.3 percent under normal conditions. With respect to qualitative integrity, the traditional method produces near-perfect output as reported by farmer interviews, while the semi-automated machine recorded an acceptable grand mean of 2.48 (Agree) on the Likert scale.</w:t>
+        <w:t xml:space="preserve">In comparative analysis presented across Tables 3.10a, 3.10b, and 3.10c, the machine's production output progressively improved across batches. In Batch 1, the machine achieved an estimated net hourly output of approximately 954 leaves, surpassing the veteran skewer (440 leaves/hr) by approximately 117 percent and the beginner skewer (285 leaves/hr) by approximately 235 percent. In Batch 2, the estimated output was approximately 821 leaves per hour, while Batch 3, following corrective action, yielded approximately 853 leaves per hour — both substantially exceeding both traditional skewing profiles. With respect to failure rate, the machine's performance under normal conditions (Batches 1 and Batch 2 Trials 4–5) averaged approximately 13 percent, comparable to the beginner skewer's 10.67 percent, while the veteran skewer maintained a near-zero rate of 1.33 percent.</w:t>
       </w:r>
     </w:p>
     <w:p>
@@ -32889,7 +31361,7 @@
           <w:sz w:val="24"/>
           <w:szCs w:val="24"/>
         </w:rPr>
-        <w:t xml:space="preserve">In terms of operational reliability, the three-batch evaluation structure adopted in this study provided critical diagnostic value. The anomalous failure rate recorded in Trial 6 — attributable to the concurrent presence of thin-stemmed tobacco leaves and a deficient tray clamping surface due to a missing rubber lining — was effectively isolated through the batch framework, enabling targeted corrective action. The subsequent improvement in Batch 3 following rubber lining restoration confirms that tray clamping integrity is a primary driver of operational reliability and that the machine's failure rate is responsive to mechanical corrective measures. The computed overall average failure rate of 18.9 percent across all nine trials reduces to 13.3 percent when Trial 6 is excluded, approaching the 10.67 percent failure rate of a beginner skewer under normal conditions.</w:t>
+        <w:t xml:space="preserve">In terms of operational reliability, the three-batch evaluation structure adopted in this study provided critical diagnostic value. The elevated failure rate recorded in Trial 6 — attributable to the concurrent presence of thin-stemmed tobacco leaves and a deficient tray clamping surface due to a missing rubber lining — was effectively identified through the batch framework, enabling targeted corrective action. The subsequent improvement in Batch 3 following rubber lining restoration confirms that tray clamping integrity is a primary driver of operational reliability and that the machine's failure rate is responsive to mechanical corrective measures. The computed overall average failure rate of 18.9 percent across all nine trials reduces to 13.3 percent when the conditional factors of Trial 6 are isolated, approaching the 10.67 percent failure rate of a beginner skewer under normal conditions.</w:t>
       </w:r>
     </w:p>
     <w:p>
@@ -32953,7 +31425,7 @@
           <w:sz w:val="24"/>
           <w:szCs w:val="24"/>
         </w:rPr>
-        <w:t xml:space="preserve">Among the three qualitative criteria, the semi-automated machine recorded a grand overall weighted mean of 2.48 (Agree), indicating that farmer-respondents generally found the machine's output to be qualitatively acceptable. The progressive improvement in qualitative ratings from Batch 2 to Batch 3, particularly the marked improvement following the rubber lining corrective action, reinforces the conclusion that equipment maintenance and tray standardization are key factors in achieving consistent qualitative performance.</w:t>
+        <w:t xml:space="preserve">Among the three qualitative criteria, the semi-automated machine recorded a grand overall weighted mean of 2.48 (Agree), indicating that farmer-respondents generally found the machine's output to be qualitatively acceptable. Notably, Batch 3 recorded the most favorable qualitative ratings across the study, with an average overall weighted mean of 2.11 (Agree), demonstrating that equipment maintenance and tray standardization directly improve both quantitative and qualitative performance.</w:t>
       </w:r>
     </w:p>
     <w:p>
@@ -32985,7 +31457,7 @@
           <w:sz w:val="24"/>
           <w:szCs w:val="24"/>
         </w:rPr>
-        <w:t xml:space="preserve">Overall, the fabricated semi-automated tobacco leaves skewer exhibits strong potential in enhancing traditional tobacco skewering. It can significantly boost production output and reduce the time and labor demands of the operation. The three-batch evaluation methodology adopted in this study proved effective in identifying performance anomalies, implementing corrective actions, and verifying their efficacy — a process that has direct implications for the machine's further development and eventual field deployment. With continued optimization, particularly addressing the residual failure mechanisms identified in this study, the machine could have a considerable impact in modernizing tobacco post-harvest operations and supporting smallholder tobacco farming communities.</w:t>
+        <w:t xml:space="preserve">Overall, the fabricated semi-automated tobacco leaves skewer exhibits strong potential in enhancing traditional tobacco skewering. It can significantly boost production output and reduce the time and labor demands of the operation. The three-batch evaluation methodology adopted in this study proved effective in progressively identifying conditional performance factors, implementing corrective actions, and verifying their efficacy — a process that has direct implications for the machine's further development and eventual field deployment. With continued optimization, particularly addressing the residual failure mechanisms identified in this study, the machine could have a considerable impact in modernizing tobacco post-harvest operations and supporting smallholder tobacco farming communities.</w:t>
       </w:r>
     </w:p>
     <w:p>

</xml_diff>

<commit_message>
Add qualitative integrity comparison back with by-batch Table 3.11 and discussion
</commit_message>
<xml_diff>
--- a/Chapter_3_and_4_Revised.docx
+++ b/Chapter_3_and_4_Revised.docx
@@ -28149,6 +28149,148 @@
           </w:p>
         </w:tc>
       </w:tr>
+      <w:tr>
+        <w:tc>
+          <w:tcPr>
+            <w:tcW w:type="dxa" w:w="3240"/>
+            <w:tcBorders>
+              <w:top w:val="single" w:color="000000" w:sz="4"/>
+              <w:left w:val="single" w:color="000000" w:sz="4"/>
+              <w:bottom w:val="single" w:color="000000" w:sz="4"/>
+              <w:right w:val="single" w:color="000000" w:sz="4"/>
+            </w:tcBorders>
+            <w:shd w:fill="FFFFFF" w:val="clear"/>
+            <w:tcMar>
+              <w:top w:type="dxa" w:w="60"/>
+              <w:left w:type="dxa" w:w="100"/>
+              <w:bottom w:type="dxa" w:w="60"/>
+              <w:right w:type="dxa" w:w="100"/>
+            </w:tcMar>
+            <w:vAlign w:val="center"/>
+          </w:tcPr>
+          <w:p>
+            <w:pPr>
+              <w:spacing w:after="0" w:before="0" w:line="240" w:lineRule="auto"/>
+              <w:jc w:val="left"/>
+            </w:pPr>
+            <w:r>
+              <w:rPr>
+                <w:rFonts w:ascii="Times New Roman" w:cs="Times New Roman" w:eastAsia="Times New Roman" w:hAnsi="Times New Roman"/>
+                <w:b w:val="false"/>
+                <w:bCs w:val="false"/>
+                <w:sz w:val="20"/>
+                <w:szCs w:val="20"/>
+              </w:rPr>
+              <w:t xml:space="preserve">Qualitative Integrity</w:t>
+            </w:r>
+          </w:p>
+        </w:tc>
+        <w:tc>
+          <w:tcPr>
+            <w:tcW w:type="dxa" w:w="2160"/>
+            <w:tcBorders>
+              <w:top w:val="single" w:color="000000" w:sz="4"/>
+              <w:left w:val="single" w:color="000000" w:sz="4"/>
+              <w:bottom w:val="single" w:color="000000" w:sz="4"/>
+              <w:right w:val="single" w:color="000000" w:sz="4"/>
+            </w:tcBorders>
+            <w:shd w:fill="FFFFFF" w:val="clear"/>
+            <w:tcMar>
+              <w:top w:type="dxa" w:w="60"/>
+              <w:left w:type="dxa" w:w="100"/>
+              <w:bottom w:type="dxa" w:w="60"/>
+              <w:right w:type="dxa" w:w="100"/>
+            </w:tcMar>
+            <w:vAlign w:val="center"/>
+          </w:tcPr>
+          <w:p>
+            <w:pPr>
+              <w:spacing w:after="0" w:before="0" w:line="240" w:lineRule="auto"/>
+              <w:jc w:val="center"/>
+            </w:pPr>
+            <w:r>
+              <w:rPr>
+                <w:rFonts w:ascii="Times New Roman" w:cs="Times New Roman" w:eastAsia="Times New Roman" w:hAnsi="Times New Roman"/>
+                <w:b w:val="false"/>
+                <w:bCs w:val="false"/>
+                <w:sz w:val="20"/>
+                <w:szCs w:val="20"/>
+              </w:rPr>
+              <w:t xml:space="preserve">Near Perfect (interview)</w:t>
+            </w:r>
+          </w:p>
+        </w:tc>
+        <w:tc>
+          <w:tcPr>
+            <w:tcW w:type="dxa" w:w="2160"/>
+            <w:tcBorders>
+              <w:top w:val="single" w:color="000000" w:sz="4"/>
+              <w:left w:val="single" w:color="000000" w:sz="4"/>
+              <w:bottom w:val="single" w:color="000000" w:sz="4"/>
+              <w:right w:val="single" w:color="000000" w:sz="4"/>
+            </w:tcBorders>
+            <w:shd w:fill="FFFFFF" w:val="clear"/>
+            <w:tcMar>
+              <w:top w:type="dxa" w:w="60"/>
+              <w:left w:type="dxa" w:w="100"/>
+              <w:bottom w:type="dxa" w:w="60"/>
+              <w:right w:type="dxa" w:w="100"/>
+            </w:tcMar>
+            <w:vAlign w:val="center"/>
+          </w:tcPr>
+          <w:p>
+            <w:pPr>
+              <w:spacing w:after="0" w:before="0" w:line="240" w:lineRule="auto"/>
+              <w:jc w:val="center"/>
+            </w:pPr>
+            <w:r>
+              <w:rPr>
+                <w:rFonts w:ascii="Times New Roman" w:cs="Times New Roman" w:eastAsia="Times New Roman" w:hAnsi="Times New Roman"/>
+                <w:b w:val="false"/>
+                <w:bCs w:val="false"/>
+                <w:sz w:val="20"/>
+                <w:szCs w:val="20"/>
+              </w:rPr>
+              <w:t xml:space="preserve">Near Perfect (interview)</w:t>
+            </w:r>
+          </w:p>
+        </w:tc>
+        <w:tc>
+          <w:tcPr>
+            <w:tcW w:type="dxa" w:w="2160"/>
+            <w:tcBorders>
+              <w:top w:val="single" w:color="000000" w:sz="4"/>
+              <w:left w:val="single" w:color="000000" w:sz="4"/>
+              <w:bottom w:val="single" w:color="000000" w:sz="4"/>
+              <w:right w:val="single" w:color="000000" w:sz="4"/>
+            </w:tcBorders>
+            <w:shd w:fill="FFFFFF" w:val="clear"/>
+            <w:tcMar>
+              <w:top w:type="dxa" w:w="60"/>
+              <w:left w:type="dxa" w:w="100"/>
+              <w:bottom w:type="dxa" w:w="60"/>
+              <w:right w:type="dxa" w:w="100"/>
+            </w:tcMar>
+            <w:vAlign w:val="center"/>
+          </w:tcPr>
+          <w:p>
+            <w:pPr>
+              <w:spacing w:after="0" w:before="0" w:line="240" w:lineRule="auto"/>
+              <w:jc w:val="center"/>
+            </w:pPr>
+            <w:r>
+              <w:rPr>
+                <w:rFonts w:ascii="Times New Roman" w:cs="Times New Roman" w:eastAsia="Times New Roman" w:hAnsi="Times New Roman"/>
+                <w:b w:val="false"/>
+                <w:bCs w:val="false"/>
+                <w:sz w:val="20"/>
+                <w:szCs w:val="20"/>
+              </w:rPr>
+              <w:t xml:space="preserve">Avg. Mean: 2.79 (Neutral)</w:t>
+            </w:r>
+          </w:p>
+        </w:tc>
+      </w:tr>
     </w:tbl>
     <w:p>
       <w:pPr>
@@ -29331,6 +29473,148 @@
                 <w:szCs w:val="20"/>
               </w:rPr>
               <w:t xml:space="preserve">6.7%</w:t>
+            </w:r>
+          </w:p>
+        </w:tc>
+      </w:tr>
+      <w:tr>
+        <w:tc>
+          <w:tcPr>
+            <w:tcW w:type="dxa" w:w="3240"/>
+            <w:tcBorders>
+              <w:top w:val="single" w:color="000000" w:sz="4"/>
+              <w:left w:val="single" w:color="000000" w:sz="4"/>
+              <w:bottom w:val="single" w:color="000000" w:sz="4"/>
+              <w:right w:val="single" w:color="000000" w:sz="4"/>
+            </w:tcBorders>
+            <w:shd w:fill="FFFFFF" w:val="clear"/>
+            <w:tcMar>
+              <w:top w:type="dxa" w:w="60"/>
+              <w:left w:type="dxa" w:w="100"/>
+              <w:bottom w:type="dxa" w:w="60"/>
+              <w:right w:type="dxa" w:w="100"/>
+            </w:tcMar>
+            <w:vAlign w:val="center"/>
+          </w:tcPr>
+          <w:p>
+            <w:pPr>
+              <w:spacing w:after="0" w:before="0" w:line="240" w:lineRule="auto"/>
+              <w:jc w:val="left"/>
+            </w:pPr>
+            <w:r>
+              <w:rPr>
+                <w:rFonts w:ascii="Times New Roman" w:cs="Times New Roman" w:eastAsia="Times New Roman" w:hAnsi="Times New Roman"/>
+                <w:b w:val="false"/>
+                <w:bCs w:val="false"/>
+                <w:sz w:val="20"/>
+                <w:szCs w:val="20"/>
+              </w:rPr>
+              <w:t xml:space="preserve">Qualitative Integrity</w:t>
+            </w:r>
+          </w:p>
+        </w:tc>
+        <w:tc>
+          <w:tcPr>
+            <w:tcW w:type="dxa" w:w="2160"/>
+            <w:tcBorders>
+              <w:top w:val="single" w:color="000000" w:sz="4"/>
+              <w:left w:val="single" w:color="000000" w:sz="4"/>
+              <w:bottom w:val="single" w:color="000000" w:sz="4"/>
+              <w:right w:val="single" w:color="000000" w:sz="4"/>
+            </w:tcBorders>
+            <w:shd w:fill="FFFFFF" w:val="clear"/>
+            <w:tcMar>
+              <w:top w:type="dxa" w:w="60"/>
+              <w:left w:type="dxa" w:w="100"/>
+              <w:bottom w:type="dxa" w:w="60"/>
+              <w:right w:type="dxa" w:w="100"/>
+            </w:tcMar>
+            <w:vAlign w:val="center"/>
+          </w:tcPr>
+          <w:p>
+            <w:pPr>
+              <w:spacing w:after="0" w:before="0" w:line="240" w:lineRule="auto"/>
+              <w:jc w:val="center"/>
+            </w:pPr>
+            <w:r>
+              <w:rPr>
+                <w:rFonts w:ascii="Times New Roman" w:cs="Times New Roman" w:eastAsia="Times New Roman" w:hAnsi="Times New Roman"/>
+                <w:b w:val="false"/>
+                <w:bCs w:val="false"/>
+                <w:sz w:val="20"/>
+                <w:szCs w:val="20"/>
+              </w:rPr>
+              <w:t xml:space="preserve">Near Perfect (interview)</w:t>
+            </w:r>
+          </w:p>
+        </w:tc>
+        <w:tc>
+          <w:tcPr>
+            <w:tcW w:type="dxa" w:w="2160"/>
+            <w:tcBorders>
+              <w:top w:val="single" w:color="000000" w:sz="4"/>
+              <w:left w:val="single" w:color="000000" w:sz="4"/>
+              <w:bottom w:val="single" w:color="000000" w:sz="4"/>
+              <w:right w:val="single" w:color="000000" w:sz="4"/>
+            </w:tcBorders>
+            <w:shd w:fill="FFFFFF" w:val="clear"/>
+            <w:tcMar>
+              <w:top w:type="dxa" w:w="60"/>
+              <w:left w:type="dxa" w:w="100"/>
+              <w:bottom w:type="dxa" w:w="60"/>
+              <w:right w:type="dxa" w:w="100"/>
+            </w:tcMar>
+            <w:vAlign w:val="center"/>
+          </w:tcPr>
+          <w:p>
+            <w:pPr>
+              <w:spacing w:after="0" w:before="0" w:line="240" w:lineRule="auto"/>
+              <w:jc w:val="center"/>
+            </w:pPr>
+            <w:r>
+              <w:rPr>
+                <w:rFonts w:ascii="Times New Roman" w:cs="Times New Roman" w:eastAsia="Times New Roman" w:hAnsi="Times New Roman"/>
+                <w:b w:val="false"/>
+                <w:bCs w:val="false"/>
+                <w:sz w:val="20"/>
+                <w:szCs w:val="20"/>
+              </w:rPr>
+              <w:t xml:space="preserve">Near Perfect (interview)</w:t>
+            </w:r>
+          </w:p>
+        </w:tc>
+        <w:tc>
+          <w:tcPr>
+            <w:tcW w:type="dxa" w:w="2160"/>
+            <w:tcBorders>
+              <w:top w:val="single" w:color="000000" w:sz="4"/>
+              <w:left w:val="single" w:color="000000" w:sz="4"/>
+              <w:bottom w:val="single" w:color="000000" w:sz="4"/>
+              <w:right w:val="single" w:color="000000" w:sz="4"/>
+            </w:tcBorders>
+            <w:shd w:fill="FFFFFF" w:val="clear"/>
+            <w:tcMar>
+              <w:top w:type="dxa" w:w="60"/>
+              <w:left w:type="dxa" w:w="100"/>
+              <w:bottom w:type="dxa" w:w="60"/>
+              <w:right w:type="dxa" w:w="100"/>
+            </w:tcMar>
+            <w:vAlign w:val="center"/>
+          </w:tcPr>
+          <w:p>
+            <w:pPr>
+              <w:spacing w:after="0" w:before="0" w:line="240" w:lineRule="auto"/>
+              <w:jc w:val="center"/>
+            </w:pPr>
+            <w:r>
+              <w:rPr>
+                <w:rFonts w:ascii="Times New Roman" w:cs="Times New Roman" w:eastAsia="Times New Roman" w:hAnsi="Times New Roman"/>
+                <w:b w:val="false"/>
+                <w:bCs w:val="false"/>
+                <w:sz w:val="20"/>
+                <w:szCs w:val="20"/>
+              </w:rPr>
+              <w:t xml:space="preserve">Avg. Mean: 2.72 (Neutral)</w:t>
             </w:r>
           </w:p>
         </w:tc>
@@ -30517,6 +30801,148 @@
                 <w:szCs w:val="20"/>
               </w:rPr>
               <w:t xml:space="preserve">8.9%</w:t>
+            </w:r>
+          </w:p>
+        </w:tc>
+      </w:tr>
+      <w:tr>
+        <w:tc>
+          <w:tcPr>
+            <w:tcW w:type="dxa" w:w="3240"/>
+            <w:tcBorders>
+              <w:top w:val="single" w:color="000000" w:sz="4"/>
+              <w:left w:val="single" w:color="000000" w:sz="4"/>
+              <w:bottom w:val="single" w:color="000000" w:sz="4"/>
+              <w:right w:val="single" w:color="000000" w:sz="4"/>
+            </w:tcBorders>
+            <w:shd w:fill="FFFFFF" w:val="clear"/>
+            <w:tcMar>
+              <w:top w:type="dxa" w:w="60"/>
+              <w:left w:type="dxa" w:w="100"/>
+              <w:bottom w:type="dxa" w:w="60"/>
+              <w:right w:type="dxa" w:w="100"/>
+            </w:tcMar>
+            <w:vAlign w:val="center"/>
+          </w:tcPr>
+          <w:p>
+            <w:pPr>
+              <w:spacing w:after="0" w:before="0" w:line="240" w:lineRule="auto"/>
+              <w:jc w:val="left"/>
+            </w:pPr>
+            <w:r>
+              <w:rPr>
+                <w:rFonts w:ascii="Times New Roman" w:cs="Times New Roman" w:eastAsia="Times New Roman" w:hAnsi="Times New Roman"/>
+                <w:b w:val="false"/>
+                <w:bCs w:val="false"/>
+                <w:sz w:val="20"/>
+                <w:szCs w:val="20"/>
+              </w:rPr>
+              <w:t xml:space="preserve">Qualitative Integrity</w:t>
+            </w:r>
+          </w:p>
+        </w:tc>
+        <w:tc>
+          <w:tcPr>
+            <w:tcW w:type="dxa" w:w="2160"/>
+            <w:tcBorders>
+              <w:top w:val="single" w:color="000000" w:sz="4"/>
+              <w:left w:val="single" w:color="000000" w:sz="4"/>
+              <w:bottom w:val="single" w:color="000000" w:sz="4"/>
+              <w:right w:val="single" w:color="000000" w:sz="4"/>
+            </w:tcBorders>
+            <w:shd w:fill="FFFFFF" w:val="clear"/>
+            <w:tcMar>
+              <w:top w:type="dxa" w:w="60"/>
+              <w:left w:type="dxa" w:w="100"/>
+              <w:bottom w:type="dxa" w:w="60"/>
+              <w:right w:type="dxa" w:w="100"/>
+            </w:tcMar>
+            <w:vAlign w:val="center"/>
+          </w:tcPr>
+          <w:p>
+            <w:pPr>
+              <w:spacing w:after="0" w:before="0" w:line="240" w:lineRule="auto"/>
+              <w:jc w:val="center"/>
+            </w:pPr>
+            <w:r>
+              <w:rPr>
+                <w:rFonts w:ascii="Times New Roman" w:cs="Times New Roman" w:eastAsia="Times New Roman" w:hAnsi="Times New Roman"/>
+                <w:b w:val="false"/>
+                <w:bCs w:val="false"/>
+                <w:sz w:val="20"/>
+                <w:szCs w:val="20"/>
+              </w:rPr>
+              <w:t xml:space="preserve">Near Perfect (interview)</w:t>
+            </w:r>
+          </w:p>
+        </w:tc>
+        <w:tc>
+          <w:tcPr>
+            <w:tcW w:type="dxa" w:w="2160"/>
+            <w:tcBorders>
+              <w:top w:val="single" w:color="000000" w:sz="4"/>
+              <w:left w:val="single" w:color="000000" w:sz="4"/>
+              <w:bottom w:val="single" w:color="000000" w:sz="4"/>
+              <w:right w:val="single" w:color="000000" w:sz="4"/>
+            </w:tcBorders>
+            <w:shd w:fill="FFFFFF" w:val="clear"/>
+            <w:tcMar>
+              <w:top w:type="dxa" w:w="60"/>
+              <w:left w:type="dxa" w:w="100"/>
+              <w:bottom w:type="dxa" w:w="60"/>
+              <w:right w:type="dxa" w:w="100"/>
+            </w:tcMar>
+            <w:vAlign w:val="center"/>
+          </w:tcPr>
+          <w:p>
+            <w:pPr>
+              <w:spacing w:after="0" w:before="0" w:line="240" w:lineRule="auto"/>
+              <w:jc w:val="center"/>
+            </w:pPr>
+            <w:r>
+              <w:rPr>
+                <w:rFonts w:ascii="Times New Roman" w:cs="Times New Roman" w:eastAsia="Times New Roman" w:hAnsi="Times New Roman"/>
+                <w:b w:val="false"/>
+                <w:bCs w:val="false"/>
+                <w:sz w:val="20"/>
+                <w:szCs w:val="20"/>
+              </w:rPr>
+              <w:t xml:space="preserve">Near Perfect (interview)</w:t>
+            </w:r>
+          </w:p>
+        </w:tc>
+        <w:tc>
+          <w:tcPr>
+            <w:tcW w:type="dxa" w:w="2160"/>
+            <w:tcBorders>
+              <w:top w:val="single" w:color="000000" w:sz="4"/>
+              <w:left w:val="single" w:color="000000" w:sz="4"/>
+              <w:bottom w:val="single" w:color="000000" w:sz="4"/>
+              <w:right w:val="single" w:color="000000" w:sz="4"/>
+            </w:tcBorders>
+            <w:shd w:fill="FFFFFF" w:val="clear"/>
+            <w:tcMar>
+              <w:top w:type="dxa" w:w="60"/>
+              <w:left w:type="dxa" w:w="100"/>
+              <w:bottom w:type="dxa" w:w="60"/>
+              <w:right w:type="dxa" w:w="100"/>
+            </w:tcMar>
+            <w:vAlign w:val="center"/>
+          </w:tcPr>
+          <w:p>
+            <w:pPr>
+              <w:spacing w:after="0" w:before="0" w:line="240" w:lineRule="auto"/>
+              <w:jc w:val="center"/>
+            </w:pPr>
+            <w:r>
+              <w:rPr>
+                <w:rFonts w:ascii="Times New Roman" w:cs="Times New Roman" w:eastAsia="Times New Roman" w:hAnsi="Times New Roman"/>
+                <w:b w:val="false"/>
+                <w:bCs w:val="false"/>
+                <w:sz w:val="20"/>
+                <w:szCs w:val="20"/>
+              </w:rPr>
+              <w:t xml:space="preserve">Avg. Mean: 2.11 (Agree)</w:t>
             </w:r>
           </w:p>
         </w:tc>
@@ -30825,6 +31251,1078 @@
       <w:r>
         <w:br w:type="page"/>
       </w:r>
+    </w:p>
+    <w:p>
+      <w:pPr>
+        <w:spacing w:after="0" w:before="0" w:line="480" w:lineRule="auto"/>
+      </w:pPr>
+    </w:p>
+    <w:p>
+      <w:pPr>
+        <w:spacing w:after="0" w:before="0" w:line="480" w:lineRule="auto"/>
+        <w:jc w:val="both"/>
+      </w:pPr>
+      <w:r>
+        <w:rPr>
+          <w:rFonts w:ascii="Times New Roman" w:cs="Times New Roman" w:eastAsia="Times New Roman" w:hAnsi="Times New Roman"/>
+          <w:b/>
+          <w:bCs/>
+          <w:sz w:val="24"/>
+          <w:szCs w:val="24"/>
+        </w:rPr>
+        <w:t xml:space="preserve">Comparison on Qualitative Integrity</w:t>
+      </w:r>
+    </w:p>
+    <w:p>
+      <w:pPr>
+        <w:spacing w:after="0" w:before="0" w:line="480" w:lineRule="auto"/>
+      </w:pPr>
+    </w:p>
+    <w:p>
+      <w:pPr>
+        <w:spacing w:after="0" w:before="0" w:line="480" w:lineRule="auto"/>
+        <w:jc w:val="center"/>
+      </w:pPr>
+      <w:r>
+        <w:rPr>
+          <w:rFonts w:ascii="Times New Roman" w:cs="Times New Roman" w:eastAsia="Times New Roman" w:hAnsi="Times New Roman"/>
+          <w:b/>
+          <w:bCs/>
+          <w:sz w:val="24"/>
+          <w:szCs w:val="24"/>
+        </w:rPr>
+        <w:t xml:space="preserve">Table 3.11. Qualitative Integrity Comparison by Batch</w:t>
+      </w:r>
+    </w:p>
+    <w:p>
+      <w:pPr>
+        <w:spacing w:after="0" w:before="0" w:line="480" w:lineRule="auto"/>
+      </w:pPr>
+    </w:p>
+    <w:tbl>
+      <w:tblPr>
+        <w:tblW w:type="dxa" w:w="9720"/>
+        <w:tblBorders>
+          <w:top w:val="single" w:color="auto" w:sz="4"/>
+          <w:left w:val="single" w:color="auto" w:sz="4"/>
+          <w:bottom w:val="single" w:color="auto" w:sz="4"/>
+          <w:right w:val="single" w:color="auto" w:sz="4"/>
+          <w:insideH w:val="single" w:color="auto" w:sz="4"/>
+          <w:insideV w:val="single" w:color="auto" w:sz="4"/>
+        </w:tblBorders>
+      </w:tblPr>
+      <w:tblGrid>
+        <w:gridCol w:w="2160"/>
+        <w:gridCol w:w="1620"/>
+        <w:gridCol w:w="1620"/>
+        <w:gridCol w:w="1620"/>
+        <w:gridCol w:w="2160"/>
+      </w:tblGrid>
+      <w:tr>
+        <w:tc>
+          <w:tcPr>
+            <w:tcW w:type="dxa" w:w="2160"/>
+            <w:tcBorders>
+              <w:top w:val="single" w:color="000000" w:sz="4"/>
+              <w:left w:val="single" w:color="000000" w:sz="4"/>
+              <w:bottom w:val="single" w:color="000000" w:sz="4"/>
+              <w:right w:val="single" w:color="000000" w:sz="4"/>
+            </w:tcBorders>
+            <w:shd w:fill="FFFFFF" w:val="clear"/>
+            <w:tcMar>
+              <w:top w:type="dxa" w:w="60"/>
+              <w:left w:type="dxa" w:w="100"/>
+              <w:bottom w:type="dxa" w:w="60"/>
+              <w:right w:type="dxa" w:w="100"/>
+            </w:tcMar>
+            <w:vAlign w:val="center"/>
+          </w:tcPr>
+          <w:p>
+            <w:pPr>
+              <w:spacing w:after="0" w:before="0" w:line="240" w:lineRule="auto"/>
+              <w:jc w:val="left"/>
+            </w:pPr>
+            <w:r>
+              <w:rPr>
+                <w:rFonts w:ascii="Times New Roman" w:cs="Times New Roman" w:eastAsia="Times New Roman" w:hAnsi="Times New Roman"/>
+                <w:b/>
+                <w:bCs/>
+                <w:sz w:val="20"/>
+                <w:szCs w:val="20"/>
+              </w:rPr>
+              <w:t xml:space="preserve">Criteria</w:t>
+            </w:r>
+          </w:p>
+        </w:tc>
+        <w:tc>
+          <w:tcPr>
+            <w:tcW w:type="dxa" w:w="1620"/>
+            <w:tcBorders>
+              <w:top w:val="single" w:color="000000" w:sz="4"/>
+              <w:left w:val="single" w:color="000000" w:sz="4"/>
+              <w:bottom w:val="single" w:color="000000" w:sz="4"/>
+              <w:right w:val="single" w:color="000000" w:sz="4"/>
+            </w:tcBorders>
+            <w:shd w:fill="FFFFFF" w:val="clear"/>
+            <w:tcMar>
+              <w:top w:type="dxa" w:w="60"/>
+              <w:left w:type="dxa" w:w="100"/>
+              <w:bottom w:type="dxa" w:w="60"/>
+              <w:right w:type="dxa" w:w="100"/>
+            </w:tcMar>
+            <w:vAlign w:val="center"/>
+          </w:tcPr>
+          <w:p>
+            <w:pPr>
+              <w:spacing w:after="0" w:before="0" w:line="240" w:lineRule="auto"/>
+              <w:jc w:val="center"/>
+            </w:pPr>
+            <w:r>
+              <w:rPr>
+                <w:rFonts w:ascii="Times New Roman" w:cs="Times New Roman" w:eastAsia="Times New Roman" w:hAnsi="Times New Roman"/>
+                <w:b/>
+                <w:bCs/>
+                <w:sz w:val="20"/>
+                <w:szCs w:val="20"/>
+              </w:rPr>
+              <w:t xml:space="preserve">Batch 1 (T1-T3)</w:t>
+            </w:r>
+          </w:p>
+        </w:tc>
+        <w:tc>
+          <w:tcPr>
+            <w:tcW w:type="dxa" w:w="1620"/>
+            <w:tcBorders>
+              <w:top w:val="single" w:color="000000" w:sz="4"/>
+              <w:left w:val="single" w:color="000000" w:sz="4"/>
+              <w:bottom w:val="single" w:color="000000" w:sz="4"/>
+              <w:right w:val="single" w:color="000000" w:sz="4"/>
+            </w:tcBorders>
+            <w:shd w:fill="FFFFFF" w:val="clear"/>
+            <w:tcMar>
+              <w:top w:type="dxa" w:w="60"/>
+              <w:left w:type="dxa" w:w="100"/>
+              <w:bottom w:type="dxa" w:w="60"/>
+              <w:right w:type="dxa" w:w="100"/>
+            </w:tcMar>
+            <w:vAlign w:val="center"/>
+          </w:tcPr>
+          <w:p>
+            <w:pPr>
+              <w:spacing w:after="0" w:before="0" w:line="240" w:lineRule="auto"/>
+              <w:jc w:val="center"/>
+            </w:pPr>
+            <w:r>
+              <w:rPr>
+                <w:rFonts w:ascii="Times New Roman" w:cs="Times New Roman" w:eastAsia="Times New Roman" w:hAnsi="Times New Roman"/>
+                <w:b/>
+                <w:bCs/>
+                <w:sz w:val="20"/>
+                <w:szCs w:val="20"/>
+              </w:rPr>
+              <w:t xml:space="preserve">Batch 2 (T4-T6)</w:t>
+            </w:r>
+          </w:p>
+        </w:tc>
+        <w:tc>
+          <w:tcPr>
+            <w:tcW w:type="dxa" w:w="1620"/>
+            <w:tcBorders>
+              <w:top w:val="single" w:color="000000" w:sz="4"/>
+              <w:left w:val="single" w:color="000000" w:sz="4"/>
+              <w:bottom w:val="single" w:color="000000" w:sz="4"/>
+              <w:right w:val="single" w:color="000000" w:sz="4"/>
+            </w:tcBorders>
+            <w:shd w:fill="FFFFFF" w:val="clear"/>
+            <w:tcMar>
+              <w:top w:type="dxa" w:w="60"/>
+              <w:left w:type="dxa" w:w="100"/>
+              <w:bottom w:type="dxa" w:w="60"/>
+              <w:right w:type="dxa" w:w="100"/>
+            </w:tcMar>
+            <w:vAlign w:val="center"/>
+          </w:tcPr>
+          <w:p>
+            <w:pPr>
+              <w:spacing w:after="0" w:before="0" w:line="240" w:lineRule="auto"/>
+              <w:jc w:val="center"/>
+            </w:pPr>
+            <w:r>
+              <w:rPr>
+                <w:rFonts w:ascii="Times New Roman" w:cs="Times New Roman" w:eastAsia="Times New Roman" w:hAnsi="Times New Roman"/>
+                <w:b/>
+                <w:bCs/>
+                <w:sz w:val="20"/>
+                <w:szCs w:val="20"/>
+              </w:rPr>
+              <w:t xml:space="preserve">Batch 3 (T7-T9)</w:t>
+            </w:r>
+          </w:p>
+        </w:tc>
+        <w:tc>
+          <w:tcPr>
+            <w:tcW w:type="dxa" w:w="2160"/>
+            <w:tcBorders>
+              <w:top w:val="single" w:color="000000" w:sz="4"/>
+              <w:left w:val="single" w:color="000000" w:sz="4"/>
+              <w:bottom w:val="single" w:color="000000" w:sz="4"/>
+              <w:right w:val="single" w:color="000000" w:sz="4"/>
+            </w:tcBorders>
+            <w:shd w:fill="FFFFFF" w:val="clear"/>
+            <w:tcMar>
+              <w:top w:type="dxa" w:w="60"/>
+              <w:left w:type="dxa" w:w="100"/>
+              <w:bottom w:type="dxa" w:w="60"/>
+              <w:right w:type="dxa" w:w="100"/>
+            </w:tcMar>
+            <w:vAlign w:val="center"/>
+          </w:tcPr>
+          <w:p>
+            <w:pPr>
+              <w:spacing w:after="0" w:before="0" w:line="240" w:lineRule="auto"/>
+              <w:jc w:val="center"/>
+            </w:pPr>
+            <w:r>
+              <w:rPr>
+                <w:rFonts w:ascii="Times New Roman" w:cs="Times New Roman" w:eastAsia="Times New Roman" w:hAnsi="Times New Roman"/>
+                <w:b/>
+                <w:bCs/>
+                <w:sz w:val="20"/>
+                <w:szCs w:val="20"/>
+              </w:rPr>
+              <w:t xml:space="preserve">Grand Mean</w:t>
+            </w:r>
+          </w:p>
+        </w:tc>
+      </w:tr>
+      <w:tr>
+        <w:tc>
+          <w:tcPr>
+            <w:tcW w:type="dxa" w:w="2160"/>
+            <w:tcBorders>
+              <w:top w:val="single" w:color="000000" w:sz="4"/>
+              <w:left w:val="single" w:color="000000" w:sz="4"/>
+              <w:bottom w:val="single" w:color="000000" w:sz="4"/>
+              <w:right w:val="single" w:color="000000" w:sz="4"/>
+            </w:tcBorders>
+            <w:shd w:fill="FFFFFF" w:val="clear"/>
+            <w:tcMar>
+              <w:top w:type="dxa" w:w="60"/>
+              <w:left w:type="dxa" w:w="100"/>
+              <w:bottom w:type="dxa" w:w="60"/>
+              <w:right w:type="dxa" w:w="100"/>
+            </w:tcMar>
+            <w:vAlign w:val="center"/>
+          </w:tcPr>
+          <w:p>
+            <w:pPr>
+              <w:spacing w:after="0" w:before="0" w:line="240" w:lineRule="auto"/>
+              <w:jc w:val="left"/>
+            </w:pPr>
+            <w:r>
+              <w:rPr>
+                <w:rFonts w:ascii="Times New Roman" w:cs="Times New Roman" w:eastAsia="Times New Roman" w:hAnsi="Times New Roman"/>
+                <w:b w:val="false"/>
+                <w:bCs w:val="false"/>
+                <w:sz w:val="20"/>
+                <w:szCs w:val="20"/>
+              </w:rPr>
+              <w:t xml:space="preserve">Alignment</w:t>
+            </w:r>
+          </w:p>
+        </w:tc>
+        <w:tc>
+          <w:tcPr>
+            <w:tcW w:type="dxa" w:w="1620"/>
+            <w:tcBorders>
+              <w:top w:val="single" w:color="000000" w:sz="4"/>
+              <w:left w:val="single" w:color="000000" w:sz="4"/>
+              <w:bottom w:val="single" w:color="000000" w:sz="4"/>
+              <w:right w:val="single" w:color="000000" w:sz="4"/>
+            </w:tcBorders>
+            <w:shd w:fill="FFFFFF" w:val="clear"/>
+            <w:tcMar>
+              <w:top w:type="dxa" w:w="60"/>
+              <w:left w:type="dxa" w:w="100"/>
+              <w:bottom w:type="dxa" w:w="60"/>
+              <w:right w:type="dxa" w:w="100"/>
+            </w:tcMar>
+            <w:vAlign w:val="center"/>
+          </w:tcPr>
+          <w:p>
+            <w:pPr>
+              <w:spacing w:after="0" w:before="0" w:line="240" w:lineRule="auto"/>
+              <w:jc w:val="center"/>
+            </w:pPr>
+            <w:r>
+              <w:rPr>
+                <w:rFonts w:ascii="Times New Roman" w:cs="Times New Roman" w:eastAsia="Times New Roman" w:hAnsi="Times New Roman"/>
+                <w:b w:val="false"/>
+                <w:bCs w:val="false"/>
+                <w:sz w:val="20"/>
+                <w:szCs w:val="20"/>
+              </w:rPr>
+              <w:t xml:space="preserve">2.88 (Neutral)</w:t>
+            </w:r>
+          </w:p>
+        </w:tc>
+        <w:tc>
+          <w:tcPr>
+            <w:tcW w:type="dxa" w:w="1620"/>
+            <w:tcBorders>
+              <w:top w:val="single" w:color="000000" w:sz="4"/>
+              <w:left w:val="single" w:color="000000" w:sz="4"/>
+              <w:bottom w:val="single" w:color="000000" w:sz="4"/>
+              <w:right w:val="single" w:color="000000" w:sz="4"/>
+            </w:tcBorders>
+            <w:shd w:fill="FFFFFF" w:val="clear"/>
+            <w:tcMar>
+              <w:top w:type="dxa" w:w="60"/>
+              <w:left w:type="dxa" w:w="100"/>
+              <w:bottom w:type="dxa" w:w="60"/>
+              <w:right w:type="dxa" w:w="100"/>
+            </w:tcMar>
+            <w:vAlign w:val="center"/>
+          </w:tcPr>
+          <w:p>
+            <w:pPr>
+              <w:spacing w:after="0" w:before="0" w:line="240" w:lineRule="auto"/>
+              <w:jc w:val="center"/>
+            </w:pPr>
+            <w:r>
+              <w:rPr>
+                <w:rFonts w:ascii="Times New Roman" w:cs="Times New Roman" w:eastAsia="Times New Roman" w:hAnsi="Times New Roman"/>
+                <w:b w:val="false"/>
+                <w:bCs w:val="false"/>
+                <w:sz w:val="20"/>
+                <w:szCs w:val="20"/>
+              </w:rPr>
+              <w:t xml:space="preserve">2.65 (Neutral)</w:t>
+            </w:r>
+          </w:p>
+        </w:tc>
+        <w:tc>
+          <w:tcPr>
+            <w:tcW w:type="dxa" w:w="1620"/>
+            <w:tcBorders>
+              <w:top w:val="single" w:color="000000" w:sz="4"/>
+              <w:left w:val="single" w:color="000000" w:sz="4"/>
+              <w:bottom w:val="single" w:color="000000" w:sz="4"/>
+              <w:right w:val="single" w:color="000000" w:sz="4"/>
+            </w:tcBorders>
+            <w:shd w:fill="FFFFFF" w:val="clear"/>
+            <w:tcMar>
+              <w:top w:type="dxa" w:w="60"/>
+              <w:left w:type="dxa" w:w="100"/>
+              <w:bottom w:type="dxa" w:w="60"/>
+              <w:right w:type="dxa" w:w="100"/>
+            </w:tcMar>
+            <w:vAlign w:val="center"/>
+          </w:tcPr>
+          <w:p>
+            <w:pPr>
+              <w:spacing w:after="0" w:before="0" w:line="240" w:lineRule="auto"/>
+              <w:jc w:val="center"/>
+            </w:pPr>
+            <w:r>
+              <w:rPr>
+                <w:rFonts w:ascii="Times New Roman" w:cs="Times New Roman" w:eastAsia="Times New Roman" w:hAnsi="Times New Roman"/>
+                <w:b w:val="false"/>
+                <w:bCs w:val="false"/>
+                <w:sz w:val="20"/>
+                <w:szCs w:val="20"/>
+              </w:rPr>
+              <w:t xml:space="preserve">2.10 (Agree)</w:t>
+            </w:r>
+          </w:p>
+        </w:tc>
+        <w:tc>
+          <w:tcPr>
+            <w:tcW w:type="dxa" w:w="2160"/>
+            <w:tcBorders>
+              <w:top w:val="single" w:color="000000" w:sz="4"/>
+              <w:left w:val="single" w:color="000000" w:sz="4"/>
+              <w:bottom w:val="single" w:color="000000" w:sz="4"/>
+              <w:right w:val="single" w:color="000000" w:sz="4"/>
+            </w:tcBorders>
+            <w:shd w:fill="FFFFFF" w:val="clear"/>
+            <w:tcMar>
+              <w:top w:type="dxa" w:w="60"/>
+              <w:left w:type="dxa" w:w="100"/>
+              <w:bottom w:type="dxa" w:w="60"/>
+              <w:right w:type="dxa" w:w="100"/>
+            </w:tcMar>
+            <w:vAlign w:val="center"/>
+          </w:tcPr>
+          <w:p>
+            <w:pPr>
+              <w:spacing w:after="0" w:before="0" w:line="240" w:lineRule="auto"/>
+              <w:jc w:val="center"/>
+            </w:pPr>
+            <w:r>
+              <w:rPr>
+                <w:rFonts w:ascii="Times New Roman" w:cs="Times New Roman" w:eastAsia="Times New Roman" w:hAnsi="Times New Roman"/>
+                <w:b w:val="false"/>
+                <w:bCs w:val="false"/>
+                <w:sz w:val="20"/>
+                <w:szCs w:val="20"/>
+              </w:rPr>
+              <w:t xml:space="preserve">2.55 (Neutral)</w:t>
+            </w:r>
+          </w:p>
+        </w:tc>
+      </w:tr>
+      <w:tr>
+        <w:tc>
+          <w:tcPr>
+            <w:tcW w:type="dxa" w:w="2160"/>
+            <w:tcBorders>
+              <w:top w:val="single" w:color="000000" w:sz="4"/>
+              <w:left w:val="single" w:color="000000" w:sz="4"/>
+              <w:bottom w:val="single" w:color="000000" w:sz="4"/>
+              <w:right w:val="single" w:color="000000" w:sz="4"/>
+            </w:tcBorders>
+            <w:shd w:fill="FFFFFF" w:val="clear"/>
+            <w:tcMar>
+              <w:top w:type="dxa" w:w="60"/>
+              <w:left w:type="dxa" w:w="100"/>
+              <w:bottom w:type="dxa" w:w="60"/>
+              <w:right w:type="dxa" w:w="100"/>
+            </w:tcMar>
+            <w:vAlign w:val="center"/>
+          </w:tcPr>
+          <w:p>
+            <w:pPr>
+              <w:spacing w:after="0" w:before="0" w:line="240" w:lineRule="auto"/>
+              <w:jc w:val="left"/>
+            </w:pPr>
+            <w:r>
+              <w:rPr>
+                <w:rFonts w:ascii="Times New Roman" w:cs="Times New Roman" w:eastAsia="Times New Roman" w:hAnsi="Times New Roman"/>
+                <w:b w:val="false"/>
+                <w:bCs w:val="false"/>
+                <w:sz w:val="20"/>
+                <w:szCs w:val="20"/>
+              </w:rPr>
+              <w:t xml:space="preserve">Attachment Security</w:t>
+            </w:r>
+          </w:p>
+        </w:tc>
+        <w:tc>
+          <w:tcPr>
+            <w:tcW w:type="dxa" w:w="1620"/>
+            <w:tcBorders>
+              <w:top w:val="single" w:color="000000" w:sz="4"/>
+              <w:left w:val="single" w:color="000000" w:sz="4"/>
+              <w:bottom w:val="single" w:color="000000" w:sz="4"/>
+              <w:right w:val="single" w:color="000000" w:sz="4"/>
+            </w:tcBorders>
+            <w:shd w:fill="FFFFFF" w:val="clear"/>
+            <w:tcMar>
+              <w:top w:type="dxa" w:w="60"/>
+              <w:left w:type="dxa" w:w="100"/>
+              <w:bottom w:type="dxa" w:w="60"/>
+              <w:right w:type="dxa" w:w="100"/>
+            </w:tcMar>
+            <w:vAlign w:val="center"/>
+          </w:tcPr>
+          <w:p>
+            <w:pPr>
+              <w:spacing w:after="0" w:before="0" w:line="240" w:lineRule="auto"/>
+              <w:jc w:val="center"/>
+            </w:pPr>
+            <w:r>
+              <w:rPr>
+                <w:rFonts w:ascii="Times New Roman" w:cs="Times New Roman" w:eastAsia="Times New Roman" w:hAnsi="Times New Roman"/>
+                <w:b w:val="false"/>
+                <w:bCs w:val="false"/>
+                <w:sz w:val="20"/>
+                <w:szCs w:val="20"/>
+              </w:rPr>
+              <w:t xml:space="preserve">2.57 (Agree)</w:t>
+            </w:r>
+          </w:p>
+        </w:tc>
+        <w:tc>
+          <w:tcPr>
+            <w:tcW w:type="dxa" w:w="1620"/>
+            <w:tcBorders>
+              <w:top w:val="single" w:color="000000" w:sz="4"/>
+              <w:left w:val="single" w:color="000000" w:sz="4"/>
+              <w:bottom w:val="single" w:color="000000" w:sz="4"/>
+              <w:right w:val="single" w:color="000000" w:sz="4"/>
+            </w:tcBorders>
+            <w:shd w:fill="FFFFFF" w:val="clear"/>
+            <w:tcMar>
+              <w:top w:type="dxa" w:w="60"/>
+              <w:left w:type="dxa" w:w="100"/>
+              <w:bottom w:type="dxa" w:w="60"/>
+              <w:right w:type="dxa" w:w="100"/>
+            </w:tcMar>
+            <w:vAlign w:val="center"/>
+          </w:tcPr>
+          <w:p>
+            <w:pPr>
+              <w:spacing w:after="0" w:before="0" w:line="240" w:lineRule="auto"/>
+              <w:jc w:val="center"/>
+            </w:pPr>
+            <w:r>
+              <w:rPr>
+                <w:rFonts w:ascii="Times New Roman" w:cs="Times New Roman" w:eastAsia="Times New Roman" w:hAnsi="Times New Roman"/>
+                <w:b w:val="false"/>
+                <w:bCs w:val="false"/>
+                <w:sz w:val="20"/>
+                <w:szCs w:val="20"/>
+              </w:rPr>
+              <w:t xml:space="preserve">2.71 (Neutral)</w:t>
+            </w:r>
+          </w:p>
+        </w:tc>
+        <w:tc>
+          <w:tcPr>
+            <w:tcW w:type="dxa" w:w="1620"/>
+            <w:tcBorders>
+              <w:top w:val="single" w:color="000000" w:sz="4"/>
+              <w:left w:val="single" w:color="000000" w:sz="4"/>
+              <w:bottom w:val="single" w:color="000000" w:sz="4"/>
+              <w:right w:val="single" w:color="000000" w:sz="4"/>
+            </w:tcBorders>
+            <w:shd w:fill="FFFFFF" w:val="clear"/>
+            <w:tcMar>
+              <w:top w:type="dxa" w:w="60"/>
+              <w:left w:type="dxa" w:w="100"/>
+              <w:bottom w:type="dxa" w:w="60"/>
+              <w:right w:type="dxa" w:w="100"/>
+            </w:tcMar>
+            <w:vAlign w:val="center"/>
+          </w:tcPr>
+          <w:p>
+            <w:pPr>
+              <w:spacing w:after="0" w:before="0" w:line="240" w:lineRule="auto"/>
+              <w:jc w:val="center"/>
+            </w:pPr>
+            <w:r>
+              <w:rPr>
+                <w:rFonts w:ascii="Times New Roman" w:cs="Times New Roman" w:eastAsia="Times New Roman" w:hAnsi="Times New Roman"/>
+                <w:b w:val="false"/>
+                <w:bCs w:val="false"/>
+                <w:sz w:val="20"/>
+                <w:szCs w:val="20"/>
+              </w:rPr>
+              <w:t xml:space="preserve">2.14 (Agree)</w:t>
+            </w:r>
+          </w:p>
+        </w:tc>
+        <w:tc>
+          <w:tcPr>
+            <w:tcW w:type="dxa" w:w="2160"/>
+            <w:tcBorders>
+              <w:top w:val="single" w:color="000000" w:sz="4"/>
+              <w:left w:val="single" w:color="000000" w:sz="4"/>
+              <w:bottom w:val="single" w:color="000000" w:sz="4"/>
+              <w:right w:val="single" w:color="000000" w:sz="4"/>
+            </w:tcBorders>
+            <w:shd w:fill="FFFFFF" w:val="clear"/>
+            <w:tcMar>
+              <w:top w:type="dxa" w:w="60"/>
+              <w:left w:type="dxa" w:w="100"/>
+              <w:bottom w:type="dxa" w:w="60"/>
+              <w:right w:type="dxa" w:w="100"/>
+            </w:tcMar>
+            <w:vAlign w:val="center"/>
+          </w:tcPr>
+          <w:p>
+            <w:pPr>
+              <w:spacing w:after="0" w:before="0" w:line="240" w:lineRule="auto"/>
+              <w:jc w:val="center"/>
+            </w:pPr>
+            <w:r>
+              <w:rPr>
+                <w:rFonts w:ascii="Times New Roman" w:cs="Times New Roman" w:eastAsia="Times New Roman" w:hAnsi="Times New Roman"/>
+                <w:b w:val="false"/>
+                <w:bCs w:val="false"/>
+                <w:sz w:val="20"/>
+                <w:szCs w:val="20"/>
+              </w:rPr>
+              <w:t xml:space="preserve">2.47 (Agree)</w:t>
+            </w:r>
+          </w:p>
+        </w:tc>
+      </w:tr>
+      <w:tr>
+        <w:tc>
+          <w:tcPr>
+            <w:tcW w:type="dxa" w:w="2160"/>
+            <w:tcBorders>
+              <w:top w:val="single" w:color="000000" w:sz="4"/>
+              <w:left w:val="single" w:color="000000" w:sz="4"/>
+              <w:bottom w:val="single" w:color="000000" w:sz="4"/>
+              <w:right w:val="single" w:color="000000" w:sz="4"/>
+            </w:tcBorders>
+            <w:shd w:fill="FFFFFF" w:val="clear"/>
+            <w:tcMar>
+              <w:top w:type="dxa" w:w="60"/>
+              <w:left w:type="dxa" w:w="100"/>
+              <w:bottom w:type="dxa" w:w="60"/>
+              <w:right w:type="dxa" w:w="100"/>
+            </w:tcMar>
+            <w:vAlign w:val="center"/>
+          </w:tcPr>
+          <w:p>
+            <w:pPr>
+              <w:spacing w:after="0" w:before="0" w:line="240" w:lineRule="auto"/>
+              <w:jc w:val="left"/>
+            </w:pPr>
+            <w:r>
+              <w:rPr>
+                <w:rFonts w:ascii="Times New Roman" w:cs="Times New Roman" w:eastAsia="Times New Roman" w:hAnsi="Times New Roman"/>
+                <w:b w:val="false"/>
+                <w:bCs w:val="false"/>
+                <w:sz w:val="20"/>
+                <w:szCs w:val="20"/>
+              </w:rPr>
+              <w:t xml:space="preserve">Minimized Leaf Damage</w:t>
+            </w:r>
+          </w:p>
+        </w:tc>
+        <w:tc>
+          <w:tcPr>
+            <w:tcW w:type="dxa" w:w="1620"/>
+            <w:tcBorders>
+              <w:top w:val="single" w:color="000000" w:sz="4"/>
+              <w:left w:val="single" w:color="000000" w:sz="4"/>
+              <w:bottom w:val="single" w:color="000000" w:sz="4"/>
+              <w:right w:val="single" w:color="000000" w:sz="4"/>
+            </w:tcBorders>
+            <w:shd w:fill="FFFFFF" w:val="clear"/>
+            <w:tcMar>
+              <w:top w:type="dxa" w:w="60"/>
+              <w:left w:type="dxa" w:w="100"/>
+              <w:bottom w:type="dxa" w:w="60"/>
+              <w:right w:type="dxa" w:w="100"/>
+            </w:tcMar>
+            <w:vAlign w:val="center"/>
+          </w:tcPr>
+          <w:p>
+            <w:pPr>
+              <w:spacing w:after="0" w:before="0" w:line="240" w:lineRule="auto"/>
+              <w:jc w:val="center"/>
+            </w:pPr>
+            <w:r>
+              <w:rPr>
+                <w:rFonts w:ascii="Times New Roman" w:cs="Times New Roman" w:eastAsia="Times New Roman" w:hAnsi="Times New Roman"/>
+                <w:b w:val="false"/>
+                <w:bCs w:val="false"/>
+                <w:sz w:val="20"/>
+                <w:szCs w:val="20"/>
+              </w:rPr>
+              <w:t xml:space="preserve">2.55 (Agree)</w:t>
+            </w:r>
+          </w:p>
+        </w:tc>
+        <w:tc>
+          <w:tcPr>
+            <w:tcW w:type="dxa" w:w="1620"/>
+            <w:tcBorders>
+              <w:top w:val="single" w:color="000000" w:sz="4"/>
+              <w:left w:val="single" w:color="000000" w:sz="4"/>
+              <w:bottom w:val="single" w:color="000000" w:sz="4"/>
+              <w:right w:val="single" w:color="000000" w:sz="4"/>
+            </w:tcBorders>
+            <w:shd w:fill="FFFFFF" w:val="clear"/>
+            <w:tcMar>
+              <w:top w:type="dxa" w:w="60"/>
+              <w:left w:type="dxa" w:w="100"/>
+              <w:bottom w:type="dxa" w:w="60"/>
+              <w:right w:type="dxa" w:w="100"/>
+            </w:tcMar>
+            <w:vAlign w:val="center"/>
+          </w:tcPr>
+          <w:p>
+            <w:pPr>
+              <w:spacing w:after="0" w:before="0" w:line="240" w:lineRule="auto"/>
+              <w:jc w:val="center"/>
+            </w:pPr>
+            <w:r>
+              <w:rPr>
+                <w:rFonts w:ascii="Times New Roman" w:cs="Times New Roman" w:eastAsia="Times New Roman" w:hAnsi="Times New Roman"/>
+                <w:b w:val="false"/>
+                <w:bCs w:val="false"/>
+                <w:sz w:val="20"/>
+                <w:szCs w:val="20"/>
+              </w:rPr>
+              <w:t xml:space="preserve">2.62 (Agree)</w:t>
+            </w:r>
+          </w:p>
+        </w:tc>
+        <w:tc>
+          <w:tcPr>
+            <w:tcW w:type="dxa" w:w="1620"/>
+            <w:tcBorders>
+              <w:top w:val="single" w:color="000000" w:sz="4"/>
+              <w:left w:val="single" w:color="000000" w:sz="4"/>
+              <w:bottom w:val="single" w:color="000000" w:sz="4"/>
+              <w:right w:val="single" w:color="000000" w:sz="4"/>
+            </w:tcBorders>
+            <w:shd w:fill="FFFFFF" w:val="clear"/>
+            <w:tcMar>
+              <w:top w:type="dxa" w:w="60"/>
+              <w:left w:type="dxa" w:w="100"/>
+              <w:bottom w:type="dxa" w:w="60"/>
+              <w:right w:type="dxa" w:w="100"/>
+            </w:tcMar>
+            <w:vAlign w:val="center"/>
+          </w:tcPr>
+          <w:p>
+            <w:pPr>
+              <w:spacing w:after="0" w:before="0" w:line="240" w:lineRule="auto"/>
+              <w:jc w:val="center"/>
+            </w:pPr>
+            <w:r>
+              <w:rPr>
+                <w:rFonts w:ascii="Times New Roman" w:cs="Times New Roman" w:eastAsia="Times New Roman" w:hAnsi="Times New Roman"/>
+                <w:b w:val="false"/>
+                <w:bCs w:val="false"/>
+                <w:sz w:val="20"/>
+                <w:szCs w:val="20"/>
+              </w:rPr>
+              <w:t xml:space="preserve">2.10 (Agree)</w:t>
+            </w:r>
+          </w:p>
+        </w:tc>
+        <w:tc>
+          <w:tcPr>
+            <w:tcW w:type="dxa" w:w="2160"/>
+            <w:tcBorders>
+              <w:top w:val="single" w:color="000000" w:sz="4"/>
+              <w:left w:val="single" w:color="000000" w:sz="4"/>
+              <w:bottom w:val="single" w:color="000000" w:sz="4"/>
+              <w:right w:val="single" w:color="000000" w:sz="4"/>
+            </w:tcBorders>
+            <w:shd w:fill="FFFFFF" w:val="clear"/>
+            <w:tcMar>
+              <w:top w:type="dxa" w:w="60"/>
+              <w:left w:type="dxa" w:w="100"/>
+              <w:bottom w:type="dxa" w:w="60"/>
+              <w:right w:type="dxa" w:w="100"/>
+            </w:tcMar>
+            <w:vAlign w:val="center"/>
+          </w:tcPr>
+          <w:p>
+            <w:pPr>
+              <w:spacing w:after="0" w:before="0" w:line="240" w:lineRule="auto"/>
+              <w:jc w:val="center"/>
+            </w:pPr>
+            <w:r>
+              <w:rPr>
+                <w:rFonts w:ascii="Times New Roman" w:cs="Times New Roman" w:eastAsia="Times New Roman" w:hAnsi="Times New Roman"/>
+                <w:b w:val="false"/>
+                <w:bCs w:val="false"/>
+                <w:sz w:val="20"/>
+                <w:szCs w:val="20"/>
+              </w:rPr>
+              <w:t xml:space="preserve">2.42 (Agree)</w:t>
+            </w:r>
+          </w:p>
+        </w:tc>
+      </w:tr>
+      <w:tr>
+        <w:tc>
+          <w:tcPr>
+            <w:tcW w:type="dxa" w:w="2160"/>
+            <w:tcBorders>
+              <w:top w:val="single" w:color="000000" w:sz="4"/>
+              <w:left w:val="single" w:color="000000" w:sz="4"/>
+              <w:bottom w:val="single" w:color="000000" w:sz="4"/>
+              <w:right w:val="single" w:color="000000" w:sz="4"/>
+            </w:tcBorders>
+            <w:shd w:fill="FFFFFF" w:val="clear"/>
+            <w:tcMar>
+              <w:top w:type="dxa" w:w="60"/>
+              <w:left w:type="dxa" w:w="100"/>
+              <w:bottom w:type="dxa" w:w="60"/>
+              <w:right w:type="dxa" w:w="100"/>
+            </w:tcMar>
+            <w:vAlign w:val="center"/>
+          </w:tcPr>
+          <w:p>
+            <w:pPr>
+              <w:spacing w:after="0" w:before="0" w:line="240" w:lineRule="auto"/>
+              <w:jc w:val="left"/>
+            </w:pPr>
+            <w:r>
+              <w:rPr>
+                <w:rFonts w:ascii="Times New Roman" w:cs="Times New Roman" w:eastAsia="Times New Roman" w:hAnsi="Times New Roman"/>
+                <w:b/>
+                <w:bCs/>
+                <w:sz w:val="20"/>
+                <w:szCs w:val="20"/>
+              </w:rPr>
+              <w:t xml:space="preserve">Overall Weighted Mean</w:t>
+            </w:r>
+          </w:p>
+        </w:tc>
+        <w:tc>
+          <w:tcPr>
+            <w:tcW w:type="dxa" w:w="1620"/>
+            <w:tcBorders>
+              <w:top w:val="single" w:color="000000" w:sz="4"/>
+              <w:left w:val="single" w:color="000000" w:sz="4"/>
+              <w:bottom w:val="single" w:color="000000" w:sz="4"/>
+              <w:right w:val="single" w:color="000000" w:sz="4"/>
+            </w:tcBorders>
+            <w:shd w:fill="FFFFFF" w:val="clear"/>
+            <w:tcMar>
+              <w:top w:type="dxa" w:w="60"/>
+              <w:left w:type="dxa" w:w="100"/>
+              <w:bottom w:type="dxa" w:w="60"/>
+              <w:right w:type="dxa" w:w="100"/>
+            </w:tcMar>
+            <w:vAlign w:val="center"/>
+          </w:tcPr>
+          <w:p>
+            <w:pPr>
+              <w:spacing w:after="0" w:before="0" w:line="240" w:lineRule="auto"/>
+              <w:jc w:val="center"/>
+            </w:pPr>
+            <w:r>
+              <w:rPr>
+                <w:rFonts w:ascii="Times New Roman" w:cs="Times New Roman" w:eastAsia="Times New Roman" w:hAnsi="Times New Roman"/>
+                <w:b/>
+                <w:bCs/>
+                <w:sz w:val="20"/>
+                <w:szCs w:val="20"/>
+              </w:rPr>
+              <w:t xml:space="preserve">2.67 (Neutral)</w:t>
+            </w:r>
+          </w:p>
+        </w:tc>
+        <w:tc>
+          <w:tcPr>
+            <w:tcW w:type="dxa" w:w="1620"/>
+            <w:tcBorders>
+              <w:top w:val="single" w:color="000000" w:sz="4"/>
+              <w:left w:val="single" w:color="000000" w:sz="4"/>
+              <w:bottom w:val="single" w:color="000000" w:sz="4"/>
+              <w:right w:val="single" w:color="000000" w:sz="4"/>
+            </w:tcBorders>
+            <w:shd w:fill="FFFFFF" w:val="clear"/>
+            <w:tcMar>
+              <w:top w:type="dxa" w:w="60"/>
+              <w:left w:type="dxa" w:w="100"/>
+              <w:bottom w:type="dxa" w:w="60"/>
+              <w:right w:type="dxa" w:w="100"/>
+            </w:tcMar>
+            <w:vAlign w:val="center"/>
+          </w:tcPr>
+          <w:p>
+            <w:pPr>
+              <w:spacing w:after="0" w:before="0" w:line="240" w:lineRule="auto"/>
+              <w:jc w:val="center"/>
+            </w:pPr>
+            <w:r>
+              <w:rPr>
+                <w:rFonts w:ascii="Times New Roman" w:cs="Times New Roman" w:eastAsia="Times New Roman" w:hAnsi="Times New Roman"/>
+                <w:b/>
+                <w:bCs/>
+                <w:sz w:val="20"/>
+                <w:szCs w:val="20"/>
+              </w:rPr>
+              <w:t xml:space="preserve">2.66 (Neutral)</w:t>
+            </w:r>
+          </w:p>
+        </w:tc>
+        <w:tc>
+          <w:tcPr>
+            <w:tcW w:type="dxa" w:w="1620"/>
+            <w:tcBorders>
+              <w:top w:val="single" w:color="000000" w:sz="4"/>
+              <w:left w:val="single" w:color="000000" w:sz="4"/>
+              <w:bottom w:val="single" w:color="000000" w:sz="4"/>
+              <w:right w:val="single" w:color="000000" w:sz="4"/>
+            </w:tcBorders>
+            <w:shd w:fill="FFFFFF" w:val="clear"/>
+            <w:tcMar>
+              <w:top w:type="dxa" w:w="60"/>
+              <w:left w:type="dxa" w:w="100"/>
+              <w:bottom w:type="dxa" w:w="60"/>
+              <w:right w:type="dxa" w:w="100"/>
+            </w:tcMar>
+            <w:vAlign w:val="center"/>
+          </w:tcPr>
+          <w:p>
+            <w:pPr>
+              <w:spacing w:after="0" w:before="0" w:line="240" w:lineRule="auto"/>
+              <w:jc w:val="center"/>
+            </w:pPr>
+            <w:r>
+              <w:rPr>
+                <w:rFonts w:ascii="Times New Roman" w:cs="Times New Roman" w:eastAsia="Times New Roman" w:hAnsi="Times New Roman"/>
+                <w:b/>
+                <w:bCs/>
+                <w:sz w:val="20"/>
+                <w:szCs w:val="20"/>
+              </w:rPr>
+              <w:t xml:space="preserve">2.11 (Agree)</w:t>
+            </w:r>
+          </w:p>
+        </w:tc>
+        <w:tc>
+          <w:tcPr>
+            <w:tcW w:type="dxa" w:w="2160"/>
+            <w:tcBorders>
+              <w:top w:val="single" w:color="000000" w:sz="4"/>
+              <w:left w:val="single" w:color="000000" w:sz="4"/>
+              <w:bottom w:val="single" w:color="000000" w:sz="4"/>
+              <w:right w:val="single" w:color="000000" w:sz="4"/>
+            </w:tcBorders>
+            <w:shd w:fill="FFFFFF" w:val="clear"/>
+            <w:tcMar>
+              <w:top w:type="dxa" w:w="60"/>
+              <w:left w:type="dxa" w:w="100"/>
+              <w:bottom w:type="dxa" w:w="60"/>
+              <w:right w:type="dxa" w:w="100"/>
+            </w:tcMar>
+            <w:vAlign w:val="center"/>
+          </w:tcPr>
+          <w:p>
+            <w:pPr>
+              <w:spacing w:after="0" w:before="0" w:line="240" w:lineRule="auto"/>
+              <w:jc w:val="center"/>
+            </w:pPr>
+            <w:r>
+              <w:rPr>
+                <w:rFonts w:ascii="Times New Roman" w:cs="Times New Roman" w:eastAsia="Times New Roman" w:hAnsi="Times New Roman"/>
+                <w:b/>
+                <w:bCs/>
+                <w:sz w:val="20"/>
+                <w:szCs w:val="20"/>
+              </w:rPr>
+              <w:t xml:space="preserve">2.48 (Agree)</w:t>
+            </w:r>
+          </w:p>
+        </w:tc>
+      </w:tr>
+    </w:tbl>
+    <w:p>
+      <w:pPr>
+        <w:spacing w:after="0" w:before="0" w:line="480" w:lineRule="auto"/>
+      </w:pPr>
+    </w:p>
+    <w:p>
+      <w:pPr>
+        <w:spacing w:after="0" w:before="0" w:line="480" w:lineRule="auto"/>
+      </w:pPr>
+    </w:p>
+    <w:p>
+      <w:pPr>
+        <w:spacing w:after="0" w:before="0" w:line="480" w:lineRule="auto"/>
+        <w:ind w:firstLine="720"/>
+        <w:jc w:val="both"/>
+      </w:pPr>
+      <w:r>
+        <w:rPr>
+          <w:rFonts w:ascii="Times New Roman" w:cs="Times New Roman" w:eastAsia="Times New Roman" w:hAnsi="Times New Roman"/>
+          <w:b w:val="false"/>
+          <w:bCs w:val="false"/>
+          <w:sz w:val="24"/>
+          <w:szCs w:val="24"/>
+        </w:rPr>
+        <w:t xml:space="preserve">With respect to qualitative integrity, the traditional method was reported by interviewed farmers to consistently produce skewered tobacco leaves of near-perfect quality. Farmers noted that visible damage, leaf misalignment, and post-skewering detachment are extremely rare in manual skewering, as the process affords the worker continuous tactile control and the ability to make real-time adjustments throughout each operation. As shown in Table 3.11, the qualitative performance of the semi-automated machine is presented per batch to reflect its progressive improvement across the evaluation period.</w:t>
+      </w:r>
+    </w:p>
+    <w:p>
+      <w:pPr>
+        <w:spacing w:after="0" w:before="0" w:line="480" w:lineRule="auto"/>
+      </w:pPr>
+    </w:p>
+    <w:p>
+      <w:pPr>
+        <w:spacing w:after="0" w:before="0" w:line="480" w:lineRule="auto"/>
+        <w:ind w:firstLine="720"/>
+        <w:jc w:val="both"/>
+      </w:pPr>
+      <w:r>
+        <w:rPr>
+          <w:rFonts w:ascii="Times New Roman" w:cs="Times New Roman" w:eastAsia="Times New Roman" w:hAnsi="Times New Roman"/>
+          <w:b w:val="false"/>
+          <w:bCs w:val="false"/>
+          <w:sz w:val="24"/>
+          <w:szCs w:val="24"/>
+        </w:rPr>
+        <w:t xml:space="preserve">In Batch 1, the overall weighted qualitative mean across Trials 1 through 3 averaged 2.67, corresponding to a Neutral interpretation. Respondents expressed moderate satisfaction with alignment and attachment security, reflecting the initial calibration variance of the machine under the lower 10-leaf load. When compared to the near-perfect qualitative output of both veteran and beginner skewers, Batch 1 results indicate that the machine’s qualitative performance requires improvement, particularly in leaf alignment consistency.</w:t>
+      </w:r>
+    </w:p>
+    <w:p>
+      <w:pPr>
+        <w:spacing w:after="0" w:before="0" w:line="480" w:lineRule="auto"/>
+      </w:pPr>
+    </w:p>
+    <w:p>
+      <w:pPr>
+        <w:spacing w:after="0" w:before="0" w:line="480" w:lineRule="auto"/>
+        <w:ind w:firstLine="720"/>
+        <w:jc w:val="both"/>
+      </w:pPr>
+      <w:r>
+        <w:rPr>
+          <w:rFonts w:ascii="Times New Roman" w:cs="Times New Roman" w:eastAsia="Times New Roman" w:hAnsi="Times New Roman"/>
+          <w:b w:val="false"/>
+          <w:bCs w:val="false"/>
+          <w:sz w:val="24"/>
+          <w:szCs w:val="24"/>
+        </w:rPr>
+        <w:t xml:space="preserve">In Batch 2, the overall weighted means for Trials 4 and 5 were 2.47 and 2.43, respectively, both corresponding to Agree — indicating acceptable qualitative performance under the increased 15-leaf load. Trial 6 recorded the highest weighted mean of the entire study at 3.07 (Neutral), consistent with the conditional operational difficulties identified in that trial. The degraded tray clamping surface in Trial 6 affected not only the success rate but also the alignment and attachment quality of the leaves that were processed. The Batch 2 overall weighted mean of 2.66 (Neutral) reflects the influence of Trial 6 on the batch average, while Trials 4 and 5 independently demonstrated Agree-level qualitative performance comparable to the expected output standard.</w:t>
+      </w:r>
+    </w:p>
+    <w:p>
+      <w:pPr>
+        <w:spacing w:after="0" w:before="0" w:line="480" w:lineRule="auto"/>
+      </w:pPr>
+    </w:p>
+    <w:p>
+      <w:pPr>
+        <w:spacing w:after="0" w:before="0" w:line="480" w:lineRule="auto"/>
+        <w:ind w:firstLine="720"/>
+        <w:jc w:val="both"/>
+      </w:pPr>
+      <w:r>
+        <w:rPr>
+          <w:rFonts w:ascii="Times New Roman" w:cs="Times New Roman" w:eastAsia="Times New Roman" w:hAnsi="Times New Roman"/>
+          <w:b w:val="false"/>
+          <w:bCs w:val="false"/>
+          <w:sz w:val="24"/>
+          <w:szCs w:val="24"/>
+        </w:rPr>
+        <w:t xml:space="preserve">In Batch 3, following the rubber lining corrective action, qualitative performance improved markedly. Trials 7, 8, and 9 recorded overall weighted means of 2.00, 2.06, and 2.28, respectively — all corresponding to Agree and representing the most favorable qualitative ratings across the entire study. Trial 7 achieved the lowest overall weighted mean of 2.00, the best qualitative performance observed. The Batch 3 overall weighted mean of 2.11 (Agree) represents the closest approach to the near-perfect standard of the traditional method, demonstrating that equipment maintenance and tray standardization are key factors in achieving consistent qualitative output.</w:t>
+      </w:r>
+    </w:p>
+    <w:p>
+      <w:pPr>
+        <w:spacing w:after="0" w:before="0" w:line="480" w:lineRule="auto"/>
+      </w:pPr>
+    </w:p>
+    <w:p>
+      <w:pPr>
+        <w:spacing w:after="0" w:before="0" w:line="480" w:lineRule="auto"/>
+        <w:ind w:firstLine="720"/>
+        <w:jc w:val="both"/>
+      </w:pPr>
+      <w:r>
+        <w:rPr>
+          <w:rFonts w:ascii="Times New Roman" w:cs="Times New Roman" w:eastAsia="Times New Roman" w:hAnsi="Times New Roman"/>
+          <w:b w:val="false"/>
+          <w:bCs w:val="false"/>
+          <w:sz w:val="24"/>
+          <w:szCs w:val="24"/>
+        </w:rPr>
+        <w:t xml:space="preserve">The grand overall weighted mean of 2.48 (Agree) across all nine trials indicates that farmer-respondents generally found the machine’s output to be qualitatively acceptable throughout the evaluation period. While the semi-automated machine has not yet reached the near-perfect qualitative standard of the traditional method, the progressive improvement from Batch 1 (2.67, Neutral) to Batch 3 (2.11, Agree) demonstrates a meaningful upward trajectory that supports the machine’s continued development and refinement.</w:t>
+      </w:r>
+    </w:p>
+    <w:p>
+      <w:pPr>
+        <w:spacing w:after="0" w:before="0" w:line="480" w:lineRule="auto"/>
+      </w:pPr>
     </w:p>
     <w:p>
       <w:pPr>

</xml_diff>